<commit_message>
feat(seguridad-social): agrega la actividad 5 y refina las actividades 1 y 4
Nueva entrega de Derecho a la Seguridad Social con su planeacion oficial de la
semana 5 y las fichas del extractor para las actividades 1 y 5.

Las actividades 1 y 4 pasan por el optimizador: se ajustan los TEX, se
recompilan los PDF y se actualizan bibliografia, foro de participacion y
estructura de la materia.
</commit_message>
<xml_diff>
--- a/UnADM/licenciatura-en-derecho-unadm/derecho-a-la-seguridad-social-lde/extractor-aulatex/conceptos-derecho-a-la-seguridad-social-actividad-4/fichas_conceptos.docx
+++ b/UnADM/licenciatura-en-derecho-unadm/derecho-a-la-seguridad-social-lde/extractor-aulatex/conceptos-derecho-a-la-seguridad-social-actividad-4/fichas_conceptos.docx
@@ -20,7 +20,7 @@
         <w:pStyle w:val="Heading2"/>
       </w:pPr>
       <w:r>
-        <w:t>Ficha 01. Concepto y clasificación del seguro</w:t>
+        <w:t>Ficha 01. características del seguro social</w:t>
       </w:r>
     </w:p>
     <w:p>
@@ -31,7 +31,7 @@
         <w:t xml:space="preserve">Fuentes: </w:t>
       </w:r>
       <w:r>
-        <w:t>Como se hicieron los Derechos H - Ricardo Rabinovich Berkman.pdf; Derechos humanos, teorias y doc - Luis Manuel Marcano Salazar.pdf; Los derechos humanos en Mexico - Emilio Alvarez Icaza Longoria.pdf</w:t>
+        <w:t>Curso de derechos humanos - Ana Maria Ibarra Olguin.pdf; Derecho de la seguridad social - Alberto Briceno Ruiz.pdf; Derecho humano a la seguridad s - Jose Luis Belmont Lugo.pdf; El derecho a la seguridad socia - Diana Beatriz Gonzalez Carvallo.pdf; Ley del Seguro Social - Camara de Diputados del H. Cong.pdf</w:t>
       </w:r>
     </w:p>
     <w:p>
@@ -42,7 +42,7 @@
         <w:t xml:space="preserve">Ubicaciones: </w:t>
       </w:r>
       <w:r>
-        <w:t>Como se hicieron los Derechos H - Ricardo Rabinovich Berkman.pdf, p. 121; Como se hicieron los Derechos H - Ricardo Rabinovich Berkman.pdf, p. 122; Como se hicieron los Derechos H - Ricardo Rabinovich Berkman.pdf, p. 130; Como se hicieron los Derechos H - Ricardo Rabinovich Berkman.pdf, p. 142; Como se hicieron los Derechos H - Ricardo Rabinovich Berkman.pdf, p. 198; Como se hicieron los Derechos H - Ricardo Rabinovich Berkman.pdf, p. 211; Como se hicieron los Derechos H - Ricardo Rabinovich Berkman.pdf, p. 260; Como se hicieron los Derechos H - Ricardo Rabinovich Berkman.pdf, p. 261; Como se hicieron los Derechos H - Ricardo Rabinovich Berkman.pdf, p. 282; Derechos humanos, teorias y doc - Luis Manuel Marcano Salazar.pdf, p. 16; Derechos humanos, teorias y doc - Luis Manuel Marcano Salazar.pdf, p. 20; Derechos humanos, teorias y doc - Luis Manuel Marcano Salazar.pdf, p. 23; Derechos humanos, teorias y doc - Luis Manuel Marcano Salazar.pdf, p. 29; Derechos humanos, teorias y doc - Luis Manuel Marcano Salazar.pdf, p. 53; Derechos humanos, teorias y doc - Luis Manuel Marcano Salazar.pdf, p. 54; Derechos humanos, teorias y doc - Luis Manuel Marcano Salazar.pdf, p. 56; Derechos humanos, teorias y doc - Luis Manuel Marcano Salazar.pdf, p. 65; Derechos humanos, teorias y doc - Luis Manuel Marcano Salazar.pdf, p. 66; Derechos humanos, teorias y doc - Luis Manuel Marcano Salazar.pdf, p. 70; Los derechos humanos en Mexico - Emilio Alvarez Icaza Longoria.pdf, p. 23; Los derechos humanos en Mexico - Emilio Alvarez Icaza Longoria.pdf, p. 61</w:t>
+        <w:t>Curso de derechos humanos - Ana Maria Ibarra Olguin.pdf, p. 901; Curso de derechos humanos - Ana Maria Ibarra Olguin.pdf, p. 906; Curso de derechos humanos - Ana Maria Ibarra Olguin.pdf, p. 913; Derecho de la seguridad social - Alberto Briceno Ruiz.pdf, p. 108; Derecho de la seguridad social - Alberto Briceno Ruiz.pdf, p. 13; Derecho de la seguridad social - Alberto Briceno Ruiz.pdf, p. 23; Derecho de la seguridad social - Alberto Briceno Ruiz.pdf, p. 26; Derecho de la seguridad social - Alberto Briceno Ruiz.pdf, p. 27; Derecho de la seguridad social - Alberto Briceno Ruiz.pdf, p. 28; Derecho de la seguridad social - Alberto Briceno Ruiz.pdf, p. 30; Derecho de la seguridad social - Alberto Briceno Ruiz.pdf, p. 33; Derecho de la seguridad social - Alberto Briceno Ruiz.pdf, p. 4; Derecho de la seguridad social - Alberto Briceno Ruiz.pdf, p. 66; Derecho de la seguridad social - Alberto Briceno Ruiz.pdf, p. 67; Derecho humano a la seguridad s - Jose Luis Belmont Lugo.pdf, p. 12; Derecho humano a la seguridad s - Jose Luis Belmont Lugo.pdf, p. 3; El derecho a la seguridad socia - Diana Beatriz Gonzalez Carvallo.pdf, p. 260; Ley del Seguro Social - Camara de Diputados del H. Cong.pdf, p. 109; Ley del Seguro Social - Camara de Diputados del H. Cong.pdf, p. 110; Ley del Seguro Social - Camara de Diputados del H. Cong.pdf, p. 119; Ley del Seguro Social - Camara de Diputados del H. Cong.pdf, p. 132; Ley del Seguro Social - Camara de Diputados del H. Cong.pdf, p. 149; Ley del Seguro Social - Camara de Diputados del H. Cong.pdf, p. 158; Ley del Seguro Social - Camara de Diputados del H. Cong.pdf, p. 65; Ley del Seguro Social - Camara de Diputados del H. Cong.pdf, p. 74</w:t>
       </w:r>
     </w:p>
     <w:p>
@@ -50,7 +50,7 @@
         <w:pStyle w:val="Heading3"/>
       </w:pPr>
       <w:r>
-        <w:t>Como se hicieron los Derechos H - Ricardo Rabinovich Berkman.pdf — p. 198 — similitud 0.0803</w:t>
+        <w:t>Ley del Seguro Social - Camara de Diputados del H. Cong.pdf — p. 149 — similitud 0.2037</w:t>
       </w:r>
     </w:p>
     <w:p>
@@ -58,7 +58,7 @@
         <w:ind w:left="360"/>
       </w:pPr>
       <w:r>
-        <w:t>“Como ésta, también del Éxodo, que se relaciona con disposiciones de la piedra de Ha- mmurabi: "El que hiera a un hombre de modo que en efecto muera, ha de ser muerto sin falta" (21.12). Otras, buscan resguardar elementos esenciales del ser humano en forma bastante minuciosa: "Y en caso de que unos hombres se pongan a reñir y uno efectivamente hiera a su prójimo con una piedra o un azadón y este no mue- ra, pero tenga que quedarse en cama; sí se levanta y va andando fuera sobre algún sostén suyo, entonces el que lo haya herido tiene que estar libre de cas- tigo; dará compensación solo por el tiempo que se haya perdido del trabajo de aquel hasta que lo tenga completamente sanado" (21,18-19).”</w:t>
+        <w:t>“CONGRESO DE LA UNIÓN Secretaría General Secretaría de Servicios Parlamentarios Última Reforma DOF 15-01-2026 DECRETO por el que se adicionan diversas disposiciones de la Ley del Seguro Social, de la Ley del Instituto de Seguridad y Servicios Sociales de los Trabajadores del Estado y de la Ley Federal del Trabajo. Publicado en el Diario Oficial de la Federación el 4 de junio de 2019 Artículo Primero.- Se adiciona un artículo 140 Bis a la Ley del Seguro Social, para quedar como sigue: ……… Transitorios Primero.- El presente Decreto entrará en vigor el día siguiente al de su publicación en el Diario Oficial de la Federación.”</w:t>
       </w:r>
     </w:p>
     <w:p>
@@ -66,7 +66,7 @@
         <w:pStyle w:val="Heading3"/>
       </w:pPr>
       <w:r>
-        <w:t>Derechos humanos, teorias y doc - Luis Manuel Marcano Salazar.pdf — p. 65 — similitud 0.0786</w:t>
+        <w:t>Ley del Seguro Social - Camara de Diputados del H. Cong.pdf — p. 119 — similitud 0.1977</w:t>
       </w:r>
     </w:p>
     <w:p>
@@ -74,7 +74,7 @@
         <w:ind w:left="360"/>
       </w:pPr>
       <w:r>
-        <w:t>“En la evolución de los derechos humanos su reconocimiento y protección ha ido «in crescendo»; formulándose para su clasificación diversos criterios, sin embargo a los fines de la investigación se estima apropiado aquella que los clasifica o cataloga por generaciones atendiendo al contexto histórico y positivista; sin embargo esto no implica que ante la protección de los derechos humanos en el paradigma vigente unos tengan prelación frente a otros; independientemente incluso ante el asentimiento de considerar la existencia del llamado «núcleo duro» de los derechos humanos. 2.3.7.- Clasificación”</w:t>
+        <w:t>“CONGRESO DE LA UNIÓN Secretaría General Secretaría de Servicios Parlamentarios Última Reforma DOF 15-01-2026 DECRETO por el que se reforman diversas disposiciones de la Ley del Seguro Social. Publicado en el Diario Oficial de la Federación el 20 de diciembre de 2001 ARTÍCULO ÚNICO: Se reforman, adicionan y derogan diversas disposiciones de la Ley del Seguro Social, publicada en el Diario Oficial de la Federación del 21 de diciembre de 1995, en los términos siguientes: A.”</w:t>
       </w:r>
     </w:p>
     <w:p>
@@ -82,7 +82,7 @@
         <w:pStyle w:val="Heading3"/>
       </w:pPr>
       <w:r>
-        <w:t>Derechos humanos, teorias y doc - Luis Manuel Marcano Salazar.pdf — p. 56 — similitud 0.0771</w:t>
+        <w:t>Derecho de la seguridad social - Alberto Briceno Ruiz.pdf — p. 4 — similitud 0.1973</w:t>
       </w:r>
     </w:p>
     <w:p>
@@ -90,7 +90,7 @@
         <w:ind w:left="360"/>
       </w:pPr>
       <w:r>
-        <w:t>“Sin embargo, también patrocina la necesidad de un pacto entre las individualidades para formar un gobierno (…) las voluntades individuales siguen siendo el origen y forman los elementos esenciales; pero, consideradas separadamente, su poder sería nulo, puesto que sólo reside en el conjunto44.Tal es el origen de un gobierno, ejercido por procuración; coincide con Locke, en legar una porción de poder «a algunos de ellos» el pueblo es numeroso y es imposible consultarlo en su totalidad por toda la nación; esta delegación no implica un desprendimiento total del poder soberano. Expone su celebre tesis acerca del poder constituyente originario de esta manera:”</w:t>
+        <w:t>“C O L E C C I Ó N T E X T O S J U R Í D I C O S U N I V E R S I T A R I O S Derecho de la seguridad social Alberto Briceño Ruiz U n iv er sid a d N a c io n a l A u t ó n o m a de M éxico O X FO R D l í N I V E R S I T Y PRESS”</w:t>
       </w:r>
     </w:p>
     <w:p>
@@ -98,7 +98,7 @@
         <w:pStyle w:val="Heading3"/>
       </w:pPr>
       <w:r>
-        <w:t>Derechos humanos, teorias y doc - Luis Manuel Marcano Salazar.pdf — p. 54 — similitud 0.0765</w:t>
+        <w:t>Ley del Seguro Social - Camara de Diputados del H. Cong.pdf — p. 65 — similitud 0.1973</w:t>
       </w:r>
     </w:p>
     <w:p>
@@ -106,7 +106,7 @@
         <w:ind w:left="360"/>
       </w:pPr>
       <w:r>
-        <w:t>“• La doctrina de Jellinek, para quien la Declaración francesa emuló las declaraciones norteamericanas que a su vez surgieron ideológicamente de las concepciones puritanas mayormente inspiradas por inmigrantes protestantes. • La doctrina francesa, a partir de las tesis de Boutmy polemizando con Jellinek, que desecha tanto la paternidad americana como germánica, insistiendo en su derivación por el influjo de la literatura europea, y especialmente del pensamiento ilustrado francés del siglo XVIII. • La doctrina ecléctica, consistente en afirmar que son compatibles tanto el criterio de Jellinek como la tesis oposicionista de Boutmy.”</w:t>
+        <w:t>“Ser dado de alta nuevamente en el régimen obligatorio, en los términos del artículo 12 de esta Ley. El asegurado podrá solicitar por escrito su reingreso al régimen obligatorio del seguro social a través de la continuación voluntaria, cuando hubiese causado baja por la falta de pago de las cuotas de dos meses consecutivos. La solicitud deberá formularse dentro de los doce meses siguientes a la fecha de su baja en la continuación voluntaria.”</w:t>
       </w:r>
     </w:p>
     <w:p>
@@ -114,7 +114,7 @@
         <w:pStyle w:val="Heading3"/>
       </w:pPr>
       <w:r>
-        <w:t>Derechos humanos, teorias y doc - Luis Manuel Marcano Salazar.pdf — p. 29 — similitud 0.0736</w:t>
+        <w:t>Ley del Seguro Social - Camara de Diputados del H. Cong.pdf — p. 74 — similitud 0.1958</w:t>
       </w:r>
     </w:p>
     <w:p>
@@ -122,7 +122,7 @@
         <w:ind w:left="360"/>
       </w:pPr>
       <w:r>
-        <w:t>“15). De una vez manifiesta tajantemente su objetivo, no se detendrá a divagar y concibe al derecho libre de elementos metajurídicos; el hombre está escindido entre el mundo del “ser”y del “deber ser”; el hombre sólo es capaz de conocer lo dado, escapándosele toda metafísica; pretende (…)“brindar una definición de la norma jurídica totalmente independiente de la noción de norma moral (…) al afirmar la autonomía del derecho respecto de la moral.”</w:t>
+        <w:t>“CONGRESO DE LA UNIÓN Secretaría General Secretaría de Servicios Parlamentarios Última Reforma DOF 15-01-2026 Artículo 246. El Instituto podrá contratar seguros adicionales para satisfacer las prestaciones económicas pactadas en los contratos Ley o en los contratos colectivos de trabajo que fueran superiores a las de la misma naturaleza que establece el régimen obligatorio del Seguro Social. Artículo 247.”</w:t>
       </w:r>
     </w:p>
     <w:p>
@@ -130,7 +130,7 @@
         <w:pStyle w:val="Heading3"/>
       </w:pPr>
       <w:r>
-        <w:t>Derechos humanos, teorias y doc - Luis Manuel Marcano Salazar.pdf — p. 53 — similitud 0.0729</w:t>
+        <w:t>Derecho humano a la seguridad s - Jose Luis Belmont Lugo.pdf — p. 3 — similitud 0.1757</w:t>
       </w:r>
     </w:p>
     <w:p>
@@ -138,7 +138,7 @@
         <w:ind w:left="360"/>
       </w:pPr>
       <w:r>
-        <w:t>“Luis Manuel Marcano Salazar • La filosofía jurídica de Locke, fundadora de la doctrina liberal fue recogida en los textos de Derecho positivo; la libertad religiosa en un principio fue la bandera a izar, en «búsqueda de la felicidad» el iusnaturalismo fue útil en la mezcla del racionalismo y pragmatismo. • La separación de los poderes públicos en el ejercicio de sus funciones, encuentra en Norteamérica sus más fieros defensores quienes transfieren esta doctrina a la Francia revolucionaria, quedando establecido para la posteridad el lacónico pero contundente artículo 16 de la Declaración Francesa. “Toda sociedad en la que la garantía de los derechos no esté asegurada, ni determinada la...”</w:t>
+        <w:t>“5 1. Los derechos humanos y el derecho humano a la seguridad social . . . . . . . . . . . . . . . . . . . 5 2.”</w:t>
       </w:r>
     </w:p>
     <w:p>
@@ -146,7 +146,7 @@
         <w:pStyle w:val="Heading3"/>
       </w:pPr>
       <w:r>
-        <w:t>Derechos humanos, teorias y doc - Luis Manuel Marcano Salazar.pdf — p. 20 — similitud 0.0689</w:t>
+        <w:t>Derecho de la seguridad social - Alberto Briceno Ruiz.pdf — p. 66 — similitud 0.1726</w:t>
       </w:r>
     </w:p>
     <w:p>
@@ -154,7 +154,7 @@
         <w:ind w:left="360"/>
       </w:pPr>
       <w:r>
-        <w:t>“Derechos humanos. Teorías y doctrinas religión, aparte de su función redentora, pasa a ser considerada ante todo en su función civil. El humanismo vino a sustituir la visión del mundo vista bajo el prisma dogmático religioso; se enfoca una nueva perspectiva donde se refleja la racionalidad, en la que prima la idea del hombre como ser humano, verdadero e integral.”</w:t>
+        <w:t>“La Ley del 5 de julio de 1934 reorganiza la administración de los seguros sociales, autorizando al gobierno para dictar las disposiciones pertinentes. El seguro social en Inglaterra Las causas que originan el establecimiento del seguro social en Inglaterra son diversas: van de la atención a los pobres, a la Revolución Industrial y a los movimientos sociales que no se atrevieron a alterar sus estructuras. Las leyes de pobres, los movimientos cartistas, el aislamiento de la gran isla y el crecimiento de las fábricas, configuran un sistema de indiscutible efectividad, muy distinto del alemán.”</w:t>
       </w:r>
     </w:p>
     <w:p>
@@ -162,7 +162,7 @@
         <w:pStyle w:val="Heading3"/>
       </w:pPr>
       <w:r>
-        <w:t>Como se hicieron los Derechos H - Ricardo Rabinovich Berkman.pdf — p. 211 — similitud 0.0682</w:t>
+        <w:t>El derecho a la seguridad socia - Diana Beatriz Gonzalez Carvallo.pdf — p. 260 — similitud 0.1702</w:t>
       </w:r>
     </w:p>
     <w:p>
@@ -170,7 +170,7 @@
         <w:ind w:left="360"/>
       </w:pPr>
       <w:r>
-        <w:t>“Así que, para horror de Creón, Me- neceo, su primogénito, se suicida arrojándose desde una de las torres. El sacrificio de Meneceo hace a los tebanos sentirse seguros, así que salen a combatir. Ante los muros, Eteocles y Polinices se enfrentan en combate singular.”</w:t>
+        <w:t>“Mediante la sentencia del 5 de diciembre de 2018 la Suprema Corte de Jus- ticia de la Nación, en Amparo Directo 9/2018 relacionado con el Amparo Directo 8/2019, declaró la inconstitucionalidad del artículo 13 de la Ley del Seguro Social, que excluía del régimen obligatorio de la Seguridad Social a las personas trabajadoras de hogar. Con la mencionada reforma se derogó en el artículo 13 de la Ley de Seguro Social el carácter voluntario de la afiliación de las trabajadoras domésticas y se las incorporó como sujetos de aseguramiento en el régimen obligatorio, artículo 12 de la misma norma.”</w:t>
       </w:r>
     </w:p>
     <w:p>
@@ -178,7 +178,7 @@
         <w:pStyle w:val="Heading3"/>
       </w:pPr>
       <w:r>
-        <w:t>Como se hicieron los Derechos H - Ricardo Rabinovich Berkman.pdf — p. 122 — similitud 0.0680</w:t>
+        <w:t>Ley del Seguro Social - Camara de Diputados del H. Cong.pdf — p. 119 — similitud 0.1684</w:t>
       </w:r>
     </w:p>
     <w:p>
@@ -186,7 +186,7 @@
         <w:ind w:left="360"/>
       </w:pPr>
       <w:r>
-        <w:t>“Soy de tal clase social, tengo tales ingresos económicos, mi piel es de tal color, nací en un hogar de determinada religión, poseo esta inclinación sexual, sigo aquellas ideas políticas, padezco un defecto físico.,&gt; Así es que sugiere que la respuesta sólo podría surgir de un ejercicio mental Es decir, un procedimiento ficticio ¿Es ello un disparate? Todas las teorías pactistas, que plantean al contrato social como base de la estructura política y jurídica humana, parten de una ficción, que sus seguido- res saben perfectamente que lo es.”</w:t>
+        <w:t>“LEY DEL SEGURO SOCIAL CÁMARA DE DIPUTADOS DEL H. CONGRESO DE LA UNIÓN Secretaría General Secretaría de Servicios Parlamentarios Última Reforma DOF 15-01-2026 DECRETO por el que se reforman diversas disposiciones de la Ley del Seguro Social.”</w:t>
       </w:r>
     </w:p>
     <w:p>
@@ -194,7 +194,7 @@
         <w:pStyle w:val="Heading3"/>
       </w:pPr>
       <w:r>
-        <w:t>Los derechos humanos en Mexico - Emilio Alvarez Icaza Longoria.pdf — p. 61 — similitud 0.0650</w:t>
+        <w:t>Ley del Seguro Social - Camara de Diputados del H. Cong.pdf — p. 149 — similitud 0.1660</w:t>
       </w:r>
     </w:p>
     <w:p>
@@ -202,7 +202,7 @@
         <w:ind w:left="360"/>
       </w:pPr>
       <w:r>
-        <w:t>“De este modo, se espera que para 2050 haya más de 36 millones de personas adultas mayores. Según datos del Segundo Conteo de Población y Vivienda 2005, en el país residían poco más de 9 millones de adultos mayores, de ellos 3.3 millones realizaban alguna actividad económica, lo que equivalía al 36.5 por ciento. De la misma forma, poco más de 45 por ciento no contaba con algún tipo de transferencia que le brindara seguridad económica y 63 por ciento se desempeñaba en ocupacio- nes informales, hecho que les impidía acceder a las prestaciones que establecía la ley.”</w:t>
+        <w:t>“LEY DEL SEGURO SOCIAL CÁMARA DE DIPUTADOS DEL H. CONGRESO DE LA UNIÓN Secretaría General Secretaría de Servicios Parlamentarios Última Reforma DOF 15-01-2026 DECRETO por el que se adicionan diversas disposiciones de la Ley del Seguro Social, de la Ley del Instituto de Seguridad y Servicios Sociales de los Trabajadores del Estado y de la Ley Federal del Trabajo.”</w:t>
       </w:r>
     </w:p>
     <w:p>
@@ -210,7 +210,7 @@
         <w:pStyle w:val="Heading3"/>
       </w:pPr>
       <w:r>
-        <w:t>Como se hicieron los Derechos H - Ricardo Rabinovich Berkman.pdf — p. 121 — similitud 0.0643</w:t>
+        <w:t>Derecho de la seguridad social - Alberto Briceno Ruiz.pdf — p. 27 — similitud 0.1653</w:t>
       </w:r>
     </w:p>
     <w:p>
@@ -218,7 +218,7 @@
         <w:ind w:left="360"/>
       </w:pPr>
       <w:r>
-        <w:t>“Enmarcado en la tradición británica, Rawls prefirió hablar de "libertades" 'más que de "derechos". Así, de este primer principio se derivarían (o serían reforzadas) varias de las "libertades" que se remontan (remotamente) a la cultura medieval normando-inglesa, y se consolidaron (y generalizaron) en los textos revolucionarios del siglo XVII, y fueron objeto de las proclamas del XVIII: las libertades de expresión, de conciencia y de asociación. También la democracia (y sus prerrogativas anexas) y la propiedad privada.”</w:t>
+        <w:t>“Su aspecto particular permite la concreción en los conocimientos, aplicación de políticas y determinación de resultados. El seguro social integra normas jurídicas con autonomía; por esto podemos hablar de un Derecho del seguro social, con instituciones jurídicas”</w:t>
       </w:r>
     </w:p>
     <w:p>
@@ -226,7 +226,7 @@
         <w:pStyle w:val="Heading3"/>
       </w:pPr>
       <w:r>
-        <w:t>Como se hicieron los Derechos H - Ricardo Rabinovich Berkman.pdf — p. 130 — similitud 0.0570</w:t>
+        <w:t>Derecho de la seguridad social - Alberto Briceno Ruiz.pdf — p. 28 — similitud 0.1644</w:t>
       </w:r>
     </w:p>
     <w:p>
@@ -234,7 +234,7 @@
         <w:ind w:left="360"/>
       </w:pPr>
       <w:r>
-        <w:t>“Comenta con dureza el pensador musulmán contem poráneo S, A. Aideeb Abu-Saieh: "Este pasaje contiene tres conceptos relacionados que son problemáticos para nuestra concepción del co m - portamiento moral: primero, el concepto de un pueblo elegido, que es un concepto racista;segun- do, el concepto de dar la tierra de Canaán a ios judíos, que es un acto de robo; y tercero, el concep- to de circuncisión, que es una práctica mutiladora" {Denniston e t a/., 2004, p. 136 y siguientes).”</w:t>
+        <w:t>“Las publicaciones al respecto son escasas y su vinculación con la legislación laboral persiste hasta nuestros días. Las definiciones de seguro social y seguridad social que ofrecen los diver­ sos autores son, en muchos casos, confusas y hasta contradictorias, por lo que debemos estudiarlas con afán de investigación, pero con la debida reserva. Presentaré dos grupos: Conceptos de seguridad social Conceptos de seguro social Se refieren tanío a la seguridad social como al seguró social No consideran al seguro social Para Miguel A.”</w:t>
       </w:r>
     </w:p>
     <w:p>
@@ -242,7 +242,7 @@
         <w:pStyle w:val="Heading3"/>
       </w:pPr>
       <w:r>
-        <w:t>Como se hicieron los Derechos H - Ricardo Rabinovich Berkman.pdf — p. 261 — similitud 0.0563</w:t>
+        <w:t>Derecho de la seguridad social - Alberto Briceno Ruiz.pdf — p. 23 — similitud 0.1637</w:t>
       </w:r>
     </w:p>
     <w:p>
@@ -250,7 +250,7 @@
         <w:ind w:left="360"/>
       </w:pPr>
       <w:r>
-        <w:t>“Estas ideas se notan en la doctrina del período "clásico" (siglo II y primera mitad del III), recopilada después en el Digesto. Vimos cómo Gayo recorda- ba: "la principal división jurídica de las personas es aquella según la cual los hombres o son libres o son siervos" (1.5.3).”</w:t>
+        <w:t>“Sierra López, "Inseguridad, seguridad jurídica y seguridad social”, en Boletín de Información Jurídica, IMSS, núm. 15, septiembre-octubre de 1985.”</w:t>
       </w:r>
     </w:p>
     <w:p>
@@ -258,7 +258,7 @@
         <w:pStyle w:val="Heading3"/>
       </w:pPr>
       <w:r>
-        <w:t>Como se hicieron los Derechos H - Ricardo Rabinovich Berkman.pdf — p. 282 — similitud 0.0510</w:t>
+        <w:t>Derecho de la seguridad social - Alberto Briceno Ruiz.pdf — p. 33 — similitud 0.1630</w:t>
       </w:r>
     </w:p>
     <w:p>
@@ -266,7 +266,7 @@
         <w:ind w:left="360"/>
       </w:pPr>
       <w:r>
-        <w:t>“Es decir que, desde esta acepción, sería "antisemita' quien no gustase de los árabes, o se sintiese molesto por el estudio histórico de los babilonios. Sin embargo, la expresión "antisemitismo" se ha ganado ya, a los golpes y mercéd ásangre y tris- teza, un lugar en la sem ántica mundial, com o referente del prejuicio contra los "judíos'' (definir a quiénes se engloba dentro de esa clasificación, ya es otro cantar, com o viéramos antes).”</w:t>
+        <w:t>“2. Los grupos sociales deben reunir ciertas características, conforme la na­ turaleza del seguro social:”</w:t>
       </w:r>
     </w:p>
     <w:p>
@@ -274,7 +274,7 @@
         <w:pStyle w:val="Heading3"/>
       </w:pPr>
       <w:r>
-        <w:t>Derechos humanos, teorias y doc - Luis Manuel Marcano Salazar.pdf — p. 66 — similitud 0.0507</w:t>
+        <w:t>Ley del Seguro Social - Camara de Diputados del H. Cong.pdf — p. 132 — similitud 0.1598</w:t>
       </w:r>
     </w:p>
     <w:p>
@@ -282,7 +282,7 @@
         <w:ind w:left="360"/>
       </w:pPr>
       <w:r>
-        <w:t>“Donde se incluyen los siguientes derechos tendientes a un orden internacional apto para los derechos humanos; a la libre determinación de los pueblos y a la libre disposición de sus riquezas y recursos naturales; de las minorías étnicas, religiosas o lingüísticas a su cultura, a su religión y a su lengua; de los trabajadores migrantes a trabajar en otros países bajo condiciones dignas y justas; a un medio ambiente sano. En relación con esta clasificación por generaciones hay que indicar que: 1. No es la más adecuada, por cuanto no es cierto que los derechos civiles y políticos hayan sido reconocidos en primer término que los derechos económicos, sociales y culturales.”</w:t>
+        <w:t>“LEY DEL SEGURO SOCIAL CÁMARA DE DIPUTADOS DEL H. CONGRESO DE LA UNIÓN Secretaría General Secretaría de Servicios Parlamentarios Última Reforma DOF 15-01-2026 DECRETO por el que se reforman diversas disposiciones de la Ley del Seguro Social.”</w:t>
       </w:r>
     </w:p>
     <w:p>
@@ -290,7 +290,7 @@
         <w:pStyle w:val="Heading3"/>
       </w:pPr>
       <w:r>
-        <w:t>Derechos humanos, teorias y doc - Luis Manuel Marcano Salazar.pdf — p. 23 — similitud 0.0499</w:t>
+        <w:t>Derecho humano a la seguridad s - Jose Luis Belmont Lugo.pdf — p. 12 — similitud 0.1591</w:t>
       </w:r>
     </w:p>
     <w:p>
@@ -298,7 +298,7 @@
         <w:ind w:left="360"/>
       </w:pPr>
       <w:r>
-        <w:t>“Luis Manuel Marcano Salazar Por consiguiente, a pesar de las leyes de naturaleza (que cada uno observa cuando tiene la voluntad de observarlas, cuando puede hacerlo de modo seguro) si no se ha instituido o no es suficientemente grande para nuestra seguridad, cada uno se fiará tan sólo, y podrá hacerlo legalmente, sobre su propia fuerza y maña, para protegerse contra los demás hombres.”</w:t>
+        <w:t>“La finalidad de la seguridad social se estable­ ce en la Ley del Seguro Social, de acuerdo con su ar­ tículo 2, y consiste en garantizar el derecho a la salud, la asistencia médica, la protección de los medios de subsistencia y los servicios sociales necesarios para el bienestar individual y colectivo, y el otorgamiento de una pensión que será garantizada por el Estado, previo cumplimiento de los requisitos legales.10 El 10 de junio de 2011 fue publicada en el Diario Oficial de la Federación, una reforma que estableció en el art. 1º constitucional, la obligación de las autori­ dades para que salvaguarden los derechos humanos”</w:t>
       </w:r>
     </w:p>
     <w:p>
@@ -306,7 +306,7 @@
         <w:pStyle w:val="Heading3"/>
       </w:pPr>
       <w:r>
-        <w:t>Los derechos humanos en Mexico - Emilio Alvarez Icaza Longoria.pdf — p. 23 — similitud 0.0494</w:t>
+        <w:t>Derecho de la seguridad social - Alberto Briceno Ruiz.pdf — p. 26 — similitud 0.1579</w:t>
       </w:r>
     </w:p>
     <w:p>
@@ -314,7 +314,7 @@
         <w:ind w:left="360"/>
       </w:pPr>
       <w:r>
-        <w:t>“Estos derechos surgieron tras una serie de luchas reivin- dicatorias que la sociedad civil sostuvo para buscar condiciones más equitativas a nivel internacional para el desarrollo de las personas y de los pueblos. La integralidad de los derechos humanos Hay que decir que la clasificación y división anteriores son exclusiva- mente para fines analíticos, pues como se señala en la Declaración y Programa de Acción de Viena, aprobada por la Conferencia Mundial de Derechos Humanos el 25 de junio de 1993: Todos los derechos humanos son universales, indivisibles e interdependientes y están relacionados entre sí. La comuni- dad internacional debe tratar los derechos humanos de forma”</w:t>
+        <w:t>“La se­ guridad es el género; el seguro social, su instrumento. Desde luego, diversas disciplinas como la medicina, ergonomía, economía, estadística y matemática guardan relación con la seguridad y gravan o benefician su desarrollo, depen­ diendo, en buena parte, de la eficacia del seguro social. La relación entre seguridad social y seguro social, con sus distinciones, se presenta en el cuadro siguiente:”</w:t>
       </w:r>
     </w:p>
     <w:p>
@@ -322,7 +322,7 @@
         <w:pStyle w:val="Heading3"/>
       </w:pPr>
       <w:r>
-        <w:t>Derechos humanos, teorias y doc - Luis Manuel Marcano Salazar.pdf — p. 70 — similitud 0.0476</w:t>
+        <w:t>Ley del Seguro Social - Camara de Diputados del H. Cong.pdf — p. 158 — similitud 0.1551</w:t>
       </w:r>
     </w:p>
     <w:p>
@@ -330,7 +330,7 @@
         <w:ind w:left="360"/>
       </w:pPr>
       <w:r>
-        <w:t>“Derechos humanos. Teorías y doctrinas Capitulo III Protección jurídica internacional de la persona humana Lo que en definitiva desencadenó la internacionalización de los derechos humanos fue la conmoción histórica de millones de personas fallecidas durante la Segunda Guerra Mundial y la posterior creación de la Organización de las Naciones Unidas. La magnitud del genocidio puso en evidencia que el ejercicio abusivo del poder constituye una actividad peligrosa para la dignidad humana, de modo que su control no debe dejarse a cargo, exclusivamente, de las instituciones domésticas, sino que deben constituirse instancias internacionales para su protección.”</w:t>
+        <w:t>“Aquellos patrones que, en términos del segundo párrafo del artículo 75 de la Ley del Seguro Social, previo a la entrada en vigor del presente Decreto, hubiesen solicitado al Instituto Mexicano del Seguro Social la asignación de uno o más registros patronales por clase, de las señaladas en el artículo 73 de la Ley del Seguro Social, para realizar la inscripción de sus trabajadores a nivel nacional, tendrán hasta el 1 de septiembre de 2021 para dar de baja dichos registros patronales y de ser procedente, solicitar al mencionado Instituto se le otorgue un registro patronal en términos de lo dispuesto por el Reglamento de la Ley del Seguro Social en materia de Afiliación, Clasificación de...”</w:t>
       </w:r>
     </w:p>
     <w:p>
@@ -338,7 +338,7 @@
         <w:pStyle w:val="Heading3"/>
       </w:pPr>
       <w:r>
-        <w:t>Como se hicieron los Derechos H - Ricardo Rabinovich Berkman.pdf — p. 142 — similitud 0.0470</w:t>
+        <w:t>Derecho de la seguridad social - Alberto Briceno Ruiz.pdf — p. 13 — similitud 0.1413</w:t>
       </w:r>
     </w:p>
     <w:p>
@@ -346,7 +346,7 @@
         <w:ind w:left="360"/>
       </w:pPr>
       <w:r>
-        <w:t>“Su ejemplo no cundió. Se di- luyó entre las miríadas de personas que ingresaron, como diría la pensadora alemana Hannah Arendt (1906-1975), en la "banalidad del mal". En cambio, lo que sí terminó con el horror, cortó el Holocausto (desgraciadamente bas- tante tarde) y abortó el sueño hitleriano de un imperio basado en la supuesta superioridad biológica de algunos, fue la violencia.”</w:t>
+        <w:t>“Queda claro que en nuestro país la seguridad social ha sido preocupación tanto de la administración pública como del sector académico, que mucho ha aportado para su mejor concepción y funcionamiento. En este marco apa­ rece la presente obra titulada Derecho de la seguridad social, de la autoría de Don Alberto Briceño Ruiz, distinguido catedrático universitario, quien desde hace casi 40 años ha impartido la asignatura en la Facultad de Derecho de la Universidad Nacional Autónoma de México (unam), en donde cuenta con la categoría de profesor titular nivel “C”. Briceño Ruiz es, además, presidente de la Academia Mexicana de Derecho de la Seguridad Social, que fundó hace poco más de 10 años.”</w:t>
       </w:r>
     </w:p>
     <w:p>
@@ -354,7 +354,7 @@
         <w:pStyle w:val="Heading3"/>
       </w:pPr>
       <w:r>
-        <w:t>Como se hicieron los Derechos H - Ricardo Rabinovich Berkman.pdf — p. 260 — similitud 0.0465</w:t>
+        <w:t>Derecho de la seguridad social - Alberto Briceno Ruiz.pdf — p. 23 — similitud 0.1400</w:t>
       </w:r>
     </w:p>
     <w:p>
@@ -362,7 +362,7 @@
         <w:ind w:left="360"/>
       </w:pPr>
       <w:r>
-        <w:t>“Su equivalente en las Instituciojies de Justiniano (1.3)&gt; obra concebida en paralelo, como texto de estudio, también dirigida por el jurista Triboniano, lleva el nombre denominación "De iure per- sonarían" (Del ius de las personas). El Título de las Instituciones se inicia con la división (atribuida a Gayo) del "ius persommm", según los "homines" sean libres o siervos, clasificación que aparece también en el Digesto (1.5.3). Siguen cinco parágrafos, todos ellos de- dicados a la esclavitud.”</w:t>
+        <w:t>“15, septiembre-octubre de 1985. 10 Alberto Briceño Ruiz, op. cit., p. 24.”</w:t>
       </w:r>
     </w:p>
     <w:p>
@@ -370,7 +370,7 @@
         <w:pStyle w:val="Heading3"/>
       </w:pPr>
       <w:r>
-        <w:t>Derechos humanos, teorias y doc - Luis Manuel Marcano Salazar.pdf — p. 16 — similitud 0.0462</w:t>
+        <w:t>Curso de derechos humanos - Ana Maria Ibarra Olguin.pdf — p. 906 — similitud 0.1270</w:t>
       </w:r>
     </w:p>
     <w:p>
@@ -378,7 +378,7 @@
         <w:ind w:left="360"/>
       </w:pPr>
       <w:r>
-        <w:t>“Esos eventos internacionales generaron cambios constitucionales; así, en Venezuela a partir de la Constitución de 1999 en su Capítulo IX se contemplan los derechos ambientales en los artículos 127 al 129, como un derecho de la persona susceptible de protección y a su vez un deber compartido con el Estado que imperiosamente debe protegerlo e imponer la conservación del equilibrio ecológico para las generaciones futuras, en el artículo 127 se consagra específicamente: “Es un derecho y un deber de cada generación proteger y mantener el ambiente en beneficio de sí misma y del mundo futuro.Toda persona tiene derecho individual y colectivamente a disfrutar de una vida y de un ambiente seguro...”</w:t>
+        <w:t>“Esquema contributivo de aseguramiento El modelo contributivo de aseguramiento está integrado por diversas institucio- nes, leyes, reglamentos y prestaciones. Para los trabajadores formales y jubilados del sector privado, el Instituto Mexicano del Seguro Social (IMSS) que, por volumen de afiliados, de trabajadores y de infraestructura institucional, es el más grande e importante.”</w:t>
       </w:r>
     </w:p>
     <w:p>
@@ -386,7 +386,7 @@
         <w:pStyle w:val="Heading3"/>
       </w:pPr>
       <w:r>
-        <w:t>Derechos humanos, teorias y doc - Luis Manuel Marcano Salazar.pdf — p. 54 — similitud 0.0430</w:t>
+        <w:t>Ley del Seguro Social - Camara de Diputados del H. Cong.pdf — p. 109 — similitud 0.1269</w:t>
       </w:r>
     </w:p>
     <w:p>
@@ -394,7 +394,7 @@
         <w:ind w:left="360"/>
       </w:pPr>
       <w:r>
-        <w:t>“De acuerdo a Xifra Heras (1957). “Hoy día se está de acuerdo en admitir que las fuentes de la primera Declaración francesa fueron múltiples, y que entre ellas figuran indiscutiblemente las declaraciones americanas, la doctrina de los filósofos franceses (Montesquieu, Rousseau, Voltaire, Condorcet), las teorías iusnaturalistas y las corrientes religiosas tradicionales”. (p.345)”</w:t>
+        <w:t>“Párrafo reformado DOF 21-11-1996 A partir de la entrada en vigor de esta Ley, se derogan la Ley del Seguro Social publicada en el Diario Oficial de la Federación el día doce de marzo de 1973, la Ley que incorpora al Régimen del Seguro Social obligatorio a los Productores de Caña de Azúcar y a sus trabajadores, publicada el siete de diciembre de 1963 en dicho órgano oficial, así como todas las disposiciones legales que se opongan a la presente Ley. SEGUNDO.”</w:t>
       </w:r>
     </w:p>
     <w:p>
@@ -402,7 +402,7 @@
         <w:pStyle w:val="Heading3"/>
       </w:pPr>
       <w:r>
-        <w:t>Los derechos humanos en Mexico - Emilio Alvarez Icaza Longoria.pdf — p. 23 — similitud 0.0396</w:t>
+        <w:t>Ley del Seguro Social - Camara de Diputados del H. Cong.pdf — p. 110 — similitud 0.1259</w:t>
       </w:r>
     </w:p>
     <w:p>
@@ -410,7 +410,103 @@
         <w:ind w:left="360"/>
       </w:pPr>
       <w:r>
-        <w:t>“Son los derechos más recientes y aún están en proceso de codificación tanto nacional como internacional; es decir, prácticamente no se encuen- tran establecidos en las leyes ni en los tratados internacionales o nacionales. Estos derechos surgieron tras una serie de luchas reivin- dicatorias que la sociedad civil sostuvo para buscar condiciones más equitativas a nivel internacional para el desarrollo de las personas y de los pueblos.”</w:t>
+        <w:t>“Los asegurados a que se refieren los artículos 12 fracción III y 13 de la Ley del Seguro Social, que se deroga, y los comprendidos en la Ley que Incorpora al Régimen del Seguro Social Obligatorio a los Productores de Caña de Azúcar y a sus Trabajadores, que también se deroga, conservarán sus derechos adquiridos, esquemas de aseguramiento y bases de cotización.”</w:t>
+      </w:r>
+    </w:p>
+    <w:p>
+      <w:pPr>
+        <w:pStyle w:val="Heading3"/>
+      </w:pPr>
+      <w:r>
+        <w:t>Derecho de la seguridad social - Alberto Briceno Ruiz.pdf — p. 67 — similitud 0.1229</w:t>
+      </w:r>
+    </w:p>
+    <w:p>
+      <w:pPr>
+        <w:ind w:left="360"/>
+      </w:pPr>
+      <w:r>
+        <w:t>“En 1899 la Cámara de ¡os Comunes designó una nueva comisión para el estudio del problema de los ancianos pobres, que se pronunció a favor de un sistema de pensiones; en dicha comisión se encontraba David Lloyd George. 9 Alberto Briceño Ruiz, Derecho mexicano de los seguros sociales, Haría, México, 1987, p. 70.”</w:t>
+      </w:r>
+    </w:p>
+    <w:p>
+      <w:pPr>
+        <w:pStyle w:val="Heading3"/>
+      </w:pPr>
+      <w:r>
+        <w:t>Derecho de la seguridad social - Alberto Briceno Ruiz.pdf — p. 26 — similitud 0.1173</w:t>
+      </w:r>
+    </w:p>
+    <w:p>
+      <w:pPr>
+        <w:ind w:left="360"/>
+      </w:pPr>
+      <w:r>
+        <w:t>“Desde luego, diversas disciplinas como la medicina, ergonomía, economía, estadística y matemática guardan relación con la seguridad y gravan o benefician su desarrollo, depen­ diendo, en buena parte, de la eficacia del seguro social. La relación entre seguridad social y seguro social, con sus distinciones, se presenta en el cuadro siguiente:”</w:t>
+      </w:r>
+    </w:p>
+    <w:p>
+      <w:pPr>
+        <w:pStyle w:val="Heading3"/>
+      </w:pPr>
+      <w:r>
+        <w:t>Curso de derechos humanos - Ana Maria Ibarra Olguin.pdf — p. 913 — similitud 0.1045</w:t>
+      </w:r>
+    </w:p>
+    <w:p>
+      <w:pPr>
+        <w:ind w:left="360"/>
+      </w:pPr>
+      <w:r>
+        <w:t>“El derecho a la seguridad social 913 causa de muerte —de viudez en el matrimonio y en el concubinato, de orfandad y ascendencia— y servicios de guarderías. La inmensa mayoría de sentencias de la SCJN sobre seguridad social se origina en litigios dentro del modelo contributivo de aseguramiento social. Las pocas que hay sobre “programas sociales”, o modelo de seguridad social no contributivo, no le dicen, por razones que habrá que explorar con más detenimiento, “derecho a la seguridad social” al derecho a la seguridad social.”</w:t>
+      </w:r>
+    </w:p>
+    <w:p>
+      <w:pPr>
+        <w:pStyle w:val="Heading3"/>
+      </w:pPr>
+      <w:r>
+        <w:t>Derecho de la seguridad social - Alberto Briceno Ruiz.pdf — p. 108 — similitud 0.1023</w:t>
+      </w:r>
+    </w:p>
+    <w:p>
+      <w:pPr>
+        <w:ind w:left="360"/>
+      </w:pPr>
+      <w:r>
+        <w:t>“Aplicación limitada. “El régimen del Seguro Social no es susceptible de aplicarse de un modo general o indeterminado a todos los individuos de la sociedad, sino exclusivamente al sector de la población formado por las personas que trabajan mediante la percepción de un salario o sueldo... el Seguro Social limita la protección del capital humano a”</w:t>
+      </w:r>
+    </w:p>
+    <w:p>
+      <w:pPr>
+        <w:pStyle w:val="Heading3"/>
+      </w:pPr>
+      <w:r>
+        <w:t>Derecho de la seguridad social - Alberto Briceno Ruiz.pdf — p. 30 — similitud 0.0992</w:t>
+      </w:r>
+    </w:p>
+    <w:p>
+      <w:pPr>
+        <w:ind w:left="360"/>
+      </w:pPr>
+      <w:r>
+        <w:t>“119. 21 Francisco José Martone, Seguro social obligatorio, Buenos Aires, 1951, p. 17.”</w:t>
+      </w:r>
+    </w:p>
+    <w:p>
+      <w:pPr>
+        <w:pStyle w:val="Heading3"/>
+      </w:pPr>
+      <w:r>
+        <w:t>Curso de derechos humanos - Ana Maria Ibarra Olguin.pdf — p. 901 — similitud 0.0978</w:t>
+      </w:r>
+    </w:p>
+    <w:p>
+      <w:pPr>
+        <w:ind w:left="360"/>
+      </w:pPr>
+      <w:r>
+        <w:t>“1.  Integración del bloque de constitucionalidad respecto del derecho hu- mano a la seguridad social El derecho a la seguridad social está consagrado en diversos instrumentos in- ternacionales de derechos humanos y, por supuesto, en la Constitución mexicana. El artículo 123 establece que la ley del seguro social comprenderá los seguros de”</w:t>
       </w:r>
     </w:p>
     <w:p>
@@ -421,7 +517,7 @@
         <w:t xml:space="preserve">Observación automática: </w:t>
       </w:r>
       <w:r>
-        <w:t>La ficha presenta coincidencias débiles; se recomienda validar manualmente las citas. Se agruparon referencias de múltiples fuentes para enriquecer el concepto. Hay 22 referencia(s) de baja similitud que podrían introducir ruido.</w:t>
+        <w:t>La ficha presenta coincidencias útiles, pero conviene revisar la pertinencia de cada cita. Se agruparon referencias de múltiples fuentes para enriquecer el concepto.</w:t>
       </w:r>
     </w:p>
     <w:p>
@@ -429,7 +525,7 @@
         <w:pStyle w:val="Heading2"/>
       </w:pPr>
       <w:r>
-        <w:t>Ficha 02. Evolución histórica del seguro</w:t>
+        <w:t>Ficha 02. características del seguro privado</w:t>
       </w:r>
     </w:p>
     <w:p>
@@ -440,7 +536,7 @@
         <w:t xml:space="preserve">Fuentes: </w:t>
       </w:r>
       <w:r>
-        <w:t>Como se hicieron los Derechos H - Ricardo Rabinovich Berkman.pdf; Derechos humanos, teorias y doc - Luis Manuel Marcano Salazar.pdf; Los derechos humanos en Mexico - Emilio Alvarez Icaza Longoria.pdf</w:t>
+        <w:t>Derecho de la seguridad social - Alberto Briceno Ruiz.pdf; El derecho a la seguridad socia - Diana Beatriz Gonzalez Carvallo.pdf; Ley del Instituto de Seguridad - Camara de Diputados del H. Cong.pdf; Ley del Seguro Social - Camara de Diputados del H. Cong.pdf</w:t>
       </w:r>
     </w:p>
     <w:p>
@@ -451,7 +547,7 @@
         <w:t xml:space="preserve">Ubicaciones: </w:t>
       </w:r>
       <w:r>
-        <w:t>Como se hicieron los Derechos H - Ricardo Rabinovich Berkman.pdf, p. 12; Como se hicieron los Derechos H - Ricardo Rabinovich Berkman.pdf, p. 122; Como se hicieron los Derechos H - Ricardo Rabinovich Berkman.pdf, p. 14; Como se hicieron los Derechos H - Ricardo Rabinovich Berkman.pdf, p. 141; Como se hicieron los Derechos H - Ricardo Rabinovich Berkman.pdf, p. 174; Como se hicieron los Derechos H - Ricardo Rabinovich Berkman.pdf, p. 184; Como se hicieron los Derechos H - Ricardo Rabinovich Berkman.pdf, p. 192; Como se hicieron los Derechos H - Ricardo Rabinovich Berkman.pdf, p. 217; Como se hicieron los Derechos H - Ricardo Rabinovich Berkman.pdf, p. 285; Como se hicieron los Derechos H - Ricardo Rabinovich Berkman.pdf, p. 295; Como se hicieron los Derechos H - Ricardo Rabinovich Berkman.pdf, p. 68; Como se hicieron los Derechos H - Ricardo Rabinovich Berkman.pdf, p. 82; Derechos humanos, teorias y doc - Luis Manuel Marcano Salazar.pdf, p. 127; Derechos humanos, teorias y doc - Luis Manuel Marcano Salazar.pdf, p. 128; Derechos humanos, teorias y doc - Luis Manuel Marcano Salazar.pdf, p. 141; Derechos humanos, teorias y doc - Luis Manuel Marcano Salazar.pdf, p. 142; Derechos humanos, teorias y doc - Luis Manuel Marcano Salazar.pdf, p. 16; Derechos humanos, teorias y doc - Luis Manuel Marcano Salazar.pdf, p. 23; Derechos humanos, teorias y doc - Luis Manuel Marcano Salazar.pdf, p. 34; Derechos humanos, teorias y doc - Luis Manuel Marcano Salazar.pdf, p. 39; Derechos humanos, teorias y doc - Luis Manuel Marcano Salazar.pdf, p. 54; Derechos humanos, teorias y doc - Luis Manuel Marcano Salazar.pdf, p. 64; Derechos humanos, teorias y doc - Luis Manuel Marcano Salazar.pdf, p. 92; Los derechos humanos en Mexico - Emilio Alvarez Icaza Longoria.pdf, p. 14; Los derechos humanos en Mexico - Emilio Alvarez Icaza Longoria.pdf, p. 48</w:t>
+        <w:t>Derecho de la seguridad social - Alberto Briceno Ruiz.pdf, p. 109; Derecho de la seguridad social - Alberto Briceno Ruiz.pdf, p. 118; Derecho de la seguridad social - Alberto Briceno Ruiz.pdf, p. 240; Derecho de la seguridad social - Alberto Briceno Ruiz.pdf, p. 243; Derecho de la seguridad social - Alberto Briceno Ruiz.pdf, p. 26; Derecho de la seguridad social - Alberto Briceno Ruiz.pdf, p. 285; Derecho de la seguridad social - Alberto Briceno Ruiz.pdf, p. 301; Derecho de la seguridad social - Alberto Briceno Ruiz.pdf, p. 313; Derecho de la seguridad social - Alberto Briceno Ruiz.pdf, p. 315; Derecho de la seguridad social - Alberto Briceno Ruiz.pdf, p. 343; Derecho de la seguridad social - Alberto Briceno Ruiz.pdf, p. 345; Derecho de la seguridad social - Alberto Briceno Ruiz.pdf, p. 353; Derecho de la seguridad social - Alberto Briceno Ruiz.pdf, p. 51; Derecho de la seguridad social - Alberto Briceno Ruiz.pdf, p. 57; Derecho de la seguridad social - Alberto Briceno Ruiz.pdf, p. 66; El derecho a la seguridad socia - Diana Beatriz Gonzalez Carvallo.pdf, p. 280; El derecho a la seguridad socia - Diana Beatriz Gonzalez Carvallo.pdf, p. 293; El derecho a la seguridad socia - Diana Beatriz Gonzalez Carvallo.pdf, p. 313; Ley del Instituto de Seguridad - Camara de Diputados del H. Cong.pdf, p. 36; Ley del Seguro Social - Camara de Diputados del H. Cong.pdf, p. 132</w:t>
       </w:r>
     </w:p>
     <w:p>
@@ -459,7 +555,7 @@
         <w:pStyle w:val="Heading3"/>
       </w:pPr>
       <w:r>
-        <w:t>Como se hicieron los Derechos H - Ricardo Rabinovich Berkman.pdf — p. 184 — similitud 0.0733</w:t>
+        <w:t>Ley del Instituto de Seguridad - Camara de Diputados del H. Cong.pdf — p. 36 — similitud 0.1772</w:t>
       </w:r>
     </w:p>
     <w:p>
@@ -467,7 +563,7 @@
         <w:ind w:left="360"/>
       </w:pPr>
       <w:r>
-        <w:t>“195 El uso de la expresión "Código" es más que controversia!. La piedra fue hallada por una expedición francesa en 1901, en las ruinas de Susa, una an- tigua capital del Elam, hoy territorio del Irán (por eso, hay una copia exacta en el Museo de Teherán). AI parecer, había sido llevada a Susa como trofeo por los elamitas, en el siglo XII.”</w:t>
+        <w:t>“Establecer servicios de información y atención a los Trabajadores; IX. Entregar los recursos a la Aseguradora o Administradora que el Trabajador o sus Familiares Derechohabientes hayan elegido, para la contratación de Rentas vitalicias, del Seguro de Sobrevivencia, o Retiros Programados; X. Contratar cualquier tipo de servicios requeridos para la administración de las Cuentas Individuales y la inversión de los recursos, y 36 de 128”</w:t>
       </w:r>
     </w:p>
     <w:p>
@@ -475,7 +571,7 @@
         <w:pStyle w:val="Heading3"/>
       </w:pPr>
       <w:r>
-        <w:t>Derechos humanos, teorias y doc - Luis Manuel Marcano Salazar.pdf — p. 64 — similitud 0.0693</w:t>
+        <w:t>Derecho de la seguridad social - Alberto Briceno Ruiz.pdf — p. 343 — similitud 0.1635</w:t>
       </w:r>
     </w:p>
     <w:p>
@@ -483,7 +579,7 @@
         <w:ind w:left="360"/>
       </w:pPr>
       <w:r>
-        <w:t>“1. derecho a la vida; 2. derecho a la integridad personal; 3. la prohibición de esclavitud y servidumbre; 4. la prohibición de la discriminación; 5. el derecho a la personalidad jurídica; 6. el derecho a la nacionalidad; los derechos políticos; el principio de legalidad y no retroactividad; 7. la libertad de conciencia y religión; 8. la protección a la familia y los derechos del niño; 9. así como las garantías judiciales indispensables para la protección de tales derechos, entre los cuales deben considerarse incluidos el amparo y el hábeas corpus. (p.45) 2.3.6.5.- Son progresivos El desarrollo de la protección internacional de los derechos humanos, si bien ha sido paulatino, a medida que ha...”</w:t>
+        <w:t>“Siempre que se fusionen dos o más Afore deberá prevalecer la estructura de comisiones más baja, conforme a los criterios que al efecto expida la Junta de Gobierno de la Comisión. En ningún caso, las Afore podrán cobrar comisiones por el traspaso de las cuentas individuales o de recursos entre Siefore, ni por entregar los recursos a la institución de seguros que e! trabajador o sus bene­ ficiarios hayan elegido, para la contratación de rentas vitalicias o del seguro de sobrevivencia. Con la finalidad de que tos trabajadores puedan tener información opor­ tuna sobre las comisiones que se cobren con cargo a sus cuentas individuales,”</w:t>
       </w:r>
     </w:p>
     <w:p>
@@ -491,7 +587,7 @@
         <w:pStyle w:val="Heading3"/>
       </w:pPr>
       <w:r>
-        <w:t>Como se hicieron los Derechos H - Ricardo Rabinovich Berkman.pdf — p. 192 — similitud 0.0648</w:t>
+        <w:t>Derecho de la seguridad social - Alberto Briceno Ruiz.pdf — p. 353 — similitud 0.1565</w:t>
       </w:r>
     </w:p>
     <w:p>
@@ -499,7 +595,7 @@
         <w:ind w:left="360"/>
       </w:pPr>
       <w:r>
-        <w:t>“203 Y concluye: "Cuando Marduk me envió a gobernar al pueblo y ayudar al país, establecí la protección y la justicia en la tierra y promoví el bienestar de la gente". El comienzo del "epílogo" apunta en el mismo sentido: "Decisiones justas296 que Hammurabi, el rey237 sabio, estableció, dando estabilidad y buen gobierno al país. Hammurabi, el rey perfecto298, soy yo.”</w:t>
+        <w:t>“Consar, Afore y Siefore 337 ni por entregar los recursos a !a institución de seguros que el trabajador o sus beneficiarios elijan para la contratación de rentas vitalicias o del seguro de sobrevivencia. Las comisiones sobre activos se cobrarán por mensualidades vencidas a más tardar dentro de los primeros cinco días hábiles del mes inmediato pos­ terior al periodo de que se trate, mediante un cargo directo a la cuenta indi­ vidual, siempre y cuando se hayan registrado en las cuentas individuales los movimientos de utilidad.”</w:t>
       </w:r>
     </w:p>
     <w:p>
@@ -507,7 +603,7 @@
         <w:pStyle w:val="Heading3"/>
       </w:pPr>
       <w:r>
-        <w:t>Derechos humanos, teorias y doc - Luis Manuel Marcano Salazar.pdf — p. 92 — similitud 0.0648</w:t>
+        <w:t>Derecho de la seguridad social - Alberto Briceno Ruiz.pdf — p. 315 — similitud 0.1489</w:t>
       </w:r>
     </w:p>
     <w:p>
@@ -515,7 +611,7 @@
         <w:ind w:left="360"/>
       </w:pPr>
       <w:r>
-        <w:t>“Como se observó el derecho internacional ha calado en el constitucionalismo latinoamericano siendo el reconocimiento y protección de los derechos humanos el tópico en el cual se patentiza esta evolución de una manera más palpable; desde los preámbulos donde se exponen preciosos anhelos los cuales son incorporados al articulado constitucional formando hoy lo que se conoce como el bloque de la constitucionalidad,28 pero este bloque, será quebradizo si los esfuerzos realizados en los procesos constituyentes se derogan por la inaplicabilidad de las decisiones de los tribunales o cortes competentes en materia de derechos humanos; una cosa es su establecimiento en las diferentes Cartas Políticas...”</w:t>
+        <w:t>“La LSAR incrementa las posibilidades de una interpretación confusa, al señalar en su art. 80: El saldo de la cuenta individual, una vez deducido el importe de los recursos provenientes de la subcuenta de aportaciones voluntarias, será considerado por el Instituto Mexicano del Seguro Social para la determinación del monto cons­ titutivo, a fin de calcular la suma asegurada que se entregará a la institución de seguros elegida por el trabajador o sus beneficiarios para la contratación de las rentas vitalicias o seguros de sobrevivencia en los términos previstos en la Ley del Seguro Social.”</w:t>
       </w:r>
     </w:p>
     <w:p>
@@ -523,7 +619,7 @@
         <w:pStyle w:val="Heading3"/>
       </w:pPr>
       <w:r>
-        <w:t>Como se hicieron los Derechos H - Ricardo Rabinovich Berkman.pdf — p. 295 — similitud 0.0645</w:t>
+        <w:t>Derecho de la seguridad social - Alberto Briceno Ruiz.pdf — p. 26 — similitud 0.1415</w:t>
       </w:r>
     </w:p>
     <w:p>
@@ -531,7 +627,7 @@
         <w:ind w:left="360"/>
       </w:pPr>
       <w:r>
-        <w:t>“También Constancio, en 339, les retira el derecho de tener esclavos que no sean judíos. Con ello, Ies propina un duro golpe económico, en una época don- de las actividades industriales y agrícolas se basaban en la servidumbre371. Se inician así las restricciones a los medios de subsistencia, que irán acorralando a los israelitas hacia unas pocas profesiones.”</w:t>
+        <w:t>“Desde luego, diversas disciplinas como la medicina, ergonomía, economía, estadística y matemática guardan relación con la seguridad y gravan o benefician su desarrollo, depen­ diendo, en buena parte, de la eficacia del seguro social. La relación entre seguridad social y seguro social, con sus distinciones, se presenta en el cuadro siguiente:”</w:t>
       </w:r>
     </w:p>
     <w:p>
@@ -539,7 +635,7 @@
         <w:pStyle w:val="Heading3"/>
       </w:pPr>
       <w:r>
-        <w:t>Derechos humanos, teorias y doc - Luis Manuel Marcano Salazar.pdf — p. 39 — similitud 0.0644</w:t>
+        <w:t>Derecho de la seguridad social - Alberto Briceno Ruiz.pdf — p. 345 — similitud 0.1317</w:t>
       </w:r>
     </w:p>
     <w:p>
@@ -547,7 +643,7 @@
         <w:ind w:left="360"/>
       </w:pPr>
       <w:r>
-        <w:t>“Se imponen a todas las normas del Derecho creado por el Soberano y son un límite a su acción. (p.26) Para los positivistas, el hombre, en razón del desarrollo histórico de la sociedad, se encuentra revestido de derechos variables y sometidos al flujo del devenir que impone la convivencia social, consideran que estos derechos son únicamente aquellos reconocidos expresamente en el texto constitucional por el propio Estado, teniendo por ello un carácter constitutivo su consagración.”</w:t>
+        <w:t>“Para empezar, no está sus­ crito por un apoderado legal de la sociedad mercantil, sino por un empleado "promotor”. El primer aspecto es la naturaleza mercantil del contrato. En la Declara­ ción Primera, el trabajador manifiesta que conoce su derecho de elegir libre­ mente la Afore que operará su cuenta individual, así como que este derecho lo está ejerciendo voluntariamente al firmar o plasmar su huella digital en el documento.”</w:t>
       </w:r>
     </w:p>
     <w:p>
@@ -555,7 +651,7 @@
         <w:pStyle w:val="Heading3"/>
       </w:pPr>
       <w:r>
-        <w:t>Derechos humanos, teorias y doc - Luis Manuel Marcano Salazar.pdf — p. 142 — similitud 0.0637</w:t>
+        <w:t>Derecho de la seguridad social - Alberto Briceno Ruiz.pdf — p. 313 — similitud 0.1171</w:t>
       </w:r>
     </w:p>
     <w:p>
@@ -563,7 +659,7 @@
         <w:ind w:left="360"/>
       </w:pPr>
       <w:r>
-        <w:t>“De hecho, son ya muchos los países, estados y compañías que han puesto manos a la obra. A pesar de ello, las emisiones de la mayor parte de los países individuales son bajas, en relación con el total mundial.El informe Stern se hace eco de la Convención Marco de las Naciones Unidas sobre el Cambio Climático (UNFCCC), el Protocolo de Kioto y de una serie de asociaciones y diálogos informales que proporcionan un marco en apoyo de la cooperación y los cimientos sobre los cuales se pueden levantar nuevas medidas colectivas58.”</w:t>
+        <w:t>“La intervención de la Comisión Nacional de Seguros y Fianzas no se jus­ tifica para determinar las bases de la contratación del seguro de sobrevivencia; no se trata de un seguro privado, por lo que la regulación por el Derecho Mer­ cantil atenta contra los principios del Seguro Social. La fracc.”</w:t>
       </w:r>
     </w:p>
     <w:p>
@@ -571,7 +667,7 @@
         <w:pStyle w:val="Heading3"/>
       </w:pPr>
       <w:r>
-        <w:t>Como se hicieron los Derechos H - Ricardo Rabinovich Berkman.pdf — p. 141 — similitud 0.0634</w:t>
+        <w:t>Derecho de la seguridad social - Alberto Briceno Ruiz.pdf — p. 243 — similitud 0.1156</w:t>
       </w:r>
     </w:p>
     <w:p>
@@ -579,7 +675,7 @@
         <w:ind w:left="360"/>
       </w:pPr>
       <w:r>
-        <w:t>“Es la decisi- va lucha ideológica del siglo XXI, y la misión de nuestra generación", agrega- ba Bush a renglón seguido, colocando el ataque estadounidense a Irak en un nivel de necesidad apocalíptica, que hace acordar a los criterios de la "guerra santa", sobre los que volveremos más adelante. "El mundo está más seguro porque Saddam Hussein no está más en el poder. Y ahora el desafío es ayudar al pueblo iraquí a construir una de- mocracia que cumpla los sueños de los casi doce millones de iraquíes que salieron a votar en elecciones libres el último diciembre", concluía optimista el mandatario estadounidense213.”</w:t>
+        <w:t>“227 un mes, y el resto en el plazo de un año y medio.- El empresario comentó que este nicho de negocios que en México se encontraba rezagado presenta por lo mismo oportunidades interesantes al cambiar el concepto de salud en el país, de correctiva a preventiva.- Dijo que el principal mercado de la sociedad creada con Harvard Health será el centro del país, pero no descartó que un futuro se extienda a las principales ciudades de la República Mexicana.- Peralta rechazó que la subro­ gación de servicios de salud que podría ser aprobada en la Cámara de Diputados (sic) próximamente proponga la privatización del seguro social.- El IMSS seguirá prestando sus servicios normales y las nuevas...”</w:t>
       </w:r>
     </w:p>
     <w:p>
@@ -587,7 +683,7 @@
         <w:pStyle w:val="Heading3"/>
       </w:pPr>
       <w:r>
-        <w:t>Como se hicieron los Derechos H - Ricardo Rabinovich Berkman.pdf — p. 217 — similitud 0.0633</w:t>
+        <w:t>El derecho a la seguridad socia - Diana Beatriz Gonzalez Carvallo.pdf — p. 293 — similitud 0.1134</w:t>
       </w:r>
     </w:p>
     <w:p>
@@ -595,7 +691,7 @@
         <w:ind w:left="360"/>
       </w:pPr>
       <w:r>
-        <w:t>“Advierte: "Los árboles que se doblan conservan sus ramas, pero los que se resis- ten acaban arrancados de raíz" (que es como Creón terminará: sin des- cendientes). Y emplea una imagen característica de un griego (aunque de un ateniense más que de un beocio): " Aquel piloto que, seguro de lo que hace, ajusta la escota de ía vela y no la suelta, realiza el resto del viaje con el navio tumbado" (713-717). El corifeo trata de ponerlos de acuerdo.”</w:t>
+        <w:t>“Sin embargo, el beneficio proveniente del SSDI de Elma representaba en cierta medida un retorno de sus propias contribuciones al impuesto sobre la nómina, con las cuales se adquirían ahorros para el retiro y un contrato de seguro contra discapacidad. Sin duda, la seguridad social redistribuye el ingreso al dar a los trabajadores con menos ingresos una ventaja relativa comparada con una prima de seguro puramente actuarial.24 Aun así, los beneficios públicos recibidos por Elma tenían un componente sustancial privado, justo como si estuviera retirando sus ahorros o hubiese adquirido un seguro privado por discapacidad.”</w:t>
       </w:r>
     </w:p>
     <w:p>
@@ -603,7 +699,7 @@
         <w:pStyle w:val="Heading3"/>
       </w:pPr>
       <w:r>
-        <w:t>Como se hicieron los Derechos H - Ricardo Rabinovich Berkman.pdf — p. 285 — similitud 0.0622</w:t>
+        <w:t>Derecho de la seguridad social - Alberto Briceno Ruiz.pdf — p. 240 — similitud 0.1075</w:t>
       </w:r>
     </w:p>
     <w:p>
@@ -611,7 +707,7 @@
         <w:ind w:left="360"/>
       </w:pPr>
       <w:r>
-        <w:t>“Esta visión seria coherente con la de Marcel Simón, uno de los máximos especialistas en este período. Él entiende que los primeros conflictos de as- pecto intercultural no se habrían dado entre cristianos de origen israelita y cristianos de origen pagano, sino entre cristianos de origen israelita palestino, con lengua materna hebrea o aramea, y cristianos de origen israelita pero he- lenístico, llegados de las comunidades de la diáspora y greco-parlantes358. Para los tiempos de Pablo de Tarse, empero, la presencia de conversos de origen gentil parece haber sido lo suficientemente importante como para qué se generasen las controversias acerca de la obligatoriedad de la circuncisión.”</w:t>
+        <w:t>“El segundo sistema (opting-out) implica una reforma a mayor plazo contenida en la LSS. Este sistema, conocido como reversión de cuotas, repre­ senta un mayor cambio estructural en el sistema del Seguro Social; intro­ duce la posibilidad de que los asegurados seleccionen al asegurador de salud y abre la puerta para una mayor expansión del seguro privado de salud y la previsión del cuidado de salud. El elemento central de la reforma de rever­ sión de cuotas es conceder el derecho a los asegurados del IMSS de revertir la cuota y quedar protegidos por una entidad privada.”</w:t>
       </w:r>
     </w:p>
     <w:p>
@@ -619,7 +715,7 @@
         <w:pStyle w:val="Heading3"/>
       </w:pPr>
       <w:r>
-        <w:t>Los derechos humanos en Mexico - Emilio Alvarez Icaza Longoria.pdf — p. 14 — similitud 0.0615</w:t>
+        <w:t>Derecho de la seguridad social - Alberto Briceno Ruiz.pdf — p. 109 — similitud 0.1062</w:t>
       </w:r>
     </w:p>
     <w:p>
@@ -627,7 +723,7 @@
         <w:ind w:left="360"/>
       </w:pPr>
       <w:r>
-        <w:t>“Por esto, consideraba las constituciones como el centro del sistema político, ya que debían fundarse sobre el interés común y la justicia para las y los ciudadanos. Así, las declaraciones estadounidense y francesa supusieron un hito fundamental en la historia de los derechos humanos, ya que pro- clamaron por vez primera los derechos del individuo y la libertad, igualdad y fraternidad de todos los seres humanos. Asimismo, afir- maron la separación de los poderes del Estado en Legislativo y Ejecu- tivo; esto es: la primacía del poder del pueblo y de sus representantes, y la subordinación del poder militar al poder civil.”</w:t>
+        <w:t>“También puede ser aprovechado con mucha ventaja el material estadounidense y canadiense del Seguro Privado, y su análisis en los Proceeding o f Casualty Actuarial Society. En ocasión de la clasificación debe ser fi­ jada también la unidad de tarifa, con base en el nuevo material.”</w:t>
       </w:r>
     </w:p>
     <w:p>
@@ -635,7 +731,7 @@
         <w:pStyle w:val="Heading3"/>
       </w:pPr>
       <w:r>
-        <w:t>Como se hicieron los Derechos H - Ricardo Rabinovich Berkman.pdf — p. 122 — similitud 0.0612</w:t>
+        <w:t>El derecho a la seguridad socia - Diana Beatriz Gonzalez Carvallo.pdf — p. 313 — similitud 0.1036</w:t>
       </w:r>
     </w:p>
     <w:p>
@@ -643,7 +739,7 @@
         <w:ind w:left="360"/>
       </w:pPr>
       <w:r>
-        <w:t>“Soy de tal clase social, tengo tales ingresos económicos, mi piel es de tal color, nací en un hogar de determinada religión, poseo esta inclinación sexual, sigo aquellas ideas políticas, padezco un defecto físico.,&gt; Así es que sugiere que la respuesta sólo podría surgir de un ejercicio mental Es decir, un procedimiento ficticio ¿Es ello un disparate? Todas las teorías pactistas, que plantean al contrato social como base de la estructura política y jurídica humana, parten de una ficción, que sus seguido- res saben perfectamente que lo es.”</w:t>
+        <w:t>“289 ¿Tragedias privadas? El derecho familiar como seguro social lo mismo hace el seguro de sobrevivientes del seguro social (una forma de seguro de vida público adquirido con los mismos impuestos sobre nómina que financian el más conocido programa de seguro por vejez y discapacidad de la seguridad social). Justo como en Wilson, esta distribución de riesgo también refleja otros ele- mentos del derecho.”</w:t>
       </w:r>
     </w:p>
     <w:p>
@@ -651,7 +747,7 @@
         <w:pStyle w:val="Heading3"/>
       </w:pPr>
       <w:r>
-        <w:t>Derechos humanos, teorias y doc - Luis Manuel Marcano Salazar.pdf — p. 34 — similitud 0.0598</w:t>
+        <w:t>Derecho de la seguridad social - Alberto Briceno Ruiz.pdf — p. 57 — similitud 0.0995</w:t>
       </w:r>
     </w:p>
     <w:p>
@@ -659,7 +755,7 @@
         <w:ind w:left="360"/>
       </w:pPr>
       <w:r>
-        <w:t>“Teorías y doctrinas Capitulo II Definición, evolución y trascendencia de los derechos humanos Se estima conveniente realizar un esbozo acerca de los derechos humanos; su definición, fundamento, historicidad, variables que los caracterizan clasificación; a fin de imbricarlos como prolegómenos hacia la concepción de los derechos humanos desde una perspectiva transgeneracional. “Si bien todos los derechos son «humanos», en cuanto sólo el hombre es sujeto de derecho, la evolución de las ciencias jurídicas ha dado lugar a una categoría de derechos denominada «humanos», también conocidos como derechos del hombre, derechos naturales, derechos innatos, derechos originarios, derechos...”</w:t>
+        <w:t>“Conformación de derechos 41 que debe ser suficiente para cubrir íntegramente a aquél y permitir además una utilidad, por lo que la cobertura constituiría un factor del costo recupera­ ble por medio del precio o, lo que es lo mismo en última instancia, pagada por el consumidor: de esta manera, el seguro grava el consumo. Seguro de vida El seguro de vida con capitales pagaderos a la muerte del asegurado comen­ zó en 1762, organizado por la Equitable Society for Assurance on Uves and Survivorship.”</w:t>
       </w:r>
     </w:p>
     <w:p>
@@ -667,7 +763,7 @@
         <w:pStyle w:val="Heading3"/>
       </w:pPr>
       <w:r>
-        <w:t>Derechos humanos, teorias y doc - Luis Manuel Marcano Salazar.pdf — p. 128 — similitud 0.0591</w:t>
+        <w:t>Derecho de la seguridad social - Alberto Briceno Ruiz.pdf — p. 285 — similitud 0.0991</w:t>
       </w:r>
     </w:p>
     <w:p>
@@ -675,7 +771,7 @@
         <w:ind w:left="360"/>
       </w:pPr>
       <w:r>
-        <w:t>“4.- Reconocieron la realidad de que la sociedad global tiene los medios y está dotada de los recursos para recoger los retos de la erradicación de la pobreza y el logro del desarrollo sostenible a que hace frente toda la humanidad. Unidos se tomarán las medidas adicionales para velar por que estos recursos disponibles sean aprovechados en beneficio de toda la humanidad.”</w:t>
+        <w:t>“Cuando pretende conocer su situación o interponer algún recurso, la confusión de las leyes le impide un fácil acceso. A pesar de la evidencia de las violaciones, sin modificar la Constitución para adecuarla al nuevo sistema, finalmente se estructuró el de capitalización individual, donde las financieras privadas participan en el Seguro Social. El trabajador asume la responsabilidad de fondear su pensión, corre los riesgos derivados del mercado de valores y libera a!”</w:t>
       </w:r>
     </w:p>
     <w:p>
@@ -683,7 +779,7 @@
         <w:pStyle w:val="Heading3"/>
       </w:pPr>
       <w:r>
-        <w:t>Como se hicieron los Derechos H - Ricardo Rabinovich Berkman.pdf — p. 14 — similitud 0.0586</w:t>
+        <w:t>Derecho de la seguridad social - Alberto Briceno Ruiz.pdf — p. 51 — similitud 0.0990</w:t>
       </w:r>
     </w:p>
     <w:p>
@@ -691,7 +787,7 @@
         <w:ind w:left="360"/>
       </w:pPr>
       <w:r>
-        <w:t>“22 FLÁVIA PÍOVESAN Luego el capítulo VI transita hacia el análisis del poder legítimo y sus límites. La travesía histórica tiene en el capítulo VII: el estudio de la Grecia Antigua, en el capítulo VIII el estudio de Roma antigua y en el capítulo IX el estudio de la Edad Media.”</w:t>
+        <w:t>“Son características del aseguramiento la obligatoriedad en cuanto a los esclavos mayores de 10 años, con valor fijado por su dueño en el momento de iniciarse el seguro por inscripción en el registro, pagando por los asegurados una prima anual por semestres, proporcional a la estimación registrada. En caso de siniestro; esto es, si ocurría el riesgo previsto de la fuga del esclavo y no se le restituía al poder de su dueño en el plazo de dos meses, el seguro pagaba al propie­ tario el importe del valor asegurado. Es el primer ejemplo de un seguro a prima fija, que se aplicará inmediatamente al seguro de mar.”</w:t>
       </w:r>
     </w:p>
     <w:p>
@@ -699,7 +795,7 @@
         <w:pStyle w:val="Heading3"/>
       </w:pPr>
       <w:r>
-        <w:t>Derechos humanos, teorias y doc - Luis Manuel Marcano Salazar.pdf — p. 127 — similitud 0.0546</w:t>
+        <w:t>Derecho de la seguridad social - Alberto Briceno Ruiz.pdf — p. 66 — similitud 0.0980</w:t>
       </w:r>
     </w:p>
     <w:p>
@@ -707,7 +803,7 @@
         <w:ind w:left="360"/>
       </w:pPr>
       <w:r>
-        <w:t>“Pero los beneficios y costos de la globalización no se distribuyen de forma pareja y a los países en desarrollo les resulta especialmente difícil responder a este reto. 5.- Se corre el riesgo de que estas disparidades mundiales se vuelvan permanentes y, si no se actúa de manera que se cambie radicalmente la vida de los pobres del mundo pueden perder la fe en sus representantes y en los sistemas democráticos con los cuales se está comprometido, y empezar a sentir que sus representantes vienen a ser sólo metal que resuena o címbalo que retiñe.”</w:t>
+        <w:t>“La Ley del 5 de julio de 1934 reorganiza la administración de los seguros sociales, autorizando al gobierno para dictar las disposiciones pertinentes. El seguro social en Inglaterra Las causas que originan el establecimiento del seguro social en Inglaterra son diversas: van de la atención a los pobres, a la Revolución Industrial y a los movimientos sociales que no se atrevieron a alterar sus estructuras. Las leyes de pobres, los movimientos cartistas, el aislamiento de la gran isla y el crecimiento de las fábricas, configuran un sistema de indiscutible efectividad, muy distinto del alemán.”</w:t>
       </w:r>
     </w:p>
     <w:p>
@@ -715,7 +811,7 @@
         <w:pStyle w:val="Heading3"/>
       </w:pPr>
       <w:r>
-        <w:t>Como se hicieron los Derechos H - Ricardo Rabinovich Berkman.pdf — p. 174 — similitud 0.0537</w:t>
+        <w:t>Derecho de la seguridad social - Alberto Briceno Ruiz.pdf — p. 118 — similitud 0.0977</w:t>
       </w:r>
     </w:p>
     <w:p>
@@ -723,7 +819,7 @@
         <w:ind w:left="360"/>
       </w:pPr>
       <w:r>
-        <w:t>“Los dos aspectos de este episodio que resultan relevantes para nuestro es- tudio son: a) Los alegatos de Humbaba en defensa de su vida, que resultan, en definitiva, las primeras exposiciones en pro de un prisionero de guerra que tenemos; b) La posición de los dioses frente a la muerte de Humbaba, desar- mado y sometido a la voluntad de sus captores.”</w:t>
+        <w:t>“Las leyes del Seguro Social corresponden al patrón 70%, al trabajador 25% y al Gobierno Federal 5%. En cuanto a las cuotas netas, corresponde al patrón 38.5%, al trabajador 32% y al Gobierno Federal 29.5%; “las empresas que contratan personal con salarios superiores a 10 salarios mínimos critican el hecho de que a partir de este salario podría resultarles conveniente hacerse cargo del seguro médico o con­ tratar el servicio de un seguro privado en lugar del IMSS” .6 Los esquemas modificados, donde se ubica a los asegurados del régimen voluntario, campesinos, no asalariados, cañeros, tabacaleros, trabajadores do­ mésticos, representan 17% de los derechohabientes.”</w:t>
       </w:r>
     </w:p>
     <w:p>
@@ -731,7 +827,7 @@
         <w:pStyle w:val="Heading3"/>
       </w:pPr>
       <w:r>
-        <w:t>Derechos humanos, teorias y doc - Luis Manuel Marcano Salazar.pdf — p. 141 — similitud 0.0498</w:t>
+        <w:t>El derecho a la seguridad socia - Diana Beatriz Gonzalez Carvallo.pdf — p. 280 — similitud 0.0976</w:t>
       </w:r>
     </w:p>
     <w:p>
@@ -739,7 +835,7 @@
         <w:ind w:left="360"/>
       </w:pPr>
       <w:r>
-        <w:t>“En términos económicos, los gases invernadero son una externalidad: quienes producen emisiones de gases invernadero están contribuyendo al cambio climático y, en consecuencia, imponiendo costes al mundo y a las futuras generaciones, sin que ellos tengan que hacer frente plenamente a las consecuencias de sus acciones. La asignación de un precio apropiado al carbono (explícitamente), mediante impuestos al comercio, o (implícitamente) mediante reglamentación significa que la gente tiene que hacer frente al entero coste social de sus acciones. b.- El segundo elemento de la política sobre el cambio climático es la política tecnológica.”</w:t>
+        <w:t>“256 El derecho a la seguridad social y las responsabilidades de cuidado Por tradición jurídica, el derecho familiar forma parte del derecho privado: regula las relaciones entre individuos, en lugar de las relaciones entre indivi- duos y el Estado.2 Desde este punto de vista, el derecho familiar, como otras formas de derecho privado, existe principalmente para promover el orden en el ámbito privado. Desde esta perspectiva, el derecho familiar debería implementar las intenciones de los individuos —y no debería redistribuir los riesgos y los recursos de conformidad con algún ideal público—.”</w:t>
       </w:r>
     </w:p>
     <w:p>
@@ -747,7 +843,7 @@
         <w:pStyle w:val="Heading3"/>
       </w:pPr>
       <w:r>
-        <w:t>Derechos humanos, teorias y doc - Luis Manuel Marcano Salazar.pdf — p. 23 — similitud 0.0496</w:t>
+        <w:t>El derecho a la seguridad socia - Diana Beatriz Gonzalez Carvallo.pdf — p. 280 — similitud 0.0972</w:t>
       </w:r>
     </w:p>
     <w:p>
@@ -755,7 +851,7 @@
         <w:ind w:left="360"/>
       </w:pPr>
       <w:r>
-        <w:t>“Luis Manuel Marcano Salazar Por consiguiente, a pesar de las leyes de naturaleza (que cada uno observa cuando tiene la voluntad de observarlas, cuando puede hacerlo de modo seguro) si no se ha instituido o no es suficientemente grande para nuestra seguridad, cada uno se fiará tan sólo, y podrá hacerlo legalmente, sobre su propia fuerza y maña, para protegerse contra los demás hombres.”</w:t>
+        <w:t>“El derecho fami- liar es más que sólo un mecanismo que sirve para implementar preferencias privadas y para resolver disputas cuando el orden en el ámbito privado se rompe. Más bien, el derecho privado forma parte de un sistema más amplio de derecho público —un sistema de seguridad social que distribuye los riesgos que implican algunos eventos en la vida de las personas, tales como las discapacidades, los rompimientos familiares, las enfermedades mentales, 2  En general, véase Weinrib, Ernest J., The Idea of Private Law, 1995 (que describe al derecho privado como “conect[ando] dos partes particulares a través del fenómeno de la responsabilidad jurídica”).”</w:t>
       </w:r>
     </w:p>
     <w:p>
@@ -763,7 +859,7 @@
         <w:pStyle w:val="Heading3"/>
       </w:pPr>
       <w:r>
-        <w:t>Como se hicieron los Derechos H - Ricardo Rabinovich Berkman.pdf — p. 12 — similitud 0.0494</w:t>
+        <w:t>Ley del Seguro Social - Camara de Diputados del H. Cong.pdf — p. 132 — similitud 0.0953</w:t>
       </w:r>
     </w:p>
     <w:p>
@@ -771,7 +867,7 @@
         <w:ind w:left="360"/>
       </w:pPr>
       <w:r>
-        <w:t>“20 FLÁVIA PIOVESAN Já o capítulo VI transita para a análise do poder legítimo e seus limites. A travessia histórica tem no capítulo VII o estudó da Grécia Antiga, no capítulo IX o estudo de Roma antiga e no capítulo IX o estudo da Idade Media. Por ñm, o capítulo X trata do surgimento do antissemítismo e da gradativa composigáo de um quadro de graves violagoes a direitos pautado na intolerancia.”</w:t>
+        <w:t>“TRANSITORIOS PRIMERO.- El presente Decreto entrará en vigor al día siguiente de su publicación en el Diario Oficial de la Federación, con excepción de lo dispuesto por el artículo 168, fracción IV, de la Ley del Seguro Social que se reforma, el cual entrará en vigor a partir del bimestre de cotización siguiente a su publicación. SEGUNDO.- Los bimestres y semanas de cotización de los trabajadores anteriores a la fecha de entrada en vigor del presente Decreto, así como la antigüedad de su cuenta individual, deberán ser reconocidos para efecto del cálculo de los plazos a que se refiere el artículo 191, fracción II, de la Ley del Seguro Social que se reforma.”</w:t>
       </w:r>
     </w:p>
     <w:p>
@@ -779,7 +875,7 @@
         <w:pStyle w:val="Heading3"/>
       </w:pPr>
       <w:r>
-        <w:t>Como se hicieron los Derechos H - Ricardo Rabinovich Berkman.pdf — p. 68 — similitud 0.0490</w:t>
+        <w:t>Derecho de la seguridad social - Alberto Briceno Ruiz.pdf — p. 301 — similitud 0.0936</w:t>
       </w:r>
     </w:p>
     <w:p>
@@ -787,71 +883,7 @@
         <w:ind w:left="360"/>
       </w:pPr>
       <w:r>
-        <w:t>“m Esta evolución del franquismo, así com o la del salazarísmo en Portugal ponen en evidencia la posibilidad de ese tipo de regímenes de coexistir y aliarse con el capitalismo, cosa que se vislumbra- ra ya desde un comienzo con el apoyo estadounidense al advenimiento de Mussolini y de Hrtfer, y plantean hasta qué punto el bombardeo de Pearl Harbor, al obligar a los Estados Unidos a entrar en una guerra que, hasta entonces, venía cuidadosamente evitando, cambió eí destino del mundo.”</w:t>
-      </w:r>
-    </w:p>
-    <w:p>
-      <w:pPr>
-        <w:pStyle w:val="Heading3"/>
-      </w:pPr>
-      <w:r>
-        <w:t>Los derechos humanos en Mexico - Emilio Alvarez Icaza Longoria.pdf — p. 48 — similitud 0.0488</w:t>
-      </w:r>
-    </w:p>
-    <w:p>
-      <w:pPr>
-        <w:ind w:left="360"/>
-      </w:pPr>
-      <w:r>
-        <w:t>“Antecedentes organizativos Algunas iniciativas de naturaleza similar durante el siglo xx se muestran en el siguiente cuadro: Cuadro 3. Primeras instituciones defensoras de derechos Año Institución 1975 Procuraduría Federal del Consumidor 1979 Dirección para la Defensa de los Derechos Humanos de Nuevo León 1983 Procuraduría de Vecinos de la Ciudad de Colima 1985 Defensoría de los Derechos Universitarios de la Universidad Nacional Autónoma de México 1986 Procuraduría para la Defensa del Indígena del Estado de Oaxaca”</w:t>
-      </w:r>
-    </w:p>
-    <w:p>
-      <w:pPr>
-        <w:pStyle w:val="Heading3"/>
-      </w:pPr>
-      <w:r>
-        <w:t>Como se hicieron los Derechos H - Ricardo Rabinovich Berkman.pdf — p. 82 — similitud 0.0487</w:t>
-      </w:r>
-    </w:p>
-    <w:p>
-      <w:pPr>
-        <w:ind w:left="360"/>
-      </w:pPr>
-      <w:r>
-        <w:t>“Esto no implicaría ninguna novedad. Posibilidades futuras, por lo tanto hi- potéticas , eventuales, son objeto de construcciones jurídicas desde tiempo atrás. Por ejemplo, en materia civil, las "indemnizaciones de chance".”</w:t>
-      </w:r>
-    </w:p>
-    <w:p>
-      <w:pPr>
-        <w:pStyle w:val="Heading3"/>
-      </w:pPr>
-      <w:r>
-        <w:t>Derechos humanos, teorias y doc - Luis Manuel Marcano Salazar.pdf — p. 16 — similitud 0.0458</w:t>
-      </w:r>
-    </w:p>
-    <w:p>
-      <w:pPr>
-        <w:ind w:left="360"/>
-      </w:pPr>
-      <w:r>
-        <w:t>“Esos eventos internacionales generaron cambios constitucionales; así, en Venezuela a partir de la Constitución de 1999 en su Capítulo IX se contemplan los derechos ambientales en los artículos 127 al 129, como un derecho de la persona susceptible de protección y a su vez un deber compartido con el Estado que imperiosamente debe protegerlo e imponer la conservación del equilibrio ecológico para las generaciones futuras, en el artículo 127 se consagra específicamente: “Es un derecho y un deber de cada generación proteger y mantener el ambiente en beneficio de sí misma y del mundo futuro.Toda persona tiene derecho individual y colectivamente a disfrutar de una vida y de un ambiente seguro...”</w:t>
-      </w:r>
-    </w:p>
-    <w:p>
-      <w:pPr>
-        <w:pStyle w:val="Heading3"/>
-      </w:pPr>
-      <w:r>
-        <w:t>Derechos humanos, teorias y doc - Luis Manuel Marcano Salazar.pdf — p. 54 — similitud 0.0436</w:t>
-      </w:r>
-    </w:p>
-    <w:p>
-      <w:pPr>
-        <w:ind w:left="360"/>
-      </w:pPr>
-      <w:r>
-        <w:t>“En su obra supra citada Jellinek argumenta contundentemente, realizando una apología encomiable en cuanto al valor trascendental de esta declaración, estima que: “La influencia de la Revolución americana en la francesa es notoria; ambos sucesos son ciertamente, momentos de una misma evolución política” (p.8), defendiendo sus principios contra los detractores del momento, de esta manera: 53”</w:t>
+        <w:t>“Parte de esa contribución (6.5% del s.b.c.), cuando se integra a las cuentas individuales, varía su naturaleza tanto al ser propiedad del trabajador como al estar administrada por sociedades anónimas de capital variable mediante un contrato mercantil; entonces la contribución se trans­ forma en acciones mercantiles, cuya suerte dependerá del mercado de valores. La Ley General de Sociedades Mercantiles, la LSAR y las reglas de la Gonsar controlan estas operaciones, con lo que predomina el Derecho Mercantil, par­ te del Derecho Privado, sobre la teoría de las contribuciones fiscales de la cuo­ ta y la aplicación de los principios laborales que derivan de la Constitución.”</w:t>
       </w:r>
     </w:p>
     <w:p>
@@ -862,7 +894,7 @@
         <w:t xml:space="preserve">Observación automática: </w:t>
       </w:r>
       <w:r>
-        <w:t>La ficha presenta coincidencias débiles; se recomienda validar manualmente las citas. Se agruparon referencias de múltiples fuentes para enriquecer el concepto. Hay 25 referencia(s) de baja similitud que podrían introducir ruido.</w:t>
+        <w:t>La ficha presenta coincidencias útiles, pero conviene revisar la pertinencia de cada cita. Se agruparon referencias de múltiples fuentes para enriquecer el concepto.</w:t>
       </w:r>
     </w:p>
     <w:p>
@@ -870,7 +902,7 @@
         <w:pStyle w:val="Heading2"/>
       </w:pPr>
       <w:r>
-        <w:t>Ficha 03. Seguridad social</w:t>
+        <w:t>Ficha 03. seguridad social: una aproximación a sus alcances</w:t>
       </w:r>
     </w:p>
     <w:p>
@@ -881,7 +913,7 @@
         <w:t xml:space="preserve">Fuentes: </w:t>
       </w:r>
       <w:r>
-        <w:t>Derechos humanos, teorias y doc - Luis Manuel Marcano Salazar.pdf; Los derechos humanos en Mexico - Emilio Alvarez Icaza Longoria.pdf</w:t>
+        <w:t>Curso de derechos humanos - Ana Maria Ibarra Olguin.pdf; Derecho de la seguridad social - Alberto Briceno Ruiz.pdf; Derecho humano a la seguridad s - Jose Luis Belmont Lugo.pdf; El derecho a la seguridad socia - Diana Beatriz Gonzalez Carvallo.pdf</w:t>
       </w:r>
     </w:p>
     <w:p>
@@ -892,7 +924,7 @@
         <w:t xml:space="preserve">Ubicaciones: </w:t>
       </w:r>
       <w:r>
-        <w:t>Derechos humanos, teorias y doc - Luis Manuel Marcano Salazar.pdf, p. 113; Derechos humanos, teorias y doc - Luis Manuel Marcano Salazar.pdf, p. 118; Derechos humanos, teorias y doc - Luis Manuel Marcano Salazar.pdf, p. 29; Derechos humanos, teorias y doc - Luis Manuel Marcano Salazar.pdf, p. 41; Derechos humanos, teorias y doc - Luis Manuel Marcano Salazar.pdf, p. 58; Derechos humanos, teorias y doc - Luis Manuel Marcano Salazar.pdf, p. 66; Derechos humanos, teorias y doc - Luis Manuel Marcano Salazar.pdf, p. 75; Derechos humanos, teorias y doc - Luis Manuel Marcano Salazar.pdf, p. 82; Derechos humanos, teorias y doc - Luis Manuel Marcano Salazar.pdf, p. 83; Derechos humanos, teorias y doc - Luis Manuel Marcano Salazar.pdf, p. 90; Los derechos humanos en Mexico - Emilio Alvarez Icaza Longoria.pdf, p. 15; Los derechos humanos en Mexico - Emilio Alvarez Icaza Longoria.pdf, p. 27; Los derechos humanos en Mexico - Emilio Alvarez Icaza Longoria.pdf, p. 28; Los derechos humanos en Mexico - Emilio Alvarez Icaza Longoria.pdf, p. 29; Los derechos humanos en Mexico - Emilio Alvarez Icaza Longoria.pdf, p. 47; Los derechos humanos en Mexico - Emilio Alvarez Icaza Longoria.pdf, p. 53; Los derechos humanos en Mexico - Emilio Alvarez Icaza Longoria.pdf, p. 56; Los derechos humanos en Mexico - Emilio Alvarez Icaza Longoria.pdf, p. 61</w:t>
+        <w:t>Curso de derechos humanos - Ana Maria Ibarra Olguin.pdf, p. 693; Curso de derechos humanos - Ana Maria Ibarra Olguin.pdf, p. 894; Curso de derechos humanos - Ana Maria Ibarra Olguin.pdf, p. 901; Curso de derechos humanos - Ana Maria Ibarra Olguin.pdf, p. 909; Curso de derechos humanos - Ana Maria Ibarra Olguin.pdf, p. 913; Curso de derechos humanos - Ana Maria Ibarra Olguin.pdf, p. 917; Curso de derechos humanos - Ana Maria Ibarra Olguin.pdf, p. 922; Derecho de la seguridad social - Alberto Briceno Ruiz.pdf, p. 116; Derecho de la seguridad social - Alberto Briceno Ruiz.pdf, p. 24; Derecho de la seguridad social - Alberto Briceno Ruiz.pdf, p. 27; Derecho de la seguridad social - Alberto Briceno Ruiz.pdf, p. 28; Derecho de la seguridad social - Alberto Briceno Ruiz.pdf, p. 69; Derecho de la seguridad social - Alberto Briceno Ruiz.pdf, p. 71; Derecho humano a la seguridad s - Jose Luis Belmont Lugo.pdf, p. 3; El derecho a la seguridad socia - Diana Beatriz Gonzalez Carvallo.pdf, p. 160; El derecho a la seguridad socia - Diana Beatriz Gonzalez Carvallo.pdf, p. 168; El derecho a la seguridad socia - Diana Beatriz Gonzalez Carvallo.pdf, p. 240; El derecho a la seguridad socia - Diana Beatriz Gonzalez Carvallo.pdf, p. 252; El derecho a la seguridad socia - Diana Beatriz Gonzalez Carvallo.pdf, p. 266; El derecho a la seguridad socia - Diana Beatriz Gonzalez Carvallo.pdf, p. 31; El derecho a la seguridad socia - Diana Beatriz Gonzalez Carvallo.pdf, p. 342; El derecho a la seguridad socia - Diana Beatriz Gonzalez Carvallo.pdf, p. 348; El derecho a la seguridad socia - Diana Beatriz Gonzalez Carvallo.pdf, p. 48; El derecho a la seguridad socia - Diana Beatriz Gonzalez Carvallo.pdf, p. 66; El derecho a la seguridad socia - Diana Beatriz Gonzalez Carvallo.pdf, p. 74; El derecho a la seguridad socia - Diana Beatriz Gonzalez Carvallo.pdf, p. 87</w:t>
       </w:r>
     </w:p>
     <w:p>
@@ -900,7 +932,7 @@
         <w:pStyle w:val="Heading3"/>
       </w:pPr>
       <w:r>
-        <w:t>Los derechos humanos en Mexico - Emilio Alvarez Icaza Longoria.pdf — p. 28 — similitud 0.3263</w:t>
+        <w:t>El derecho a la seguridad socia - Diana Beatriz Gonzalez Carvallo.pdf — p. 348 — similitud 0.2053</w:t>
       </w:r>
     </w:p>
     <w:p>
@@ -908,7 +940,7 @@
         <w:ind w:left="360"/>
       </w:pPr>
       <w:r>
-        <w:t>“27 Defensa, protección y promoción de los derechos humanos Marco legal internacional: De esta manera, la onu ha sido fuente de diversos instrumentos de defensa y protección de los derechos humanos; sin embargo, por servir de base a la codificación del derecho internacional son trascendentales el Pacto Internacional de Derechos Civiles y Políti- cos (pidcp) y sus dos protocolos facultativos (el Protocolo Faculta- tivo del Pacto Internacional de Derechos Civiles y Políticos, del 16 diciembre de 1966 —que faculta al Comité de Derechos Humanos para recibir y considerar comunicaciones de individuos que aleguen ser víctimas de violaciones de cualquiera de los derechos enunciados en el Pacto—, y...”</w:t>
+        <w:t>“En su Observación General núm. 19 sobre el derecho a la seguridad social, el Comité ha indicado que dentro de los elementos esenciales del derecho a la seguridad se incluye “el derecho a obtener y mantener prestaciones socia- les, ya sea en efectivo o en especie, sin discriminación, con el fin de obtener protección, en particular contra: a) la falta de ingresos procedentes del tra- bajo debido a enfermedad, invalidez, maternidad, accidente laboral, vejez o muerte de un familiar; b) gastos excesivos de atención de salud; c) apoyo familiar insuficiente, en particular para los hijos y los familiares a cargo”.12”</w:t>
       </w:r>
     </w:p>
     <w:p>
@@ -916,7 +948,7 @@
         <w:pStyle w:val="Heading3"/>
       </w:pPr>
       <w:r>
-        <w:t>Los derechos humanos en Mexico - Emilio Alvarez Icaza Longoria.pdf — p. 53 — similitud 0.2842</w:t>
+        <w:t>Derecho de la seguridad social - Alberto Briceno Ruiz.pdf — p. 24 — similitud 0.1880</w:t>
       </w:r>
     </w:p>
     <w:p>
@@ -924,7 +956,7 @@
         <w:ind w:left="360"/>
       </w:pPr>
       <w:r>
-        <w:t>“Este instrumento hace constar los preceptos de igualdad a través de los valores, conceptos y contenidos. A raíz de la proclamación de la declaración se han ido aprobando diversos instrumentos complemen- tarios para la defensa y promoción de los derechos humanos, como son: el Pacto Internacional de los Derechos Civiles y Políticos, el Pacto Internacional de los Derechos Económicos, Sociales y Culturales y la Convención Americana sobre Derechos Humanos, entre otros.”</w:t>
+        <w:t>“La protección supone un riesgo y éste la necesidad de atender una con­ tingencia. Así como se ha visto la conveniencia de precisar el concepto de seguridad social, existe la preocupación de que la denominación de seguro no comprenda la trascendencia de esta disciplina. Los pocos autores y el reducido número de maestros en esta materia no hemos unificado criterios en cuanto al concepto de seguridad social.”</w:t>
       </w:r>
     </w:p>
     <w:p>
@@ -932,7 +964,7 @@
         <w:pStyle w:val="Heading3"/>
       </w:pPr>
       <w:r>
-        <w:t>Derechos humanos, teorias y doc - Luis Manuel Marcano Salazar.pdf — p. 41 — similitud 0.2808</w:t>
+        <w:t>El derecho a la seguridad socia - Diana Beatriz Gonzalez Carvallo.pdf — p. 168 — similitud 0.1831</w:t>
       </w:r>
     </w:p>
     <w:p>
@@ -940,7 +972,7 @@
         <w:ind w:left="360"/>
       </w:pPr>
       <w:r>
-        <w:t>“Artículo 1: Todos los seres humanos nacen libres e iguales en dignidad y derechos y, dotados, como están de razón y conciencia, deben comportarse fraternamente los unos con los otros. En la misma dirección posteriormente, el párrafo primero (común) de los Preámbulos del Pacto Internacional de Derechos Económicos, Sociales y Culturales y del Pacto Internacional de Derechos Civiles y Políticos, expresa: (…) conforme a los principios enunciados en la Carta de las Naciones Unidas, la libertad, la justicia y la paz en el mundo tienen por base el reconocimiento de la dignidad inherente a todos los miembros de la familia humana y de sus derechos iguales e inalienables”.”</w:t>
+        <w:t>“Se establece que por su carácter redistributivo, el derecho a la seguridad social es un factor fundamental de inclusión y cohesión social, así como para la reducción de la pobreza. En la Observación general 19, el Comité de Derechos Económicos, Sociales y Culturales (DESC), la ONU establece las obligaciones de los Estados en cuanto a respetar, proteger y garantizar el derecho a la seguridad social.”</w:t>
       </w:r>
     </w:p>
     <w:p>
@@ -948,7 +980,7 @@
         <w:pStyle w:val="Heading3"/>
       </w:pPr>
       <w:r>
-        <w:t>Derechos humanos, teorias y doc - Luis Manuel Marcano Salazar.pdf — p. 66 — similitud 0.2282</w:t>
+        <w:t>Derecho humano a la seguridad s - Jose Luis Belmont Lugo.pdf — p. 3 — similitud 0.1822</w:t>
       </w:r>
     </w:p>
     <w:p>
@@ -956,7 +988,7 @@
         <w:ind w:left="360"/>
       </w:pPr>
       <w:r>
-        <w:t>“Derechos humanos. Teorías y doctrinas en 1951 elaborar dos instrumentos que tipificaran los derechos civiles y políticos en un pacto y los derechos económicos, sociales y culturales en otro pacto. Existiendo, para aquel entonces una fuerte corriente doctrinaria que estimaba la reivindicación de los derechos civiles y políticos y su aplicación debía ser de forma inmediata, a diferencia de los derechos económicos, sociales y culturales debían ser implementados de manera progresiva; es decir se entró en una superada distinción de considerar que los derechos constitucionales son unos operativos y otros programáticos.”</w:t>
+        <w:t>“5 1. Los derechos humanos y el derecho humano a la seguridad social . . . . . . . . . . . . . . . . . . . 5 2.”</w:t>
       </w:r>
     </w:p>
     <w:p>
@@ -964,7 +996,7 @@
         <w:pStyle w:val="Heading3"/>
       </w:pPr>
       <w:r>
-        <w:t>Derechos humanos, teorias y doc - Luis Manuel Marcano Salazar.pdf — p. 82 — similitud 0.1997</w:t>
+        <w:t>Derecho humano a la seguridad s - Jose Luis Belmont Lugo.pdf — p. 3 — similitud 0.1755</w:t>
       </w:r>
     </w:p>
     <w:p>
@@ -972,7 +1004,7 @@
         <w:ind w:left="360"/>
       </w:pPr>
       <w:r>
-        <w:t>“forma enmendada por el Protocolo N º 11 • Protocolo N º 5 de la Convención para la Protección de los Derechos Humanos y las Libertades Fundamentales, se modifican los artículos 22 y 40 de la Convención • Convenio Europeo para la adopción de niños • Convenio europeo sobre la repatriación de los menores • Convenio europeo sobre inmunidad de los Estados • Protocolo adicional al Convenio Europeo para la inmunidad de los Estado • Convenio Europeo para la Seguridad Social • Acuerdo Complementario para la Aplicación de la Convención Europea para la Seguridad Social • Convenio Europeo sobre la no Aplicabilidad de las Limitaciones legales a los crímenes de lesa humanidad y crímenes de guerra •...”</w:t>
+        <w:t>“11 3. Fuente internacional del derecho a la seguridad social . . . . . . . . . . . . . . . . . . . 13 4.”</w:t>
       </w:r>
     </w:p>
     <w:p>
@@ -980,7 +1012,7 @@
         <w:pStyle w:val="Heading3"/>
       </w:pPr>
       <w:r>
-        <w:t>Derechos humanos, teorias y doc - Luis Manuel Marcano Salazar.pdf — p. 83 — similitud 0.1694</w:t>
+        <w:t>Derecho de la seguridad social - Alberto Briceno Ruiz.pdf — p. 28 — similitud 0.1642</w:t>
       </w:r>
     </w:p>
     <w:p>
@@ -988,7 +1020,7 @@
         <w:ind w:left="360"/>
       </w:pPr>
       <w:r>
-        <w:t>“a la Prevención de la Tortura y los Tratos Inhumanos o Degradantes • Protocolo del Convenio Europeo de Seguridad Social • Convenio Marco para la Protección de las Minorías Nacionales • Convenio Europeo sobre el Ejercicio de los Derechos del Niño • Sexto Protocolo del Acuerdo General sobre Privilegios e Inmunidades del Consejo de Europa • Carta Social Europea • Convenio Europeo sobre la Nacionalidad • Protocolo adicional al Convenio sobre traslado de personas condenadas • Protocolo Adicional a la Convención para la Protección de los Derechos Humanos y la Dignidad del Ser Humano con respecto a las aplicaciones de la Biología y la Medicina, sobre la prohibición de la clonación de seres humanos...”</w:t>
+        <w:t>“Me atrevería a sostener que se remonta al momento mismo de la creación, en que el universo y los sistemas de planetas son producto de una armonía de fuerzas. El seguro social nació a fines del siglo XIX por la acción decidida de los gobiernos europeos, casi al tiempo que se estructura el derecho del trabajo, sin contar con su dinámica. Las publicaciones al respecto son escasas y su vinculación con la legislación laboral persiste hasta nuestros días.”</w:t>
       </w:r>
     </w:p>
     <w:p>
@@ -996,7 +1028,7 @@
         <w:pStyle w:val="Heading3"/>
       </w:pPr>
       <w:r>
-        <w:t>Derechos humanos, teorias y doc - Luis Manuel Marcano Salazar.pdf — p. 90 — similitud 0.1614</w:t>
+        <w:t>Curso de derechos humanos - Ana Maria Ibarra Olguin.pdf — p. 901 — similitud 0.1604</w:t>
       </w:r>
     </w:p>
     <w:p>
@@ -1004,7 +1036,7 @@
         <w:ind w:left="360"/>
       </w:pPr>
       <w:r>
-        <w:t>“Asimismo, garantiza la libertad de religión y de conciencia (Artículo 8), de expresión (artículo 9), de asociación (artículo 10), el derecho de la propiedad (artículo 14), al trabajo y a un salario justo (artículo 15), a la salud (artículo 16), y a la educación (artículo 17). No contiene ninguna disposición que autorice la derogación de los derechos humanos en caso de situaciones excepcionales.”</w:t>
+        <w:t>“21 Ver Cecchini, Simone y Martínez, Rodrigo, Inclusive Social Protection…, op. cit. 22 Ver OHCHR-ONU, Observación general 19; Melik, Ö., El derecho a la seguridad social, op. cit.”</w:t>
       </w:r>
     </w:p>
     <w:p>
@@ -1012,7 +1044,7 @@
         <w:pStyle w:val="Heading3"/>
       </w:pPr>
       <w:r>
-        <w:t>Los derechos humanos en Mexico - Emilio Alvarez Icaza Longoria.pdf — p. 29 — similitud 0.1591</w:t>
+        <w:t>Curso de derechos humanos - Ana Maria Ibarra Olguin.pdf — p. 894 — similitud 0.1598</w:t>
       </w:r>
     </w:p>
     <w:p>
@@ -1020,7 +1052,7 @@
         <w:ind w:left="360"/>
       </w:pPr>
       <w:r>
-        <w:t>“28 Los derechos humanos en México 2) El derecho a la seguridad social, a un nivel de vida adecuado y a los niveles más altos posibles de bienestar físico y mental. 3) El derecho a la educación y el disfrute de los beneficios de la libertad cultural y el progreso científico.”</w:t>
+        <w:t>“En términos de la Observación General 19 del Comité de Derechos Económicos, Sociales y Cultu- rales de la ONU sobre el derecho a la seguridad social, éste incluye el derecho a obtener y conservar prestaciones en efectivo o en especie que permitan afrontar de manera adecuada situaciones como la pérdida del ingreso individual o familiar debido a enfermedad, discapacidad, accidente de trabajo, maternidad, vejez, entre otras.2 En suma, el derecho a la seguridad social establece la protección suficiente de las personas y el mantenimiento de estándares de vida adecuados contra ries- gos e imprevistos sociales particularmente graves.3”</w:t>
       </w:r>
     </w:p>
     <w:p>
@@ -1028,7 +1060,7 @@
         <w:pStyle w:val="Heading3"/>
       </w:pPr>
       <w:r>
-        <w:t>Derechos humanos, teorias y doc - Luis Manuel Marcano Salazar.pdf — p. 113 — similitud 0.1469</w:t>
+        <w:t>Curso de derechos humanos - Ana Maria Ibarra Olguin.pdf — p. 922 — similitud 0.1586</w:t>
       </w:r>
     </w:p>
     <w:p>
@@ -1036,7 +1068,7 @@
         <w:ind w:left="360"/>
       </w:pPr>
       <w:r>
-        <w:t>“Luis Manuel Marcano Salazar el PIDCP y las Declaraciones (Universal y Americana) guardan silencio sobre la cuestión de saber cuándo hay que reconocer y proteger la vida. Se estima conveniente señalar algunos instrumentos internacionales que consagran el derecho a la vida 4.1.1.- Declaración Universal de Derechos Humanos Artículo 3 Todo individuo tiene derecho a la vida, a la libertad y a la seguridad de su persona. 4.1.2.- Pacto Internacional de Derechos Civiles y Políticos (PIDCP) Artículo 6 1.”</w:t>
+        <w:t>“Diana Beatriz González Carvallo 922 no es un obstáculo para el cumplimiento de los diversos servicios de seguridad social, entre estos prestaciones y guarderías.78 Los fallos sobre el servicio de guarderías como prestación de previsión so- cial integran el patrón de litigio (viii). En uno de ellos, sobre deducción de las prestaciones de previsión social, la Corte estableció que no es inconstitucional la norma que no considera a los aportes patronales a guarderías y previsión social como gastos deducibles de sus ingresos acumulables al momento de calcular el impuesto sobre la renta.”</w:t>
       </w:r>
     </w:p>
     <w:p>
@@ -1044,7 +1076,7 @@
         <w:pStyle w:val="Heading3"/>
       </w:pPr>
       <w:r>
-        <w:t>Los derechos humanos en Mexico - Emilio Alvarez Icaza Longoria.pdf — p. 27 — similitud 0.1316</w:t>
+        <w:t>El derecho a la seguridad socia - Diana Beatriz Gonzalez Carvallo.pdf — p. 342 — similitud 0.1579</w:t>
       </w:r>
     </w:p>
     <w:p>
@@ -1052,7 +1084,7 @@
         <w:ind w:left="360"/>
       </w:pPr>
       <w:r>
-        <w:t>“La Declaración Universal de los Derechos Humanos es el prin- cipal documento de la onu y la base jurídica del siglo xx en materia de derechos humanos. Fue aprobada y proclamada el 10 de diciem- bre de 1948 por la Asamblea General de las Naciones Unidas y, a través de sus 30 artículos, establece los derechos civiles y políticos, así como los económicos, sociales y culturales de que son titulares todas las personas.”</w:t>
+        <w:t>“Pautassi (2013) argumenta que seguridad social y protección social no pueden ser asumidas como sinónimos, dado que el primer concepto se relaciona a un paquete de prestaciones (establecidas, por ejemplo, en el Convenio 102 de la OIT) y a un papel fuerte del Estado en su provisión, regulación y financiamiento, mientras que el concepto de protección social se referiría a un modelo más restringido, en que las personas, las familias, las comunidades y la sociedad civil desem- peñan un papel más activo.”</w:t>
       </w:r>
     </w:p>
     <w:p>
@@ -1060,7 +1092,7 @@
         <w:pStyle w:val="Heading3"/>
       </w:pPr>
       <w:r>
-        <w:t>Derechos humanos, teorias y doc - Luis Manuel Marcano Salazar.pdf — p. 118 — similitud 0.1159</w:t>
+        <w:t>Derecho de la seguridad social - Alberto Briceno Ruiz.pdf — p. 71 — similitud 0.1529</w:t>
       </w:r>
     </w:p>
     <w:p>
@@ -1068,7 +1100,7 @@
         <w:ind w:left="360"/>
       </w:pPr>
       <w:r>
-        <w:t>“Son estas influencias las que van configurando a la sociedad, y que la ley y el contenido de justicia que debe tener quien la aplica, deben ir tomando en cuenta a fin de garantizar a los ciudadanos una calidad integral de vida, signada por el valor dignidad del ser humano. El Estado constituido hacia ese fin, es un Estado Social de Derecho y de Justicia, cuya meta no es primordialmente el engrandecimiento del Estado, sino el de la sociedad que lo conforma, con quien interactúa en la búsqueda de tal fin. (…) Como derechos cívicos, destinados a proteger la calidad de la vida, a ellos se les pueden resaltar varios caracteres. Uno, el 117”</w:t>
+        <w:t>“El acta de la OIT elaboró el convenio 102, relativo a la norma mínima de la seguridad social, en vigor a partir del 27 de abril de 1955.18 Este documento, regulador de los sistemas de seguridad social, contiene los apartados siguientes: Disposiciones generales, Asistencia médica, Prestaciones monetarias de enfer­ medad, Prestaciones de desempleo, Prestaciones de vejez, Prestaciones en caso de accidente del trabajo y de enfermedad profesional, Prestaciones familiares, Prestaciones de maternidad, Prestaciones de invalidez, Prestaciones de sobre­ vivientes, Cálculo de los pagos periódicos, Igualdad de trato a los residentes no nacionales, Disposiciones comunes, Disposiciones diversas...”</w:t>
       </w:r>
     </w:p>
     <w:p>
@@ -1076,7 +1108,7 @@
         <w:pStyle w:val="Heading3"/>
       </w:pPr>
       <w:r>
-        <w:t>Derechos humanos, teorias y doc - Luis Manuel Marcano Salazar.pdf — p. 58 — similitud 0.0906</w:t>
+        <w:t>Curso de derechos humanos - Ana Maria Ibarra Olguin.pdf — p. 917 — similitud 0.1483</w:t>
       </w:r>
     </w:p>
     <w:p>
@@ -1084,7 +1116,7 @@
         <w:ind w:left="360"/>
       </w:pPr>
       <w:r>
-        <w:t>“(…) sobre el trabajo, sobre el derecho de propiedad, sobre el principio de colaboración contrapuesto a la lucha de clases como medio fundamental para el cambio social, sobre el derecho de los débiles, sobre la dignidad de los pobres y sobre las obligaciones de los ricos, sobre el perfeccionamiento de la justicia por la caridad, sobre el derecho a tener asociaciones profesionales”.47 Las anteriores áreas serán tópicos esenciales sobre los cuales se desplegará con ahínco el compromiso de los patrocinadores modernos de los derechos humanos; de ellos se desglosarán otros; no sólo de forma individual o sino además para grupos vulnerables específicos, hasta llegar a los derechos...”</w:t>
+        <w:t>“El derecho a la seguridad social 917 Los fallos sobre pensión de viudez en el matrimonio55 son, aproximadamente, 70.56 Es posible identificar siete grandes escenarios constitucionales de litigio: (i) base pensional para el cálculo de los montos mensuales para la pensión de viudez; (ii) concurrencia de la pensión de viudez con otros beneficios; (iii) contratos co- lectivos de trabajo y constitucionalidad de las cláusulas sobre pensión de viudez; (iv) criterios diferenciados por género para acceder a la pensión de viudez; (v) término mínimo de duración del matrimonio; (vi) litigios sobre la titularidad de la pensión; y (vii) periodo de conservación de derechos.”</w:t>
       </w:r>
     </w:p>
     <w:p>
@@ -1092,7 +1124,7 @@
         <w:pStyle w:val="Heading3"/>
       </w:pPr>
       <w:r>
-        <w:t>Derechos humanos, teorias y doc - Luis Manuel Marcano Salazar.pdf — p. 29 — similitud 0.0806</w:t>
+        <w:t>El derecho a la seguridad socia - Diana Beatriz Gonzalez Carvallo.pdf — p. 48 — similitud 0.1462</w:t>
       </w:r>
     </w:p>
     <w:p>
@@ -1100,7 +1132,7 @@
         <w:ind w:left="360"/>
       </w:pPr>
       <w:r>
-        <w:t>“Luis Manuel Marcano Salazar K Larenz al diferenciar el sistema de Savigny y Puchta señala: (…) Puchta es el primero en presentar el Derecho como un sistema lógico jerarquizado, que presenta más bien la forma de una pirámide (…) Tal método racional, al que sólo la terminología «organicista» de Puchta nos permite emparentar con el historicismo, se pretende «genealógico» y aspira, en palabras del propio autor, a conocer las proposiciones del Derecho en su conexión sistemática «como recíprocamente condicionadas y derivadas unas de otras» (…) Con ello la Ciencia del Derecho (Jurisprudencia) tomaba carta de naturaleza como autentica fuente del Derecho”.29 Los juristas son los llamados a extraer...”</w:t>
+        <w:t>“156 ya citado sobre los trabajadores con respon- sabilidades familiares busca conciliar las obligaciones familiares y laborales, destacando la importancia de ejercer el derecho sin ser objeto de discrimina- ción,31 estableciendo que “la responsabilidad familiar no debe constituir de por sí una causa justificada para poner fin a la relación de trabajo” (artículo 8). La Conferencia Interamericana de Seguridad Social también reivindica sistemas de seguridad social universales en su Declaración 115, en el Marco de su 80 aniversario (2023). Afirma que el origen del derecho a la seguridad social debe ser la condición de persona y no la vinculación laboral.”</w:t>
       </w:r>
     </w:p>
     <w:p>
@@ -1108,7 +1140,7 @@
         <w:pStyle w:val="Heading3"/>
       </w:pPr>
       <w:r>
-        <w:t>Los derechos humanos en Mexico - Emilio Alvarez Icaza Longoria.pdf — p. 56 — similitud 0.0756</w:t>
+        <w:t>Derecho de la seguridad social - Alberto Briceno Ruiz.pdf — p. 27 — similitud 0.1441</w:t>
       </w:r>
     </w:p>
     <w:p>
@@ -1116,7 +1148,7 @@
         <w:ind w:left="360"/>
       </w:pPr>
       <w:r>
-        <w:t>“Asimetrías y déficit La situación de los derechos humanos en nuestro país es alta- mente preocupante. Temas como la seguridad humana, la seguridad pública, la justicia y la convivencia social son todavía asignaturas pendientes. Por lo mismo, la igualdad, accesibilidad, no discrimina- ción y equidad de género se imponen como aspectos esenciales para la consolidación de una verdadera sociedad democrática.”</w:t>
+        <w:t>“La materia y el objeto del seguro social lo constituyen las necesi­ dades contingentes, que son condición para satisfacer de manera normal las permanentes. De lo contingente a lo permanente, en gradación; del seguro social a la seguridad social por coordinación. La seguridad social incluye a todos los seres humanos, en beneficio de la humanidad y las sociedades, cualesquiera que sean el lugar y el tiempo de su existencia.”</w:t>
       </w:r>
     </w:p>
     <w:p>
@@ -1124,7 +1156,7 @@
         <w:pStyle w:val="Heading3"/>
       </w:pPr>
       <w:r>
-        <w:t>Derechos humanos, teorias y doc - Luis Manuel Marcano Salazar.pdf — p. 75 — similitud 0.0690</w:t>
+        <w:t>Derecho de la seguridad social - Alberto Briceno Ruiz.pdf — p. 116 — similitud 0.1400</w:t>
       </w:r>
     </w:p>
     <w:p>
@@ -1132,7 +1164,7 @@
         <w:ind w:left="360"/>
       </w:pPr>
       <w:r>
-        <w:t>“Oficina en Colombia del Alto Comisionado de las Naciones Unidas para los Derechos Humanos Primera edición: Bogotá, abril de 2004. “La expresión “sistema universal” se refiere a los órganos de derechos humanos de la Organización de las Naciones Unidas (en particular la Comisión de Derechos Humanos, la Subcomisión y los Relatores y Grupos de Trabajo que de éstas dependen), a los Comités de expertos establecidos en virtud de ciertos tratados en materia de derechos humanos (Comité de Derechos Humanos, Comité de Derechos Económicos, Sociales y Culturales, Comité para la Eliminación de la Discriminación Racial, Comité para la Eliminación de la Discriminación contra la Mujer, Comité contra la...”</w:t>
+        <w:t>“Los pasos anteriores permitieron ampliar el marco de intervención de las fi­ nancieras privadas, para lo cual el Ejecutivo Federal ordenó al Director Ge­ neral del Instituto la elaboración de un diagnóstico donde se presentara la visión general de! seguro social, los problemas que en particular afrontaba y se apuntaran posibles soluciones. La instrucción era realizar un “diagnóstico objetivo, sereno, profundo y realista que permita acometer los nuevos retos de la seguridad social que demandan los mexicanos”,3 con cinco principios: 1.”</w:t>
       </w:r>
     </w:p>
     <w:p>
@@ -1140,7 +1172,7 @@
         <w:pStyle w:val="Heading3"/>
       </w:pPr>
       <w:r>
-        <w:t>Los derechos humanos en Mexico - Emilio Alvarez Icaza Longoria.pdf — p. 15 — similitud 0.0673</w:t>
+        <w:t>El derecho a la seguridad socia - Diana Beatriz Gonzalez Carvallo.pdf — p. 31 — similitud 0.1373</w:t>
       </w:r>
     </w:p>
     <w:p>
@@ -1148,7 +1180,7 @@
         <w:ind w:left="360"/>
       </w:pPr>
       <w:r>
-        <w:t>“Nuevo orden internacional En la actualidad, 192 países soberanos integran la lista de Estados miembros de las Naciones Unidas, cuya finalidad es mante- ner la paz y seguridad internacionales, así como promover las rela- ciones de amistad entre las naciones y el progreso social. México es parte de esta organización desde el 7 de noviembre de 1945.”</w:t>
+        <w:t>“La interdependencia del derecho a la seguridad social y el derecho al cuidado B. Seguridad social y cuidado: bases conceptuales El concepto de seguridad social surge vinculado a una reestructuración de la relación entre el Estado y la economía en las sociedades capitalistas modernas y se tradujo en la conformación de los modernos regímenes de bienestar.”</w:t>
       </w:r>
     </w:p>
     <w:p>
@@ -1156,7 +1188,7 @@
         <w:pStyle w:val="Heading3"/>
       </w:pPr>
       <w:r>
-        <w:t>Los derechos humanos en Mexico - Emilio Alvarez Icaza Longoria.pdf — p. 61 — similitud 0.0602</w:t>
+        <w:t>Derecho de la seguridad social - Alberto Briceno Ruiz.pdf — p. 69 — similitud 0.1370</w:t>
       </w:r>
     </w:p>
     <w:p>
@@ -1164,7 +1196,7 @@
         <w:ind w:left="360"/>
       </w:pPr>
       <w:r>
-        <w:t>“Por ello, construir un sistema de seguridad pública eficaz y confiable implica que reconozcamos la complejidad de la tarea de mantener el orden público en congruencia con la vigencia integral de los derechos humanos de cada persona, tanto los civiles y políti- cos, como los económicos, sociales y culturales.”</w:t>
+        <w:t>“Primera Parte. 12 Wülíam Beveridge, Las bases de la seguridad social, Fondo de Cultura Económica, México, 1987, p. 37.”</w:t>
       </w:r>
     </w:p>
     <w:p>
@@ -1172,7 +1204,7 @@
         <w:pStyle w:val="Heading3"/>
       </w:pPr>
       <w:r>
-        <w:t>Derechos humanos, teorias y doc - Luis Manuel Marcano Salazar.pdf — p. 58 — similitud 0.0593</w:t>
+        <w:t>Curso de derechos humanos - Ana Maria Ibarra Olguin.pdf — p. 913 — similitud 0.1341</w:t>
       </w:r>
     </w:p>
     <w:p>
@@ -1180,7 +1212,7 @@
         <w:ind w:left="360"/>
       </w:pPr>
       <w:r>
-        <w:t>“Es el proceso de positivización de las garantías; d) Los derechos reconocidos comienzan a ampliarse, en procura de otros derechos y hacia un estado de bienestar. • En este proceso de expansión a partir de la mitad del siglo XIX, emergen los derechos económicos, sociales y culturales; en este interregnum se hace necesario destacar el valor de las luchas por las reivindicaciones obreras y otras pretensiones de carácter social. León XIII en el año 1891 promulga la primera encíclica social de la Iglesia denominada “Rerum novarum”, como un grito convincente por las precarias condiciones indignas en que se encontraban los obreros; siendo execrables la situación de miseria que debían soportar.”</w:t>
+        <w:t>“El derecho a la seguridad social 913 causa de muerte —de viudez en el matrimonio y en el concubinato, de orfandad y ascendencia— y servicios de guarderías. La inmensa mayoría de sentencias de la SCJN sobre seguridad social se origina en litigios dentro del modelo contributivo de aseguramiento social.”</w:t>
       </w:r>
     </w:p>
     <w:p>
@@ -1188,7 +1220,7 @@
         <w:pStyle w:val="Heading3"/>
       </w:pPr>
       <w:r>
-        <w:t>Los derechos humanos en Mexico - Emilio Alvarez Icaza Longoria.pdf — p. 47 — similitud 0.0512</w:t>
+        <w:t>El derecho a la seguridad socia - Diana Beatriz Gonzalez Carvallo.pdf — p. 74 — similitud 0.1314</w:t>
       </w:r>
     </w:p>
     <w:p>
@@ -1196,7 +1228,151 @@
         <w:ind w:left="360"/>
       </w:pPr>
       <w:r>
-        <w:t>“El Conapred es la institución rectora para promover políticas que buscan contribuir al desarrollo cultural y social a través de la inclusión social, garantizando el derecho a la igualdad, que es el primero de los derechos fundamentales en la Constitución federal. Sin duda, las movilizaciones de las osc lograron un avance en materia de derechos humanos gracias al impacto que tuvieron en la”</w:t>
+        <w:t>“Además, la misma configura- ción de los alcances y contenidos del articulo 123, donde vienen regulados todos los derechos laborales de “los trabajadores”, deja entrever la estrecha vinculación entre el acceso y disfrute de prestaciones de seguridad social y el estatus laboral de las personas. De hecho, es conocido que la seguridad social en México está gestionada prin- cipalmente por el Instituto Mexicano del Seguro Social (IMSS) y el Instituto de Seguridad y Servicios Sociales de los Trabajadores del Estado (ISSSTE).”</w:t>
+      </w:r>
+    </w:p>
+    <w:p>
+      <w:pPr>
+        <w:pStyle w:val="Heading3"/>
+      </w:pPr>
+      <w:r>
+        <w:t>El derecho a la seguridad socia - Diana Beatriz Gonzalez Carvallo.pdf — p. 160 — similitud 0.1307</w:t>
+      </w:r>
+    </w:p>
+    <w:p>
+      <w:pPr>
+        <w:ind w:left="360"/>
+      </w:pPr>
+      <w:r>
+        <w:t>“En el marco de las políticas de cuidado infantil, enseguida abordo la prestación de guarderías, en donde se exponen las instituciones y programas que forman parte de los sistemas contributivo y no contributivo, señalando sus bondades, en tanto ampliación de de- rechos ciudadanos para la infancia, y sus limitaciones e impactos en las desigualdades de género y clase.”</w:t>
+      </w:r>
+    </w:p>
+    <w:p>
+      <w:pPr>
+        <w:pStyle w:val="Heading3"/>
+      </w:pPr>
+      <w:r>
+        <w:t>Curso de derechos humanos - Ana Maria Ibarra Olguin.pdf — p. 909 — similitud 0.1305</w:t>
+      </w:r>
+    </w:p>
+    <w:p>
+      <w:pPr>
+        <w:ind w:left="360"/>
+      </w:pPr>
+      <w:r>
+        <w:t>“El derecho a la seguridad social 909 Para superar los problemas de este programa, entre los que estaban la co- rrupción, la falta de coordinación de la diversas instancias, la insuficiencia de cupos, entre otros, en 2019 se puso en marcha uno nuevo llamado Apoyo para el Bienestar de Niños, Niñas e Hijos de Madres Trabajadoras (PAB), que utiliza la modalidad de entrega de apoyos directos a las madres para que contraten cuidado infantil privado —bien sea con un familiar o en guarderías particulares—.37 Tam- bién hubo una reducción del 50% del presupuesto destinado a la financiación de estancias y se redujo el monto de los apoyos mensuales. III.”</w:t>
+      </w:r>
+    </w:p>
+    <w:p>
+      <w:pPr>
+        <w:pStyle w:val="Heading3"/>
+      </w:pPr>
+      <w:r>
+        <w:t>El derecho a la seguridad socia - Diana Beatriz Gonzalez Carvallo.pdf — p. 252 — similitud 0.1295</w:t>
+      </w:r>
+    </w:p>
+    <w:p>
+      <w:pPr>
+        <w:ind w:left="360"/>
+      </w:pPr>
+      <w:r>
+        <w:t>“De manera similar, hay otros casos que determinan la configuración de la relación laboral a partir de cierto tiempo de trabajo a la semana, quienes no cumplen con ese tiempo mínimo quedan también excluidos de la seguridad social. Este es el caso de Brasil, donde la obligación de afiliación a la seguridad social se genera a partir de los tres días semanales, y de Colombia, donde el supuesto de trabajo por días no es obligatorio cuando las personas trabaja- doras domésticas están afiliadas al Régimen Subsidiado (Piso de Protección Social) o resulten beneficiarias de esta prestación en el Régimen Contributivo.”</w:t>
+      </w:r>
+    </w:p>
+    <w:p>
+      <w:pPr>
+        <w:pStyle w:val="Heading3"/>
+      </w:pPr>
+      <w:r>
+        <w:t>El derecho a la seguridad socia - Diana Beatriz Gonzalez Carvallo.pdf — p. 87 — similitud 0.1254</w:t>
+      </w:r>
+    </w:p>
+    <w:p>
+      <w:pPr>
+        <w:ind w:left="360"/>
+      </w:pPr>
+      <w:r>
+        <w:t>“Sistematización de buenas prácticas de políticas que reconozcan el trabajo de cuidado como vía de acceso a prestaciones de seguridad social, la CISS desarrolla y fundamenta una contundente crítica al diseño de los sistemas de seguridad social “que funcionan bajo el supuesto de un hombre proveedor sin responsabilidades de cuidado familiar y una mujer que asume todo el trabajo de cuidados en forma no remunerada”.42 Al basarse en estereotipos de género, el diseño de la seguridad social no puede ofrecer una protección adecuada, justa y completa”</w:t>
+      </w:r>
+    </w:p>
+    <w:p>
+      <w:pPr>
+        <w:pStyle w:val="Heading3"/>
+      </w:pPr>
+      <w:r>
+        <w:t>Curso de derechos humanos - Ana Maria Ibarra Olguin.pdf — p. 693 — similitud 0.1252</w:t>
+      </w:r>
+    </w:p>
+    <w:p>
+      <w:pPr>
+        <w:ind w:left="360"/>
+      </w:pPr>
+      <w:r>
+        <w:t>“Los derechos de los pueblos indígenas 693 parece más relevante examinar el alcance de las obligaciones estatales impuestas por dicho derecho. Jurisprudencia de la SCJN La SCJN posee sendos pronunciamientos sobre las directrices que un proceso de CLPI debe observar, en aplicación directa del Convenio 169 de la OIT y de los estándares del DIDH. Tales precedentes replican, en gran medida, los parámetros jurisprudenciales desarrollados por la Corte IDH.”</w:t>
+      </w:r>
+    </w:p>
+    <w:p>
+      <w:pPr>
+        <w:pStyle w:val="Heading3"/>
+      </w:pPr>
+      <w:r>
+        <w:t>El derecho a la seguridad socia - Diana Beatriz Gonzalez Carvallo.pdf — p. 240 — similitud 0.1250</w:t>
+      </w:r>
+    </w:p>
+    <w:p>
+      <w:pPr>
+        <w:ind w:left="360"/>
+      </w:pPr>
+      <w:r>
+        <w:t>“216 El derecho a la seguridad social y las responsabilidades de cuidado cendientes. A pesar de ser una forma de empleo dependiente, criterio que vincula una relación de trabajo con la ley laboral, tradicionalmente ha sido discriminado por el derecho laboral y la seguridad social con regulaciones hasta hace muy poco de excepción, regímenes especiales y menos favorables que el resto del empleo asalariado, por tanto, discriminatorios. Afortunadamente, ya se aprecian cambios, y estos tienen que ver con la re- lación entre cuidado y seguridad social y con las interdependencias de estos derechos.”</w:t>
+      </w:r>
+    </w:p>
+    <w:p>
+      <w:pPr>
+        <w:pStyle w:val="Heading3"/>
+      </w:pPr>
+      <w:r>
+        <w:t>El derecho a la seguridad socia - Diana Beatriz Gonzalez Carvallo.pdf — p. 66 — similitud 0.1238</w:t>
+      </w:r>
+    </w:p>
+    <w:p>
+      <w:pPr>
+        <w:ind w:left="360"/>
+      </w:pPr>
+      <w:r>
+        <w:t>“2  Carpenter, S. et al., “Sistemas previsionales con enfoque de género en América Latina y el Caribe: una cuestión de igualdad”, Conferencia Interamericana de Seguridad Social, 2022. 3  Nugent, R., “Capítulo 33 La Seguridad Social: su Historia y sus Fuentes”, en Instituciones de derecho del trabajo y de la seguridad social, México, Academia Iberoamericana de Derecho del Trabajo y de la Seguridad Social y Universidad Nacional Autónoma de México, 1997.”</w:t>
+      </w:r>
+    </w:p>
+    <w:p>
+      <w:pPr>
+        <w:pStyle w:val="Heading3"/>
+      </w:pPr>
+      <w:r>
+        <w:t>El derecho a la seguridad socia - Diana Beatriz Gonzalez Carvallo.pdf — p. 266 — similitud 0.1236</w:t>
+      </w:r>
+    </w:p>
+    <w:p>
+      <w:pPr>
+        <w:ind w:left="360"/>
+      </w:pPr>
+      <w:r>
+        <w:t>“242 El derecho a la seguridad social y las responsabilidades de cuidado III. La igualdad en la seguridad social para la Suprema Corte La sentencia AD 09/2018 hace una interpretación de la igualdad en la seguridad social consistente con el derecho internacional de los derechos humanos. La sentencia recoge definiciones planteadas por el amparo que le da origen, tales como igualdad formal y real, que han sido vitales para mostrar la discriminación contra las mujeres y que se emparentan con las definiciones de discriminación directa e indirecta referidas en el primer apartado de este documento.”</w:t>
+      </w:r>
+    </w:p>
+    <w:p>
+      <w:pPr>
+        <w:pStyle w:val="Heading3"/>
+      </w:pPr>
+      <w:r>
+        <w:t>El derecho a la seguridad socia - Diana Beatriz Gonzalez Carvallo.pdf — p. 66 — similitud 0.1225</w:t>
+      </w:r>
+    </w:p>
+    <w:p>
+      <w:pPr>
+        <w:ind w:left="360"/>
+      </w:pPr>
+      <w:r>
+        <w:t>“Ciertamente el paradigma laboralista ha limitado el alcance de las prestaciones de la seguridad social.2 Para una gran parte de la doctrina —y de las políticas públicas— la seguridad social sigue estando sujeta a la condición laboral de las personas, pudiendo acceder al disfrute de sus prestaciones (y, por lo tanto, a la protección ofrecidas por éstas) sólo quienes se desempeñan bajo condiciones de empleo formal y asalariado. Esto es un motivo de tensión entre el enfoque de derechos humanos y la actual traducción institucional de las condiciones de acceso a la seguridad social.”</w:t>
       </w:r>
     </w:p>
     <w:p>
@@ -1207,7 +1383,7 @@
         <w:t xml:space="preserve">Observación automática: </w:t>
       </w:r>
       <w:r>
-        <w:t>La ficha presenta una coincidencia fuerte con el concepto buscado. Se agruparon referencias de múltiples fuentes para enriquecer el concepto. Hay 6 referencia(s) de baja similitud que podrían introducir ruido.</w:t>
+        <w:t>La ficha presenta coincidencias útiles, pero conviene revisar la pertinencia de cada cita. Se agruparon referencias de múltiples fuentes para enriquecer el concepto.</w:t>
       </w:r>
     </w:p>
     <w:p>
@@ -1215,7 +1391,7 @@
         <w:pStyle w:val="Heading2"/>
       </w:pPr>
       <w:r>
-        <w:t>Ficha 04. Seguro</w:t>
+        <w:t>Ficha 04. las diferencias entre ambos</w:t>
       </w:r>
     </w:p>
     <w:p>
@@ -1226,7 +1402,7 @@
         <w:t xml:space="preserve">Fuentes: </w:t>
       </w:r>
       <w:r>
-        <w:t>Como se hicieron los Derechos H - Ricardo Rabinovich Berkman.pdf; Derechos humanos, teorias y doc - Luis Manuel Marcano Salazar.pdf; Los derechos humanos en Mexico - Emilio Alvarez Icaza Longoria.pdf</w:t>
+        <w:t>Constitucion Politica de los Es - Camara de Diputados del H. Cong.pdf; Curso de derechos humanos - Ana Maria Ibarra Olguin.pdf; Derecho de la seguridad social - Alberto Briceno Ruiz.pdf; Derecho humano a la seguridad s - Jose Luis Belmont Lugo.pdf; El derecho a la seguridad socia - Diana Beatriz Gonzalez Carvallo.pdf; Ley del Instituto de Seguridad - Camara de Diputados del H. Cong.pdf</w:t>
       </w:r>
     </w:p>
     <w:p>
@@ -1237,7 +1413,7 @@
         <w:t xml:space="preserve">Ubicaciones: </w:t>
       </w:r>
       <w:r>
-        <w:t>Como se hicieron los Derechos H - Ricardo Rabinovich Berkman.pdf, p. 122; Como se hicieron los Derechos H - Ricardo Rabinovich Berkman.pdf, p. 141; Como se hicieron los Derechos H - Ricardo Rabinovich Berkman.pdf, p. 148; Como se hicieron los Derechos H - Ricardo Rabinovich Berkman.pdf, p. 151; Como se hicieron los Derechos H - Ricardo Rabinovich Berkman.pdf, p. 198; Como se hicieron los Derechos H - Ricardo Rabinovich Berkman.pdf, p. 211; Como se hicieron los Derechos H - Ricardo Rabinovich Berkman.pdf, p. 217; Como se hicieron los Derechos H - Ricardo Rabinovich Berkman.pdf, p. 261; Como se hicieron los Derechos H - Ricardo Rabinovich Berkman.pdf, p. 60; Derechos humanos, teorias y doc - Luis Manuel Marcano Salazar.pdf, p. 103; Derechos humanos, teorias y doc - Luis Manuel Marcano Salazar.pdf, p. 111; Derechos humanos, teorias y doc - Luis Manuel Marcano Salazar.pdf, p. 112; Derechos humanos, teorias y doc - Luis Manuel Marcano Salazar.pdf, p. 16; Derechos humanos, teorias y doc - Luis Manuel Marcano Salazar.pdf, p. 17; Derechos humanos, teorias y doc - Luis Manuel Marcano Salazar.pdf, p. 20; Derechos humanos, teorias y doc - Luis Manuel Marcano Salazar.pdf, p. 23; Derechos humanos, teorias y doc - Luis Manuel Marcano Salazar.pdf, p. 29; Derechos humanos, teorias y doc - Luis Manuel Marcano Salazar.pdf, p. 53; Derechos humanos, teorias y doc - Luis Manuel Marcano Salazar.pdf, p. 54; Derechos humanos, teorias y doc - Luis Manuel Marcano Salazar.pdf, p. 56; Derechos humanos, teorias y doc - Luis Manuel Marcano Salazar.pdf, p. 71; Derechos humanos, teorias y doc - Luis Manuel Marcano Salazar.pdf, p. 87; Los derechos humanos en Mexico - Emilio Alvarez Icaza Longoria.pdf, p. 47</w:t>
+        <w:t>Constitucion Politica de los Es - Camara de Diputados del H. Cong.pdf, p. 101; Curso de derechos humanos - Ana Maria Ibarra Olguin.pdf, p. 901; Curso de derechos humanos - Ana Maria Ibarra Olguin.pdf, p. 913; Curso de derechos humanos - Ana Maria Ibarra Olguin.pdf, p. 914; Derecho de la seguridad social - Alberto Briceno Ruiz.pdf, p. 93; Derecho humano a la seguridad s - Jose Luis Belmont Lugo.pdf, p. 3; El derecho a la seguridad socia - Diana Beatriz Gonzalez Carvallo.pdf, p. 121; El derecho a la seguridad socia - Diana Beatriz Gonzalez Carvallo.pdf, p. 160; El derecho a la seguridad socia - Diana Beatriz Gonzalez Carvallo.pdf, p. 178; El derecho a la seguridad socia - Diana Beatriz Gonzalez Carvallo.pdf, p. 195; El derecho a la seguridad socia - Diana Beatriz Gonzalez Carvallo.pdf, p. 252; El derecho a la seguridad socia - Diana Beatriz Gonzalez Carvallo.pdf, p. 280; El derecho a la seguridad socia - Diana Beatriz Gonzalez Carvallo.pdf, p. 283; El derecho a la seguridad socia - Diana Beatriz Gonzalez Carvallo.pdf, p. 30; El derecho a la seguridad socia - Diana Beatriz Gonzalez Carvallo.pdf, p. 305; El derecho a la seguridad socia - Diana Beatriz Gonzalez Carvallo.pdf, p. 310; El derecho a la seguridad socia - Diana Beatriz Gonzalez Carvallo.pdf, p. 318; El derecho a la seguridad socia - Diana Beatriz Gonzalez Carvallo.pdf, p. 319; El derecho a la seguridad socia - Diana Beatriz Gonzalez Carvallo.pdf, p. 64; El derecho a la seguridad socia - Diana Beatriz Gonzalez Carvallo.pdf, p. 87; El derecho a la seguridad socia - Diana Beatriz Gonzalez Carvallo.pdf, p. 95; Ley del Instituto de Seguridad - Camara de Diputados del H. Cong.pdf, p. 92</w:t>
       </w:r>
     </w:p>
     <w:p>
@@ -1245,7 +1421,7 @@
         <w:pStyle w:val="Heading3"/>
       </w:pPr>
       <w:r>
-        <w:t>Derechos humanos, teorias y doc - Luis Manuel Marcano Salazar.pdf — p. 23 — similitud 0.1320</w:t>
+        <w:t>El derecho a la seguridad socia - Diana Beatriz Gonzalez Carvallo.pdf — p. 283 — similitud 0.3407</w:t>
       </w:r>
     </w:p>
     <w:p>
@@ -1253,7 +1429,7 @@
         <w:ind w:left="360"/>
       </w:pPr>
       <w:r>
-        <w:t>“Luis Manuel Marcano Salazar Por consiguiente, a pesar de las leyes de naturaleza (que cada uno observa cuando tiene la voluntad de observarlas, cuando puede hacerlo de modo seguro) si no se ha instituido o no es suficientemente grande para nuestra seguridad, cada uno se fiará tan sólo, y podrá hacerlo legalmente, sobre su propia fuerza y maña, para protegerse contra los demás hombres.”</w:t>
+        <w:t>“El derecho familiar como seguro social En este ensayo, comienzo a integrar el derecho familiar y la seguridad social con el objetivo de obtener un mejor entendimiento de ambos regímenes y de la relación entre ellos. Para hacer que la discusión sea concreta, considero dos casos —uno que involucra la manutención conyugal y la discapacidad y otro que comprende la manutención infantil para familias múltiples— y demuestro que éstos ilustran dos puntos de solapamiento entre el derecho familiar y la seguridad social. En primer lugar, ambos ejemplos ilustran la interdependencia de los derechos económicos en el derecho familiar y en la seguridad social.”</w:t>
       </w:r>
     </w:p>
     <w:p>
@@ -1261,7 +1437,7 @@
         <w:pStyle w:val="Heading3"/>
       </w:pPr>
       <w:r>
-        <w:t>Derechos humanos, teorias y doc - Luis Manuel Marcano Salazar.pdf — p. 16 — similitud 0.1262</w:t>
+        <w:t>El derecho a la seguridad socia - Diana Beatriz Gonzalez Carvallo.pdf — p. 310 — similitud 0.2023</w:t>
       </w:r>
     </w:p>
     <w:p>
@@ -1269,7 +1445,7 @@
         <w:ind w:left="360"/>
       </w:pPr>
       <w:r>
-        <w:t>“Esos eventos internacionales generaron cambios constitucionales; así, en Venezuela a partir de la Constitución de 1999 en su Capítulo IX se contemplan los derechos ambientales en los artículos 127 al 129, como un derecho de la persona susceptible de protección y a su vez un deber compartido con el Estado que imperiosamente debe protegerlo e imponer la conservación del equilibrio ecológico para las generaciones futuras, en el artículo 127 se consagra específicamente: “Es un derecho y un deber de cada generación proteger y mantener el ambiente en beneficio de sí misma y del mundo futuro.Toda persona tiene derecho individual y colectivamente a disfrutar de una vida y de un ambiente seguro...”</w:t>
+        <w:t>“II. Manutención infantil como una instancia de la seguridad social Pero, como en Wilson, un vistazo más cercano sugiere que el derecho familiar y la seguridad social operan juntos para determinar cuáles decisiones son riesgosas y cuáles son seguras. El cuadro 3 describe las principales reglas jurídicas y los riesgos que crean desde la perspectiva de un infante.”</w:t>
       </w:r>
     </w:p>
     <w:p>
@@ -1277,7 +1453,7 @@
         <w:pStyle w:val="Heading3"/>
       </w:pPr>
       <w:r>
-        <w:t>Como se hicieron los Derechos H - Ricardo Rabinovich Berkman.pdf — p. 141 — similitud 0.1217</w:t>
+        <w:t>El derecho a la seguridad socia - Diana Beatriz Gonzalez Carvallo.pdf — p. 318 — similitud 0.1917</w:t>
       </w:r>
     </w:p>
     <w:p>
@@ -1285,7 +1461,7 @@
         <w:ind w:left="360"/>
       </w:pPr>
       <w:r>
-        <w:t>“Es la decisi- va lucha ideológica del siglo XXI, y la misión de nuestra generación", agrega- ba Bush a renglón seguido, colocando el ataque estadounidense a Irak en un nivel de necesidad apocalíptica, que hace acordar a los criterios de la "guerra santa", sobre los que volveremos más adelante. "El mundo está más seguro porque Saddam Hussein no está más en el poder. Y ahora el desafío es ayudar al pueblo iraquí a construir una de- mocracia que cumpla los sueños de los casi doce millones de iraquíes que salieron a votar en elecciones libres el último diciembre", concluía optimista el mandatario estadounidense213.”</w:t>
+        <w:t>“C. Conclusión: disrupción familiar y seguridad social Por tradición, el derecho familiar y la seguridad social ocupan distintos campos en el derecho. El derecho familiar, que se enseña en un conjunto de cursos, se centra en la adjudicación de casos trágicos.”</w:t>
       </w:r>
     </w:p>
     <w:p>
@@ -1293,7 +1469,7 @@
         <w:pStyle w:val="Heading3"/>
       </w:pPr>
       <w:r>
-        <w:t>Como se hicieron los Derechos H - Ricardo Rabinovich Berkman.pdf — p. 217 — similitud 0.1216</w:t>
+        <w:t>El derecho a la seguridad socia - Diana Beatriz Gonzalez Carvallo.pdf — p. 283 — similitud 0.1815</w:t>
       </w:r>
     </w:p>
     <w:p>
@@ -1301,7 +1477,7 @@
         <w:ind w:left="360"/>
       </w:pPr>
       <w:r>
-        <w:t>“Advierte: "Los árboles que se doblan conservan sus ramas, pero los que se resis- ten acaban arrancados de raíz" (que es como Creón terminará: sin des- cendientes). Y emplea una imagen característica de un griego (aunque de un ateniense más que de un beocio): " Aquel piloto que, seguro de lo que hace, ajusta la escota de ía vela y no la suelta, realiza el resto del viaje con el navio tumbado" (713-717). El corifeo trata de ponerlos de acuerdo.”</w:t>
+        <w:t>“En segundo lugar, ambos casos demuestran que una serie de cambios en el derecho familiar, en el derecho de la seguridad social o en otros elementos del derecho podría alterar la distribución de los riesgos de vida —y así la probabilidad y las consecuencias de tragedias aparentemente privadas.”</w:t>
       </w:r>
     </w:p>
     <w:p>
@@ -1309,7 +1485,7 @@
         <w:pStyle w:val="Heading3"/>
       </w:pPr>
       <w:r>
-        <w:t>Como se hicieron los Derechos H - Ricardo Rabinovich Berkman.pdf — p. 151 — similitud 0.1189</w:t>
+        <w:t>El derecho a la seguridad socia - Diana Beatriz Gonzalez Carvallo.pdf — p. 252 — similitud 0.1774</w:t>
       </w:r>
     </w:p>
     <w:p>
@@ -1317,7 +1493,7 @@
         <w:ind w:left="360"/>
       </w:pPr>
       <w:r>
-        <w:t>“162 RICARDO D. RABINOVICH-BERKMAN tencialismo, que "la mayor parte de los mortales se queja de la malignidad de la Naturaleza, por habernos engendrado para un tiempo tan breve y porque este espacio de tiempo que se nos dio se escurre tan velozmente"22* No sabemos cuándo llegará la muerte, pero es seguro que ella va a venir, Borges, de nuevo, escribe: "Tras el cristal ya gris la noche cesa y del alto de libros que una trunca sombra dilata por la vaga mesa, alguno habrá que no leeremos nunca"225. La muerte, en efecto pone limites (tal el título de este maravilloso poema) a nuestro tiempo.”</w:t>
+        <w:t>“De manera similar, hay otros casos que determinan la configuración de la relación laboral a partir de cierto tiempo de trabajo a la semana, quienes no cumplen con ese tiempo mínimo quedan también excluidos de la seguridad social. Este es el caso de Brasil, donde la obligación de afiliación a la seguridad social se genera a partir de los tres días semanales, y de Colombia, donde el supuesto de trabajo por días no es obligatorio cuando las personas trabaja- doras domésticas están afiliadas al Régimen Subsidiado (Piso de Protección Social) o resulten beneficiarias de esta prestación en el Régimen Contributivo.”</w:t>
       </w:r>
     </w:p>
     <w:p>
@@ -1325,7 +1501,7 @@
         <w:pStyle w:val="Heading3"/>
       </w:pPr>
       <w:r>
-        <w:t>Derechos humanos, teorias y doc - Luis Manuel Marcano Salazar.pdf — p. 56 — similitud 0.0844</w:t>
+        <w:t>Curso de derechos humanos - Ana Maria Ibarra Olguin.pdf — p. 901 — similitud 0.1651</w:t>
       </w:r>
     </w:p>
     <w:p>
@@ -1333,7 +1509,7 @@
         <w:ind w:left="360"/>
       </w:pPr>
       <w:r>
-        <w:t>“Sin embargo, también patrocina la necesidad de un pacto entre las individualidades para formar un gobierno (…) las voluntades individuales siguen siendo el origen y forman los elementos esenciales; pero, consideradas separadamente, su poder sería nulo, puesto que sólo reside en el conjunto44.Tal es el origen de un gobierno, ejercido por procuración; coincide con Locke, en legar una porción de poder «a algunos de ellos» el pueblo es numeroso y es imposible consultarlo en su totalidad por toda la nación; esta delegación no implica un desprendimiento total del poder soberano. Expone su celebre tesis acerca del poder constituyente originario de esta manera:”</w:t>
+        <w:t>“La cuestión es si los diseños laboralistas y familistas, predominantes en ciertas regiones, ciertamente en México, responden adecuada- mente al desafío que supone la actualización de esos riesgos sociales en términos de derechos humanos. Una pregunta derivada de la anterior es si la división entre modelos, y sus efectos sobre la titularidad del derecho, contributivo y no contri- butivo de aseguramiento es admisible y sostenible. II.”</w:t>
       </w:r>
     </w:p>
     <w:p>
@@ -1341,7 +1517,7 @@
         <w:pStyle w:val="Heading3"/>
       </w:pPr>
       <w:r>
-        <w:t>Derechos humanos, teorias y doc - Luis Manuel Marcano Salazar.pdf — p. 29 — similitud 0.0840</w:t>
+        <w:t>El derecho a la seguridad socia - Diana Beatriz Gonzalez Carvallo.pdf — p. 87 — similitud 0.1626</w:t>
       </w:r>
     </w:p>
     <w:p>
@@ -1349,7 +1525,7 @@
         <w:ind w:left="360"/>
       </w:pPr>
       <w:r>
-        <w:t>“15). De una vez manifiesta tajantemente su objetivo, no se detendrá a divagar y concibe al derecho libre de elementos metajurídicos; el hombre está escindido entre el mundo del “ser”y del “deber ser”; el hombre sólo es capaz de conocer lo dado, escapándosele toda metafísica; pretende (…)“brindar una definición de la norma jurídica totalmente independiente de la noción de norma moral (…) al afirmar la autonomía del derecho respecto de la moral.”</w:t>
+        <w:t>“63 El derecho a la seguridad social y el derecho al cuidado: de la relación paradójica... mal. Quienes no cumplen con estas condiciones, no pueden acceder a estas prestaciones de cuidados.”</w:t>
       </w:r>
     </w:p>
     <w:p>
@@ -1357,7 +1533,7 @@
         <w:pStyle w:val="Heading3"/>
       </w:pPr>
       <w:r>
-        <w:t>Como se hicieron los Derechos H - Ricardo Rabinovich Berkman.pdf — p. 198 — similitud 0.0803</w:t>
+        <w:t>El derecho a la seguridad socia - Diana Beatriz Gonzalez Carvallo.pdf — p. 319 — similitud 0.1620</w:t>
       </w:r>
     </w:p>
     <w:p>
@@ -1365,7 +1541,7 @@
         <w:ind w:left="360"/>
       </w:pPr>
       <w:r>
-        <w:t>“Como ésta, también del Éxodo, que se relaciona con disposiciones de la piedra de Ha- mmurabi: "El que hiera a un hombre de modo que en efecto muera, ha de ser muerto sin falta" (21.12). Otras, buscan resguardar elementos esenciales del ser humano en forma bastante minuciosa: "Y en caso de que unos hombres se pongan a reñir y uno efectivamente hiera a su prójimo con una piedra o un azadón y este no mue- ra, pero tenga que quedarse en cama; sí se levanta y va andando fuera sobre algún sostén suyo, entonces el que lo haya herido tiene que estar libre de cas- tigo; dará compensación solo por el tiempo que se haya perdido del trabajo de aquel hasta que lo tenga completamente sanado" (21,18-19).”</w:t>
+        <w:t>“295 ¿Tragedias privadas? El derecho familiar como seguro social bajadores a tomar trabajos riesgosos, renunciar a la capacitación, prolongar el desempleo, o exagerar la discapacidad?64 En este ensayo, he sugerido que el derecho familiar puede ser entendido como una parte del sistema de seguridad social y que los académicos pueden aplicar al derecho familiar algunas de las herramientas analíticas y catego- rías usadas en la seguridad social. Los casos Wilson y Brown ilustran cómo los dos sistemas operan juntos para distribuir los riesgos de incapacidad y disrupción familiar, y cómo algunos cambios en cada uno de los regímenes podrían alterar el perfil de riesgo.”</w:t>
       </w:r>
     </w:p>
     <w:p>
@@ -1373,7 +1549,7 @@
         <w:pStyle w:val="Heading3"/>
       </w:pPr>
       <w:r>
-        <w:t>Los derechos humanos en Mexico - Emilio Alvarez Icaza Longoria.pdf — p. 47 — similitud 0.0797</w:t>
+        <w:t>El derecho a la seguridad socia - Diana Beatriz Gonzalez Carvallo.pdf — p. 160 — similitud 0.1589</w:t>
       </w:r>
     </w:p>
     <w:p>
@@ -1381,7 +1557,7 @@
         <w:ind w:left="360"/>
       </w:pPr>
       <w:r>
-        <w:t>“Sin embargo, la transparencia electoral, que facilita la elección demo- crática de los gobernantes, no garantiza de facto la rendición de cuen- tas. El paradigma ético de la democracia exige conductas y actitudes ciudadanas continuas que salvaguarden el ejercicio plural del poder político de los resabios de carácter autoritario, el uso regular y sis- temático de los mecanismos de toma de decisiones que considera el Estado democrático de derecho, y el acceso a la información pública que transparenta la gestión pública y permite una rendición de cuen- tas a satisfacción.”</w:t>
+        <w:t>“En el marco de las políticas de cuidado infantil, enseguida abordo la prestación de guarderías, en donde se exponen las instituciones y programas que forman parte de los sistemas contributivo y no contributivo, señalando sus bondades, en tanto ampliación de de- rechos ciudadanos para la infancia, y sus limitaciones e impactos en las desigualdades de género y clase.”</w:t>
       </w:r>
     </w:p>
     <w:p>
@@ -1389,7 +1565,7 @@
         <w:pStyle w:val="Heading3"/>
       </w:pPr>
       <w:r>
-        <w:t>Derechos humanos, teorias y doc - Luis Manuel Marcano Salazar.pdf — p. 111 — similitud 0.0749</w:t>
+        <w:t>El derecho a la seguridad socia - Diana Beatriz Gonzalez Carvallo.pdf — p. 64 — similitud 0.1557</w:t>
       </w:r>
     </w:p>
     <w:p>
@@ -1397,7 +1573,7 @@
         <w:ind w:left="360"/>
       </w:pPr>
       <w:r>
-        <w:t>“Dichos elementos se encuentran sujetos a transformaciones permanentes, tanto de origen natural como antrópico, los cuales pueden determinar efectos positivos o negativos sobre las generaciones futuras” (p. 136); ha generado su consagración en múltiples instrumentos jurídicos que protegen los derechos humanos y Constituciones; correspondiendo a continuación establecer la relación existente entre el derecho a la vida, el derecho a un ambiente sano para poder concebir la existencia de los derechos transgeneracionales.”</w:t>
+        <w:t>“40 El derecho a la seguridad social y las responsabilidades de cuidado un camino contundente hacia el reconocimiento de la interdependencia de derechos, característica clave de la relación entre cuidados y seguridad social. En este capítulo se realiza un análisis sobre la relación existente entre el derecho a la seguridad social y el derecho al cuidado.”</w:t>
       </w:r>
     </w:p>
     <w:p>
@@ -1405,7 +1581,7 @@
         <w:pStyle w:val="Heading3"/>
       </w:pPr>
       <w:r>
-        <w:t>Como se hicieron los Derechos H - Ricardo Rabinovich Berkman.pdf — p. 60 — similitud 0.0717</w:t>
+        <w:t>Derecho humano a la seguridad s - Jose Luis Belmont Lugo.pdf — p. 3 — similitud 0.1528</w:t>
       </w:r>
     </w:p>
     <w:p>
@@ -1413,7 +1589,7 @@
         <w:ind w:left="360"/>
       </w:pPr>
       <w:r>
-        <w:t>“A veces se estudian algunos de ellos en forma directa. En Derecho Civil eso es muy notable, sobre todo, en la "parte general". Pero también en Derecho Penal, Constitucional, Administrativo, Procesal, Internacional Público, en Filosofía del Derecho, Historia del De- recho... y podríamos seguir.”</w:t>
+        <w:t>“5 1. Los derechos humanos y el derecho humano a la seguridad social . . . . . . . . . . . . . . . . . . . 5 2.”</w:t>
       </w:r>
     </w:p>
     <w:p>
@@ -1421,7 +1597,7 @@
         <w:pStyle w:val="Heading3"/>
       </w:pPr>
       <w:r>
-        <w:t>Como se hicieron los Derechos H - Ricardo Rabinovich Berkman.pdf — p. 122 — similitud 0.0700</w:t>
+        <w:t>El derecho a la seguridad socia - Diana Beatriz Gonzalez Carvallo.pdf — p. 95 — similitud 0.1521</w:t>
       </w:r>
     </w:p>
     <w:p>
@@ -1429,7 +1605,7 @@
         <w:ind w:left="360"/>
       </w:pPr>
       <w:r>
-        <w:t>“Es decir, nadie piensa que realmente haya habido un día en qué las per- sonas de cada grupo, cansadas de andar por allí como salvajes, felices pero ignorantes, al estilo de Rousseau, o prepotentes y nerviosas, a la manera de Hobbes, se reunieron en un sitio y dijeron: "jCaramba, vamos de una buena vez a ponernos todos de acuerdo y hacer un contrato social!" Y uno alzó la mano, y dijo: "¡Oiga, explique!" Y el primero respondió: "Mire, vamos a dejar parte de nuestra libertad, porque de ese modo podremos construir una cosa que la vamos a llamar sociedad, y va a ser algo bu enísimo". Y uña mu- jer: "¿Y a mí qué me va con eso?" Todos miran.”</w:t>
+        <w:t>“71 El derecho a la seguridad social y el derecho al cuidado: de la relación paradójica... los Estados”. A lo largo de 25 páginas, la solicitud incluye una serie de pre- guntas específicas que van desde las obligaciones positivas —y negativas— de los Estados para con el derecho al cuidado, como así también la forma en la cual se establece la interrelación entre este derecho y otros como el derecho a la vida, la salud, la educación e incluso con la seguridad social.”</w:t>
       </w:r>
     </w:p>
     <w:p>
@@ -1437,7 +1613,7 @@
         <w:pStyle w:val="Heading3"/>
       </w:pPr>
       <w:r>
-        <w:t>Como se hicieron los Derechos H - Ricardo Rabinovich Berkman.pdf — p. 211 — similitud 0.0700</w:t>
+        <w:t>El derecho a la seguridad socia - Diana Beatriz Gonzalez Carvallo.pdf — p. 280 — similitud 0.1488</w:t>
       </w:r>
     </w:p>
     <w:p>
@@ -1445,7 +1621,7 @@
         <w:ind w:left="360"/>
       </w:pPr>
       <w:r>
-        <w:t>“Así que, para horror de Creón, Me- neceo, su primogénito, se suicida arrojándose desde una de las torres. El sacrificio de Meneceo hace a los tebanos sentirse seguros, así que salen a combatir. Ante los muros, Eteocles y Polinices se enfrentan en combate singular.”</w:t>
+        <w:t>“256 El derecho a la seguridad social y las responsabilidades de cuidado Por tradición jurídica, el derecho familiar forma parte del derecho privado: regula las relaciones entre individuos, en lugar de las relaciones entre indivi- duos y el Estado.2 Desde este punto de vista, el derecho familiar, como otras formas de derecho privado, existe principalmente para promover el orden en el ámbito privado. Desde esta perspectiva, el derecho familiar debería implementar las intenciones de los individuos —y no debería redistribuir los riesgos y los recursos de conformidad con algún ideal público—.”</w:t>
       </w:r>
     </w:p>
     <w:p>
@@ -1453,7 +1629,7 @@
         <w:pStyle w:val="Heading3"/>
       </w:pPr>
       <w:r>
-        <w:t>Derechos humanos, teorias y doc - Luis Manuel Marcano Salazar.pdf — p. 103 — similitud 0.0693</w:t>
+        <w:t>Curso de derechos humanos - Ana Maria Ibarra Olguin.pdf — p. 913 — similitud 0.1393</w:t>
       </w:r>
     </w:p>
     <w:p>
@@ -1461,7 +1637,7 @@
         <w:ind w:left="360"/>
       </w:pPr>
       <w:r>
-        <w:t>“En el mismo la Comisión explana enfáticamente como debe ser interpretado el artículo 30 de la Convención Americana sobre Derechos Humanos, criterio que esta a su vez compaginado con el discernimiento de la Corte Interamericana de Derechos Humanos, es decir ambos organismos integrantes del sistema de protección de los derechos humanos en Latinoamérica, no tienen divergencias y quien alegue mejor razonamiento a este precedente debe desmontar todo un sistema que poco a poco ha ido sentando unas bases sólidas en reconocimiento y defensa de los derechos humanos; por lo que: (…) Al respecto, la CIDH reitera que las únicas restricciones admisibles para regular el ejercicio y goce de los derechos...”</w:t>
+        <w:t>“El derecho a la seguridad social 913 causa de muerte —de viudez en el matrimonio y en el concubinato, de orfandad y ascendencia— y servicios de guarderías. La inmensa mayoría de sentencias de la SCJN sobre seguridad social se origina en litigios dentro del modelo contributivo de aseguramiento social. Las pocas que hay sobre “programas sociales”, o modelo de seguridad social no contributivo, no le dicen, por razones que habrá que explorar con más detenimiento, “derecho a la seguridad social” al derecho a la seguridad social.”</w:t>
       </w:r>
     </w:p>
     <w:p>
@@ -1469,7 +1645,7 @@
         <w:pStyle w:val="Heading3"/>
       </w:pPr>
       <w:r>
-        <w:t>Como se hicieron los Derechos H - Ricardo Rabinovich Berkman.pdf — p. 122 — similitud 0.0680</w:t>
+        <w:t>Derecho humano a la seguridad s - Jose Luis Belmont Lugo.pdf — p. 3 — similitud 0.1393</w:t>
       </w:r>
     </w:p>
     <w:p>
@@ -1477,7 +1653,7 @@
         <w:ind w:left="360"/>
       </w:pPr>
       <w:r>
-        <w:t>“Soy de tal clase social, tengo tales ingresos económicos, mi piel es de tal color, nací en un hogar de determinada religión, poseo esta inclinación sexual, sigo aquellas ideas políticas, padezco un defecto físico.,&gt; Así es que sugiere que la respuesta sólo podría surgir de un ejercicio mental Es decir, un procedimiento ficticio ¿Es ello un disparate? Todas las teorías pactistas, que plantean al contrato social como base de la estructura política y jurídica humana, parten de una ficción, que sus seguido- res saben perfectamente que lo es.”</w:t>
+        <w:t>“10 III. Fundamento constitucional y organismos de seguridad social . . . . . . . . . . . . . . . . . 11 3.”</w:t>
       </w:r>
     </w:p>
     <w:p>
@@ -1485,7 +1661,7 @@
         <w:pStyle w:val="Heading3"/>
       </w:pPr>
       <w:r>
-        <w:t>Derechos humanos, teorias y doc - Luis Manuel Marcano Salazar.pdf — p. 103 — similitud 0.0678</w:t>
+        <w:t>Curso de derechos humanos - Ana Maria Ibarra Olguin.pdf — p. 914 — similitud 0.1190</w:t>
       </w:r>
     </w:p>
     <w:p>
@@ -1493,7 +1669,7 @@
         <w:ind w:left="360"/>
       </w:pPr>
       <w:r>
-        <w:t>“Todo tratado en vigor obliga a las partes y debe ser cumplido por ellas de buena fe. Artículo 27. “El derecho interno y la observancia de los tratados”.”</w:t>
+        <w:t>“También encontró que la mayoría de las mujeres acceden como beneficiarias derivadas —175 derivadas por cada 100 beneficiarios derivados—. Sólo el 11% de las mujeres no pensionadas tiene acceso a la seguridad social contributiva y el 19% de los hombres son titulares de ese derecho derivado de su trayectoria laboral. Según la ENESS de 2007, una de las fuentes del informe, entre las mujeres mayores de 65 años el 38.4% accede al derecho de manera derivada y sólo 10.8% recibe una pensión, laboral o no laboral.”</w:t>
       </w:r>
     </w:p>
     <w:p>
@@ -1501,7 +1677,7 @@
         <w:pStyle w:val="Heading3"/>
       </w:pPr>
       <w:r>
-        <w:t>Derechos humanos, teorias y doc - Luis Manuel Marcano Salazar.pdf — p. 54 — similitud 0.0623</w:t>
+        <w:t>Curso de derechos humanos - Ana Maria Ibarra Olguin.pdf — p. 914 — similitud 0.1143</w:t>
       </w:r>
     </w:p>
     <w:p>
@@ -1509,7 +1685,7 @@
         <w:ind w:left="360"/>
       </w:pPr>
       <w:r>
-        <w:t>“• La doctrina de Jellinek, para quien la Declaración francesa emuló las declaraciones norteamericanas que a su vez surgieron ideológicamente de las concepciones puritanas mayormente inspiradas por inmigrantes protestantes. • La doctrina francesa, a partir de las tesis de Boutmy polemizando con Jellinek, que desecha tanto la paternidad americana como germánica, insistiendo en su derivación por el influjo de la literatura europea, y especialmente del pensamiento ilustrado francés del siglo XVIII. • La doctrina ecléctica, consistente en afirmar que son compatibles tanto el criterio de Jellinek como la tesis oposicionista de Boutmy.”</w:t>
+        <w:t>“Además, el volumen de decisiones de la SCJN sobre pensiones rebasa con mucho los fallos sobre beneficios por causa de muerte y sobre guarderías. Segura- mente esto está relacionado, pero habría que indagar más sobre el punto tomando en cuenta la distribución por género de trabajo formal en el mercado laboral y la titularidad de pensiones como asegurado primario.42 En relación con la pensión de viudez en el concubinato43 la jurisprudencia de la Corte ha sido bastante consistente:44 es constitucional la decisión legislativa respecto de qué uniones de hecho califican como sujetos de la seguridad social contributiva.”</w:t>
       </w:r>
     </w:p>
     <w:p>
@@ -1517,7 +1693,7 @@
         <w:pStyle w:val="Heading3"/>
       </w:pPr>
       <w:r>
-        <w:t>Como se hicieron los Derechos H - Ricardo Rabinovich Berkman.pdf — p. 261 — similitud 0.0556</w:t>
+        <w:t>El derecho a la seguridad socia - Diana Beatriz Gonzalez Carvallo.pdf — p. 305 — similitud 0.1090</w:t>
       </w:r>
     </w:p>
     <w:p>
@@ -1525,7 +1701,7 @@
         <w:ind w:left="360"/>
       </w:pPr>
       <w:r>
-        <w:t>“Estas ideas se notan en la doctrina del período "clásico" (siglo II y primera mitad del III), recopilada después en el Digesto. Vimos cómo Gayo recorda- ba: "la principal división jurídica de las personas es aquella según la cual los hombres o son libres o son siervos" (1.5.3).”</w:t>
+        <w:t>“Un cambio así empujaría, por supuesto, al SSDI en la dirección de convertirse en un programa de asistencia social, una dirección que muchos defensores de la seguridad social han rechazado (históricamente) por razones políticas.39 Un enfoque diferente sería alterar el SSDI para pagar más a quienes no tienen familia y menos a aquéllos que pueden contar con apoyo financiero familiar. Este enfoque no requeriría una prueba de medios económicos a gran escala, lo cual es administrativamente complejo y carga la marca de asistencia social que temen los defensores de la seguridad social.”</w:t>
       </w:r>
     </w:p>
     <w:p>
@@ -1533,7 +1709,7 @@
         <w:pStyle w:val="Heading3"/>
       </w:pPr>
       <w:r>
-        <w:t>Derechos humanos, teorias y doc - Luis Manuel Marcano Salazar.pdf — p. 20 — similitud 0.0514</w:t>
+        <w:t>El derecho a la seguridad socia - Diana Beatriz Gonzalez Carvallo.pdf — p. 195 — similitud 0.0950</w:t>
       </w:r>
     </w:p>
     <w:p>
@@ -1541,7 +1717,7 @@
         <w:ind w:left="360"/>
       </w:pPr>
       <w:r>
-        <w:t>“Teorías y doctrinas religión, aparte de su función redentora, pasa a ser considerada ante todo en su función civil. El humanismo vino a sustituir la visión del mundo vista bajo el prisma dogmático religioso; se enfoca una nueva perspectiva donde se refleja la racionalidad, en la que prima la idea del hombre como ser humano, verdadero e integral. Así, tanto la religión como la tolerancia religiosa son instrumentos válidos para asegurar el ideal de la paz civil.”</w:t>
+        <w:t>“171 La prestación de guarderías y las responsabilidades de cuidado en el contexto de la seguridad social operación de las Estancias Infantiles Sedesol, decidió modificar la modalidad del programa, que pasó de transferencias condicionadas a transferencias monetarias directas. Entre las diferencias entre el PEI y Programa de Apoyo para el Bienestar de Niños y Niñas, Hijos de Madres Trabajadoras (PABHHMT) se destaca que, mientras el primero pone en el centro a las madres trabajadoras, el segundo hace referencia al bienestar de niñas y niños.”</w:t>
       </w:r>
     </w:p>
     <w:p>
@@ -1549,7 +1725,7 @@
         <w:pStyle w:val="Heading3"/>
       </w:pPr>
       <w:r>
-        <w:t>Como se hicieron los Derechos H - Ricardo Rabinovich Berkman.pdf — p. 148 — similitud 0.0495</w:t>
+        <w:t>El derecho a la seguridad socia - Diana Beatriz Gonzalez Carvallo.pdf — p. 283 — similitud 0.0926</w:t>
       </w:r>
     </w:p>
     <w:p>
@@ -1557,7 +1733,7 @@
         <w:ind w:left="360"/>
       </w:pPr>
       <w:r>
-        <w:t>“Por comenzar, chocaron estas predicaciones con mi formación previa, muy crítica y muy laica. Pero ade- más, me resultaron completamente insuficientes los fundamentos que casi todos mis profesores y la gran mayoría de las obras que leía entonces, esgri- mían para defender esas prerrogativas.”</w:t>
+        <w:t>“259 ¿Tragedias privadas? El derecho familiar como seguro social En este ensayo, comienzo a integrar el derecho familiar y la seguridad social con el objetivo de obtener un mejor entendimiento de ambos regímenes y de la relación entre ellos. Para hacer que la discusión sea concreta, considero dos casos —uno que involucra la manutención conyugal y la discapacidad y otro que comprende la manutención infantil para familias múltiples— y demuestro que éstos ilustran dos puntos de solapamiento entre el derecho familiar y la seguridad social.”</w:t>
       </w:r>
     </w:p>
     <w:p>
@@ -1565,7 +1741,7 @@
         <w:pStyle w:val="Heading3"/>
       </w:pPr>
       <w:r>
-        <w:t>Derechos humanos, teorias y doc - Luis Manuel Marcano Salazar.pdf — p. 17 — similitud 0.0493</w:t>
+        <w:t>El derecho a la seguridad socia - Diana Beatriz Gonzalez Carvallo.pdf — p. 121 — similitud 0.0923</w:t>
       </w:r>
     </w:p>
     <w:p>
@@ -1573,7 +1749,7 @@
         <w:ind w:left="360"/>
       </w:pPr>
       <w:r>
-        <w:t>“Luis Manuel Marcano Salazar derechos humanos, han venido desarrollando una base jurisprudencial que si bien en principio se avocaba a proteger los derechos civiles y políticos, los derechos sociales emergieron con fuerza además de los derechos de los pueblos indígenas, su alcance sin duda va mucho más allá; proteger una porción de la tierra y a sus habitantes con arraigo y fundamento en un derecho ancestral, conlleva también a la protección del derecho a la vida transgeneracional, puesta en peligro por la devastación ambiental.”</w:t>
+        <w:t>“Los tratados y convenciones internacionales sobre derechos humanos actúan, entonces, como directrices e imponen a los Estados parte la obligación de adoptar medidas adecuadas que permitan erradicar las diferencias entre hom- bres y mujeres. Este deber de adoptar medidas tendientes a erradicar estas diferencias incluye la obligación de tomar las acciones positivas necesarias para eliminar patrones socioculturales que perpetúan relaciones de jerarquía entre hombres y mujeres y ponen en cabeza de la mujer las obligaciones domésticas y de cuidado.”</w:t>
       </w:r>
     </w:p>
     <w:p>
@@ -1581,7 +1757,7 @@
         <w:pStyle w:val="Heading3"/>
       </w:pPr>
       <w:r>
-        <w:t>Derechos humanos, teorias y doc - Luis Manuel Marcano Salazar.pdf — p. 112 — similitud 0.0491</w:t>
+        <w:t>Constitucion Politica de los Es - Camara de Diputados del H. Cong.pdf — p. 101 — similitud 0.0914</w:t>
       </w:r>
     </w:p>
     <w:p>
@@ -1589,7 +1765,7 @@
         <w:ind w:left="360"/>
       </w:pPr>
       <w:r>
-        <w:t>“Teorías y doctrinas que recae intrínsecamente en el Estado. Este concepto « tradicional » ha evolucionado, pues la tendencia actual es la ser una obligación positiva, primando la dignidad humana como parte del derecho a la vida. El derecho a la vida indubitablemente es el derecho matriz de los otros derechos de la persona, aunque de acuerdo a la Declaración de Viena, adoptada por la segunda Conferencia Mundial sobre Derechos Humanos, celebrada en Viena en 1993: “Todos los derechos humanos son universales, indivisibles e interdependientes y están relacionados entre sí.”</w:t>
+        <w:t>“Para que un ciudadano pueda acudir a la jurisdicción del Tribunal por violaciones a sus derechos por el partido político al que se encuentre afiliado, deberá haber agotado previamente las instancias de solución de conflictos previstas en sus normas internas, la ley establecerá las reglas y plazos aplicables; VI. Los conflictos o diferencias laborales entre el Tribunal y sus servidores; VII. Los conflictos o diferencias laborales entre el Instituto Nacional Electoral y sus servidores; Fracción reformada DOF 10-02-2014 VIII.”</w:t>
       </w:r>
     </w:p>
     <w:p>
@@ -1597,7 +1773,7 @@
         <w:pStyle w:val="Heading3"/>
       </w:pPr>
       <w:r>
-        <w:t>Derechos humanos, teorias y doc - Luis Manuel Marcano Salazar.pdf — p. 71 — similitud 0.0490</w:t>
+        <w:t>El derecho a la seguridad socia - Diana Beatriz Gonzalez Carvallo.pdf — p. 30 — similitud 0.0888</w:t>
       </w:r>
     </w:p>
     <w:p>
@@ -1605,7 +1781,7 @@
         <w:ind w:left="360"/>
       </w:pPr>
       <w:r>
-        <w:t>“La tradición de la ley de la naturaleza una vez más se convirtió en un elemento vital en la afirmación de la dignidad de la persona y en el deseo de encontrar una base en la ley más duradera que la voluntad del soberano pudiere ejecutar. Una de las manifestaciones más características de la Alemania nacional- socialista y la doctrina italiana fascista era negar los derechos; de donde el derecho natural se imbricó en las bases racionalistas, por lo que se puede explicar el fervor y la intensidad de la reaparición de la idea con fundamento en el derecho natural.”</w:t>
+        <w:t>“Y de esta relación trata este capítulo, que, con base en un enfoque de género y derechos humanos, presenta, en primer lugar, las diferencias conceptuales entre el derecho a la seguridad social y al cuidado, para luego desarrollar la recepción en Pactos y Tratados Internacionales y en las constituciones en América Latina, y, cuando corresponda, en el campo de las políticas públicas y en la jurisprudencia. Especial interés reviste identificar elementos comunes y diferenciales que dan cuenta de la interdependencia entre el derecho la seguridad social y al cuidado.”</w:t>
       </w:r>
     </w:p>
     <w:p>
@@ -1613,7 +1789,7 @@
         <w:pStyle w:val="Heading3"/>
       </w:pPr>
       <w:r>
-        <w:t>Derechos humanos, teorias y doc - Luis Manuel Marcano Salazar.pdf — p. 53 — similitud 0.0487</w:t>
+        <w:t>El derecho a la seguridad socia - Diana Beatriz Gonzalez Carvallo.pdf — p. 178 — similitud 0.0846</w:t>
       </w:r>
     </w:p>
     <w:p>
@@ -1621,7 +1797,7 @@
         <w:ind w:left="360"/>
       </w:pPr>
       <w:r>
-        <w:t>“Luis Manuel Marcano Salazar • La filosofía jurídica de Locke, fundadora de la doctrina liberal fue recogida en los textos de Derecho positivo; la libertad religiosa en un principio fue la bandera a izar, en «búsqueda de la felicidad» el iusnaturalismo fue útil en la mezcla del racionalismo y pragmatismo. • La separación de los poderes públicos en el ejercicio de sus funciones, encuentra en Norteamérica sus más fieros defensores quienes transfieren esta doctrina a la Francia revolucionaria, quedando establecido para la posteridad el lacónico pero contundente artículo 16 de la Declaración Francesa. “Toda sociedad en la que la garantía de los derechos no esté asegurada, ni determinada la...”</w:t>
+        <w:t>“Scavino establece diferencias entre las políticas de tiempo para cuidar, las políticas de dinero por cuidar y los servicios de cuidados.48 A continuación analizaremos cada uno de estos tipos de políticas. Políticas de tiempo Las políticas de tiempo se popularizaron a partir de la Conferencia de Beijing, que puso énfasis en las diferencias en los tiempos de trabajo entre mujeres y hombres, con base en encuestas de usos del tiempo, que hicieron visibles las desigualdades enormes entre mujeres y varones en los tiempos de trabajo dedicados a la producción y la reproducción.”</w:t>
       </w:r>
     </w:p>
     <w:p>
@@ -1629,7 +1805,7 @@
         <w:pStyle w:val="Heading3"/>
       </w:pPr>
       <w:r>
-        <w:t>Derechos humanos, teorias y doc - Luis Manuel Marcano Salazar.pdf — p. 53 — similitud 0.0457</w:t>
+        <w:t>Derecho de la seguridad social - Alberto Briceno Ruiz.pdf — p. 93 — similitud 0.0845</w:t>
       </w:r>
     </w:p>
     <w:p>
@@ -1637,7 +1813,7 @@
         <w:ind w:left="360"/>
       </w:pPr>
       <w:r>
-        <w:t>“En la magnánima obra de: Jay, Hamilton y Madison“El Federalista”, más que ninguna otra, se visualizan los ideales de los padres fundadores; al exponer la separación de los poderes, como uno de los fundamentos de la democracia representativa, la describen así: “La distribución ordenada del poder en distintos departamentos; la introducción de frenos y contrapesos legislativos; la institución de tribunales integrados por jueces que conservaran su cargo mientras observen buena conducta; la representación del pueblo en la legislatura por medio de diputados de su elección.”38 La inmanencia de la Constitución como norma suprema se ha convertido en un legado del constitucionalismo Norteamericano...”</w:t>
+        <w:t>“Es necesario en ese caso asignar algún subsidio público, algo que estamos evaluando, estamos haciendo los cálculos, pero sabemos que hay que disminuir esa contribución a cargo del trabajador por cuenta propia.30 El libro de González Roaro hace un análisis comparativo de la situación en los países de América, a propósito de las pensiones: ...algunos países registran diferencias en las edades de los hombres y las mujeres para ser acreedores a la pensión por vejez: la Argentina, el Brasil, Colombia, Costa Rica, Cuba, Chile, El Salvador, Honduras, Jamaica, Panamá, el Perú y Venezuela. En estos, las edades fluctúan entre 55 y 60 años para las mujeres y 65 para los hombres.”</w:t>
       </w:r>
     </w:p>
     <w:p>
@@ -1645,7 +1821,7 @@
         <w:pStyle w:val="Heading3"/>
       </w:pPr>
       <w:r>
-        <w:t>Derechos humanos, teorias y doc - Luis Manuel Marcano Salazar.pdf — p. 53 — similitud 0.0456</w:t>
+        <w:t>Ley del Instituto de Seguridad - Camara de Diputados del H. Cong.pdf — p. 92 — similitud 0.0791</w:t>
       </w:r>
     </w:p>
     <w:p>
@@ -1653,23 +1829,7 @@
         <w:ind w:left="360"/>
       </w:pPr>
       <w:r>
-        <w:t>“o un alto sentido de los principios y valores constitucionales, originando una forma de gobierno; (…) bajo el influjo de América, se han erigido, en reglas de derecho, los principios de libertad, y lo han hecho para toda Europa.”</w:t>
-      </w:r>
-    </w:p>
-    <w:p>
-      <w:pPr>
-        <w:pStyle w:val="Heading3"/>
-      </w:pPr>
-      <w:r>
-        <w:t>Derechos humanos, teorias y doc - Luis Manuel Marcano Salazar.pdf — p. 87 — similitud 0.0446</w:t>
-      </w:r>
-    </w:p>
-    <w:p>
-      <w:pPr>
-        <w:ind w:left="360"/>
-      </w:pPr>
-      <w:r>
-        <w:t>“Las decisiones de la comisión en casos contra Argentina, Uruguay, El Salvador, Chile y Perú abrieron una puerta que ha permitido sentar en el banquillo de los acusados a los responsables de los golpes de Estado y del asesinato y desaparición de miles de personas. En el segundo caso, la derogación de las leyes que sancionan la crítica a funcionarios públicos -desacato- conjuntamente con la sanción de leyes de acceso a la información están consolidando la democracia, al permitir la crítica de las autoridades sin riesgo de represalias y la transparencia del accionar de los gobernantes.”</w:t>
+        <w:t>“TRIGÉSIMO NOVENO. Cuando por disposición de leyes como la de Veteranos de la Revolución o cualesquiera otras que deban aplicarse concomitantemente con la presente Ley, se establezcan beneficios superiores a favor de los Trabajadores computándoles mayor número de años de servicio o tomando como base un sueldo superior al Sueldo Básico para la determinación de la Pensión, el pago de las diferencias favorables al Trabajador será por cuenta exclusiva de la Dependencia o Entidad pública a cuyo cargo determinen esas leyes las diferencias.”</w:t>
       </w:r>
     </w:p>
     <w:p>
@@ -1680,7 +1840,7 @@
         <w:t xml:space="preserve">Observación automática: </w:t>
       </w:r>
       <w:r>
-        <w:t>La ficha presenta coincidencias débiles; se recomienda validar manualmente las citas. Se agruparon referencias de múltiples fuentes para enriquecer el concepto. Hay 19 referencia(s) de baja similitud que podrían introducir ruido.</w:t>
+        <w:t>La ficha presenta una coincidencia fuerte con el concepto buscado. Se agruparon referencias de múltiples fuentes para enriquecer el concepto. Hay 1 referencia(s) de baja similitud que podrían introducir ruido.</w:t>
       </w:r>
     </w:p>
     <w:p>
@@ -1688,7 +1848,7 @@
         <w:pStyle w:val="Heading2"/>
       </w:pPr>
       <w:r>
-        <w:t>Ficha 05. Seguro privado</w:t>
+        <w:t>Ficha 05. los elementos</w:t>
       </w:r>
     </w:p>
     <w:p>
@@ -1699,7 +1859,7 @@
         <w:t xml:space="preserve">Fuentes: </w:t>
       </w:r>
       <w:r>
-        <w:t>Como se hicieron los Derechos H - Ricardo Rabinovich Berkman.pdf; Derechos humanos, teorias y doc - Luis Manuel Marcano Salazar.pdf; Los derechos humanos en Mexico - Emilio Alvarez Icaza Longoria.pdf</w:t>
+        <w:t>Constitucion Politica de los Es - Camara de Diputados del H. Cong.pdf; Curso de derechos humanos - Ana Maria Ibarra Olguin.pdf; Derecho de la seguridad social - Alberto Briceno Ruiz.pdf; Ley del Instituto de Seguridad - Camara de Diputados del H. Cong.pdf; Ley del Seguro Social - Camara de Diputados del H. Cong.pdf</w:t>
       </w:r>
     </w:p>
     <w:p>
@@ -1710,7 +1870,7 @@
         <w:t xml:space="preserve">Ubicaciones: </w:t>
       </w:r>
       <w:r>
-        <w:t>Como se hicieron los Derechos H - Ricardo Rabinovich Berkman.pdf, p. 125; Como se hicieron los Derechos H - Ricardo Rabinovich Berkman.pdf, p. 141; Como se hicieron los Derechos H - Ricardo Rabinovich Berkman.pdf, p. 151; Como se hicieron los Derechos H - Ricardo Rabinovich Berkman.pdf, p. 198; Como se hicieron los Derechos H - Ricardo Rabinovich Berkman.pdf, p. 211; Como se hicieron los Derechos H - Ricardo Rabinovich Berkman.pdf, p. 217; Como se hicieron los Derechos H - Ricardo Rabinovich Berkman.pdf, p. 247; Derechos humanos, teorias y doc - Luis Manuel Marcano Salazar.pdf, p. 113; Derechos humanos, teorias y doc - Luis Manuel Marcano Salazar.pdf, p. 128; Derechos humanos, teorias y doc - Luis Manuel Marcano Salazar.pdf, p. 135; Derechos humanos, teorias y doc - Luis Manuel Marcano Salazar.pdf, p. 148; Derechos humanos, teorias y doc - Luis Manuel Marcano Salazar.pdf, p. 16; Derechos humanos, teorias y doc - Luis Manuel Marcano Salazar.pdf, p. 23; Derechos humanos, teorias y doc - Luis Manuel Marcano Salazar.pdf, p. 29; Derechos humanos, teorias y doc - Luis Manuel Marcano Salazar.pdf, p. 56; Derechos humanos, teorias y doc - Luis Manuel Marcano Salazar.pdf, p. 82; Los derechos humanos en Mexico - Emilio Alvarez Icaza Longoria.pdf, p. 29; Los derechos humanos en Mexico - Emilio Alvarez Icaza Longoria.pdf, p. 47; Los derechos humanos en Mexico - Emilio Alvarez Icaza Longoria.pdf, p. 52; Los derechos humanos en Mexico - Emilio Alvarez Icaza Longoria.pdf, p. 56; Los derechos humanos en Mexico - Emilio Alvarez Icaza Longoria.pdf, p. 57; Los derechos humanos en Mexico - Emilio Alvarez Icaza Longoria.pdf, p. 61; Los derechos humanos en Mexico - Emilio Alvarez Icaza Longoria.pdf, p. 69</w:t>
+        <w:t>Constitucion Politica de los Es - Camara de Diputados del H. Cong.pdf, p. 340; Curso de derechos humanos - Ana Maria Ibarra Olguin.pdf, p. 187; Curso de derechos humanos - Ana Maria Ibarra Olguin.pdf, p. 188; Curso de derechos humanos - Ana Maria Ibarra Olguin.pdf, p. 356; Derecho de la seguridad social - Alberto Briceno Ruiz.pdf, p. 13; Derecho de la seguridad social - Alberto Briceno Ruiz.pdf, p. 147; Derecho de la seguridad social - Alberto Briceno Ruiz.pdf, p. 149; Derecho de la seguridad social - Alberto Briceno Ruiz.pdf, p. 157; Derecho de la seguridad social - Alberto Briceno Ruiz.pdf, p. 23; Derecho de la seguridad social - Alberto Briceno Ruiz.pdf, p. 261; Derecho de la seguridad social - Alberto Briceno Ruiz.pdf, p. 264; Derecho de la seguridad social - Alberto Briceno Ruiz.pdf, p. 265; Derecho de la seguridad social - Alberto Briceno Ruiz.pdf, p. 266; Derecho de la seguridad social - Alberto Briceno Ruiz.pdf, p. 4; Derecho de la seguridad social - Alberto Briceno Ruiz.pdf, p. 67; Ley del Instituto de Seguridad - Camara de Diputados del H. Cong.pdf, p. 23; Ley del Seguro Social - Camara de Diputados del H. Cong.pdf, p. 11; Ley del Seguro Social - Camara de Diputados del H. Cong.pdf, p. 12; Ley del Seguro Social - Camara de Diputados del H. Cong.pdf, p. 13; Ley del Seguro Social - Camara de Diputados del H. Cong.pdf, p. 35; Ley del Seguro Social - Camara de Diputados del H. Cong.pdf, p. 58</w:t>
       </w:r>
     </w:p>
     <w:p>
@@ -1718,7 +1878,7 @@
         <w:pStyle w:val="Heading3"/>
       </w:pPr>
       <w:r>
-        <w:t>Los derechos humanos en Mexico - Emilio Alvarez Icaza Longoria.pdf — p. 56 — similitud 0.0970</w:t>
+        <w:t>Derecho de la seguridad social - Alberto Briceno Ruiz.pdf — p. 147 — similitud 0.2342</w:t>
       </w:r>
     </w:p>
     <w:p>
@@ -1726,7 +1886,7 @@
         <w:ind w:left="360"/>
       </w:pPr>
       <w:r>
-        <w:t>“Asimetrías y déficit La situación de los derechos humanos en nuestro país es alta- mente preocupante. Temas como la seguridad humana, la seguridad pública, la justicia y la convivencia social son todavía asignaturas pendientes. Por lo mismo, la igualdad, accesibilidad, no discrimina- ción y equidad de género se imponen como aspectos esenciales para la consolidación de una verdadera sociedad democrática.”</w:t>
+        <w:t>“84 contiene los elementos integradores del salario. La l s s hace su propia integración del salario base de cotización, con el mismo texto del art. 84 de la ley laboral: Para efectos de esta Ley, el salario base de cotización se integra con los pagos hechos en efectivo por cuota diaria, gratificaciones, percepciones, alimentación, habitación, primas, comisiones, prestaciones en especie y cualquier otra cantidad o prestación que se integre el trabajador por su trabajo, con excepción de los conceptos previstos en el artículo 27 de la Ley.”</w:t>
       </w:r>
     </w:p>
     <w:p>
@@ -1734,7 +1894,7 @@
         <w:pStyle w:val="Heading3"/>
       </w:pPr>
       <w:r>
-        <w:t>Derechos humanos, teorias y doc - Luis Manuel Marcano Salazar.pdf — p. 82 — similitud 0.0806</w:t>
+        <w:t>Ley del Seguro Social - Camara de Diputados del H. Cong.pdf — p. 12 — similitud 0.2198</w:t>
       </w:r>
     </w:p>
     <w:p>
@@ -1742,7 +1902,7 @@
         <w:ind w:left="360"/>
       </w:pPr>
       <w:r>
-        <w:t>“forma enmendada por el Protocolo N º 11 • Protocolo N º 5 de la Convención para la Protección de los Derechos Humanos y las Libertades Fundamentales, se modifican los artículos 22 y 40 de la Convención • Convenio Europeo para la adopción de niños • Convenio europeo sobre la repatriación de los menores • Convenio europeo sobre inmunidad de los Estados • Protocolo adicional al Convenio Europeo para la inmunidad de los Estado • Convenio Europeo para la Seguridad Social • Acuerdo Complementario para la Aplicación de la Convención Europea para la Seguridad Social • Convenio Europeo sobre la no Aplicabilidad de las Limitaciones legales a los crímenes de lesa humanidad y crímenes de guerra •...”</w:t>
+        <w:t>“Cuando además de los elementos fijos del salario el trabajador percibiera regularmente otras retribuciones periódicas de cuantía previamente conocida, éstas se sumarán a dichos elementos fijos; II. Si por la naturaleza del trabajo, el salario se integra con elementos variables que no puedan ser previamente conocidos, se sumarán los ingresos totales percibidos durante los dos meses inmediatos anteriores y se dividirán entre el número de días de salario devengado en ese período.”</w:t>
       </w:r>
     </w:p>
     <w:p>
@@ -1750,7 +1910,7 @@
         <w:pStyle w:val="Heading3"/>
       </w:pPr>
       <w:r>
-        <w:t>Derechos humanos, teorias y doc - Luis Manuel Marcano Salazar.pdf — p. 128 — similitud 0.0782</w:t>
+        <w:t>Derecho de la seguridad social - Alberto Briceno Ruiz.pdf — p. 157 — similitud 0.2084</w:t>
       </w:r>
     </w:p>
     <w:p>
@@ -1758,7 +1918,7 @@
         <w:ind w:left="360"/>
       </w:pPr>
       <w:r>
-        <w:t>“Como colaboradores sociales, seguiremos bregando por la formación de asociaciones estables con todos los grandes grupos, respetando el importante papel independiente que desempeña cada uno de ellos. 9.- Conviniendo que en la realización de sus actividades legítimas el sector privado, incluidas tanto las grandes empresas como las pequeñas, tiene el deber de contribuir a la evolución de comunidades y sociedades equitativas y sostenibles. 10.”</w:t>
+        <w:t>“Salario base de cotización y cuota 141 el salario fuera variable. Cuando se trate de salario mixto, deberá observarse si el cambio es en el elemento fijo o en los elementos variables, para seguir el plazo de cinco o 15 días, establecido para cada supuesto.”</w:t>
       </w:r>
     </w:p>
     <w:p>
@@ -1766,7 +1926,7 @@
         <w:pStyle w:val="Heading3"/>
       </w:pPr>
       <w:r>
-        <w:t>Los derechos humanos en Mexico - Emilio Alvarez Icaza Longoria.pdf — p. 61 — similitud 0.0744</w:t>
+        <w:t>Ley del Seguro Social - Camara de Diputados del H. Cong.pdf — p. 11 — similitud 0.2060</w:t>
       </w:r>
     </w:p>
     <w:p>
@@ -1774,7 +1934,7 @@
         <w:ind w:left="360"/>
       </w:pPr>
       <w:r>
-        <w:t>“Por ello, construir un sistema de seguridad pública eficaz y confiable implica que reconozcamos la complejidad de la tarea de mantener el orden público en congruencia con la vigencia integral de los derechos humanos de cada persona, tanto los civiles y políti- cos, como los económicos, sociales y culturales.”</w:t>
+        <w:t>“El tiempo extraordinario dentro de los márgenes señalados en la Ley Federal del Trabajo. Para que los conceptos mencionados en este precepto se excluyan como integrantes del salario base de cotización, deberán estar debidamente registrados en la contabilidad del patrón. En los conceptos previstos en las fracciones VI, VII y IX cuando el importe de estas prestaciones rebase el porcentaje establecido, solamente se integrarán los excedentes al salario base de cotización.”</w:t>
       </w:r>
     </w:p>
     <w:p>
@@ -1782,7 +1942,7 @@
         <w:pStyle w:val="Heading3"/>
       </w:pPr>
       <w:r>
-        <w:t>Los derechos humanos en Mexico - Emilio Alvarez Icaza Longoria.pdf — p. 29 — similitud 0.0743</w:t>
+        <w:t>Ley del Seguro Social - Camara de Diputados del H. Cong.pdf — p. 35 — similitud 0.2016</w:t>
       </w:r>
     </w:p>
     <w:p>
@@ -1790,7 +1950,7 @@
         <w:ind w:left="360"/>
       </w:pPr>
       <w:r>
-        <w:t>“28 Los derechos humanos en México 2) El derecho a la seguridad social, a un nivel de vida adecuado y a los niveles más altos posibles de bienestar físico y mental. 3) El derecho a la educación y el disfrute de los beneficios de la libertad cultural y el progreso científico.”</w:t>
+        <w:t>“Artículo 107. Las prestaciones en dinero del seguro de enfermedades y maternidad se financiarán con una cuota del uno por ciento sobre el salario base de cotización, que se pagará de la forma siguiente: I. A los patrones les corresponderá pagar el setenta por ciento de dicha cuota; II.”</w:t>
       </w:r>
     </w:p>
     <w:p>
@@ -1798,7 +1958,7 @@
         <w:pStyle w:val="Heading3"/>
       </w:pPr>
       <w:r>
-        <w:t>Los derechos humanos en Mexico - Emilio Alvarez Icaza Longoria.pdf — p. 52 — similitud 0.0732</w:t>
+        <w:t>Ley del Seguro Social - Camara de Diputados del H. Cong.pdf — p. 12 — similitud 0.1965</w:t>
       </w:r>
     </w:p>
     <w:p>
@@ -1806,7 +1966,7 @@
         <w:ind w:left="360"/>
       </w:pPr>
       <w:r>
-        <w:t>“Esto habrá de ser un instrumento valioso que señale a las auto- ridades lo que está detrás de cada uno de los expedientes de queja; es decir: las personas. Cabe señalar que el modelo de queja es enmarcado dentro de un Modelo Institucional, cuyo objetivo es la construcción de una ins- titución que defienda los derechos humanos de las y los ciudadanos (Defensoría del Pueblo). Modelo de la CDHDF De este modo, el Modelo se basa en los siguientes principios: Autonomía.”</w:t>
+        <w:t>“Si se trata de un trabajador de nuevo ingreso, se tomará el salario probable que le corresponda en dicho período, y Fracción reformada DOF 20-12-2001 III. En los casos en que el salario de un trabajador se integre con elementos fijos y variables, se considerará de carácter mixto, por lo que, para los efectos de cotización, se sumará a los elementos fijos el promedio obtenido de los variables en términos de lo que se establece en la fracción anterior. Artículo 31.”</w:t>
       </w:r>
     </w:p>
     <w:p>
@@ -1814,7 +1974,7 @@
         <w:pStyle w:val="Heading3"/>
       </w:pPr>
       <w:r>
-        <w:t>Derechos humanos, teorias y doc - Luis Manuel Marcano Salazar.pdf — p. 113 — similitud 0.0716</w:t>
+        <w:t>Derecho de la seguridad social - Alberto Briceno Ruiz.pdf — p. 4 — similitud 0.1958</w:t>
       </w:r>
     </w:p>
     <w:p>
@@ -1822,7 +1982,7 @@
         <w:ind w:left="360"/>
       </w:pPr>
       <w:r>
-        <w:t>“Este derecho estará protegido por la ley. Nadie podrá ser privado de la vida arbitrariamente. 4.1.3.- Declaración Americana de los Derechos y Deberes del Hombre Artículo I.”</w:t>
+        <w:t>“C O L E C C I Ó N T E X T O S J U R Í D I C O S U N I V E R S I T A R I O S Derecho de la seguridad social Alberto Briceño Ruiz U n iv er sid a d N a c io n a l A u t ó n o m a de M éxico O X FO R D l í N I V E R S I T Y PRESS”</w:t>
       </w:r>
     </w:p>
     <w:p>
@@ -1830,7 +1990,7 @@
         <w:pStyle w:val="Heading3"/>
       </w:pPr>
       <w:r>
-        <w:t>Los derechos humanos en Mexico - Emilio Alvarez Icaza Longoria.pdf — p. 61 — similitud 0.0691</w:t>
+        <w:t>Derecho de la seguridad social - Alberto Briceno Ruiz.pdf — p. 261 — similitud 0.1945</w:t>
       </w:r>
     </w:p>
     <w:p>
@@ -1838,7 +1998,7 @@
         <w:ind w:left="360"/>
       </w:pPr>
       <w:r>
-        <w:t>“6.6 Seguridad pública Uno de los grandes retos a vencer en nuestro país es el relacionado con la inseguridad pública, la cual tiene sus orígenes en diversos pro- blemas estructurales de la sociedad. Atender este problema no es una tarea sencilla.”</w:t>
+        <w:t>“Los elementos de prueba quedan a cargo del Instituto, cuando el obligado niegue la existencia de la relación laboral. Elementos Los elementos son los siguientes: La calificación médica del riesgo de trabajo. Fincamiento al inicio de la atención de los capitales constitutivos.”</w:t>
       </w:r>
     </w:p>
     <w:p>
@@ -1846,7 +2006,7 @@
         <w:pStyle w:val="Heading3"/>
       </w:pPr>
       <w:r>
-        <w:t>Derechos humanos, teorias y doc - Luis Manuel Marcano Salazar.pdf — p. 56 — similitud 0.0646</w:t>
+        <w:t>Constitucion Politica de los Es - Camara de Diputados del H. Cong.pdf — p. 340 — similitud 0.1945</w:t>
       </w:r>
     </w:p>
     <w:p>
@@ -1854,7 +2014,7 @@
         <w:ind w:left="360"/>
       </w:pPr>
       <w:r>
-        <w:t>“Sin embargo, también patrocina la necesidad de un pacto entre las individualidades para formar un gobierno (…) las voluntades individuales siguen siendo el origen y forman los elementos esenciales; pero, consideradas separadamente, su poder sería nulo, puesto que sólo reside en el conjunto44.Tal es el origen de un gobierno, ejercido por procuración; coincide con Locke, en legar una porción de poder «a algunos de ellos» el pueblo es numeroso y es imposible consultarlo en su totalidad por toda la nación; esta delegación no implica un desprendimiento total del poder soberano. Expone su celebre tesis acerca del poder constituyente originario de esta manera:”</w:t>
+        <w:t>“De igual forma, el Ejecutivo Federal dispondrá lo necesario para la incorporación de los elementos de las policías Militar y Naval a la Guardia Nacional y designará al titular del órgano de mando superior y a los integrantes de la instancia de coordinación operativa interinstitucional formada por representantes de las secretarías del ramo de seguridad, de la Defensa Nacional y de Marina. Tercero.”</w:t>
       </w:r>
     </w:p>
     <w:p>
@@ -1862,7 +2022,7 @@
         <w:pStyle w:val="Heading3"/>
       </w:pPr>
       <w:r>
-        <w:t>Como se hicieron los Derechos H - Ricardo Rabinovich Berkman.pdf — p. 198 — similitud 0.0593</w:t>
+        <w:t>Ley del Seguro Social - Camara de Diputados del H. Cong.pdf — p. 11 — similitud 0.1931</w:t>
       </w:r>
     </w:p>
     <w:p>
@@ -1870,7 +2030,7 @@
         <w:ind w:left="360"/>
       </w:pPr>
       <w:r>
-        <w:t>“Como ésta, también del Éxodo, que se relaciona con disposiciones de la piedra de Ha- mmurabi: "El que hiera a un hombre de modo que en efecto muera, ha de ser muerto sin falta" (21.12). Otras, buscan resguardar elementos esenciales del ser humano en forma bastante minuciosa: "Y en caso de que unos hombres se pongan a reñir y uno efectivamente hiera a su prójimo con una piedra o un azadón y este no mue- ra, pero tenga que quedarse en cama; sí se levanta y va andando fuera sobre algún sostén suyo, entonces el que lo haya herido tiene que estar libre de cas- tigo; dará compensación solo por el tiempo que se haya perdido del trabajo de aquel hasta que lo tenga completamente sanado" (21,18-19).”</w:t>
+        <w:t>“Artículo 28 A. La base de cotización para los sujetos obligados señalados en la fracción II del artículo 12 de esta Ley, se integrará por el total de las percepciones que reciban por la aportación de su trabajo personal, aplicándose en lo conducente lo establecido en los artículos 28, 29, 30, 32 y demás aplicables de esta Ley.”</w:t>
       </w:r>
     </w:p>
     <w:p>
@@ -1878,7 +2038,7 @@
         <w:pStyle w:val="Heading3"/>
       </w:pPr>
       <w:r>
-        <w:t>Los derechos humanos en Mexico - Emilio Alvarez Icaza Longoria.pdf — p. 57 — similitud 0.0585</w:t>
+        <w:t>Derecho de la seguridad social - Alberto Briceno Ruiz.pdf — p. 266 — similitud 0.1745</w:t>
       </w:r>
     </w:p>
     <w:p>
@@ -1886,7 +2046,7 @@
         <w:ind w:left="360"/>
       </w:pPr>
       <w:r>
-        <w:t>“56 Los derechos humanos en México Se está muy lejos de la igualdad total si se considera que 96.2 por ciento de los presidentes municipales son hombres; que en 2007 la relación entre diputados y diputadas locales era de 3 a 1; que en 2008 la relación de jueces y magistrados era de 2 por cada jueza o magis- trado y que, además, los funcionarios y directivos del sector público, privado y social son en su mayoría hombres (72.5 por ciento).”</w:t>
+        <w:t>“Por lo demás, el fundar el cobro de un capital constitutivo derivado de un accidente de trabajo, no basta para satisfacer la exigencia del artículo 16 constitucional, es necesario que se citen preceptos legales que en forma genérica definen lo que es un accidente de trabajo o la obligación del patrón de responder de la responsabilidad derivada de ese accidente, etc., sino que es menester que en cada renglón individual del cobro que constituye el capital constitutivo, encuentre su monto preciso justificado en un precepto legal.”</w:t>
       </w:r>
     </w:p>
     <w:p>
@@ -1894,7 +2054,7 @@
         <w:pStyle w:val="Heading3"/>
       </w:pPr>
       <w:r>
-        <w:t>Los derechos humanos en Mexico - Emilio Alvarez Icaza Longoria.pdf — p. 69 — similitud 0.0576</w:t>
+        <w:t>Derecho de la seguridad social - Alberto Briceno Ruiz.pdf — p. 261 — similitud 0.1690</w:t>
       </w:r>
     </w:p>
     <w:p>
@@ -1902,7 +2062,7 @@
         <w:ind w:left="360"/>
       </w:pPr>
       <w:r>
-        <w:t>“68 Los derechos humanos en México Modelo integral de defensa. Modelo de defensa que coloca en el cen- tro a las personas al asumirlas como ciudadanas y ciudadanos que ejercen sus derechos.”</w:t>
+        <w:t>“La notificación legal al patrón del fincamiento de la estimación del capital constitutivo previo y del fincamiento posterior del capital cons­ titutivo final, con respeto a su derecho de oponerse y ofrecer elementos de prueba. Cada uno de los elementos puede ser motivo de impugnación, si no está fehaciente y exhaustivamente demostrado por el IMSS, en el momento de emi­ tir las cédulas de liquidación, en los términos del art. 40 de la'LSS.”</w:t>
       </w:r>
     </w:p>
     <w:p>
@@ -1910,7 +2070,7 @@
         <w:pStyle w:val="Heading3"/>
       </w:pPr>
       <w:r>
-        <w:t>Derechos humanos, teorias y doc - Luis Manuel Marcano Salazar.pdf — p. 23 — similitud 0.0560</w:t>
+        <w:t>Derecho de la seguridad social - Alberto Briceno Ruiz.pdf — p. 67 — similitud 0.1670</w:t>
       </w:r>
     </w:p>
     <w:p>
@@ -1918,7 +2078,7 @@
         <w:ind w:left="360"/>
       </w:pPr>
       <w:r>
-        <w:t>“Luis Manuel Marcano Salazar Por consiguiente, a pesar de las leyes de naturaleza (que cada uno observa cuando tiene la voluntad de observarlas, cuando puede hacerlo de modo seguro) si no se ha instituido o no es suficientemente grande para nuestra seguridad, cada uno se fiará tan sólo, y podrá hacerlo legalmente, sobre su propia fuerza y maña, para protegerse contra los demás hombres.”</w:t>
+        <w:t>“En 1899 la Cámara de ¡os Comunes designó una nueva comisión para el estudio del problema de los ancianos pobres, que se pronunció a favor de un sistema de pensiones; en dicha comisión se encontraba David Lloyd George. 9 Alberto Briceño Ruiz, Derecho mexicano de los seguros sociales, Haría, México, 1987, p. 70.”</w:t>
       </w:r>
     </w:p>
     <w:p>
@@ -1926,7 +2086,7 @@
         <w:pStyle w:val="Heading3"/>
       </w:pPr>
       <w:r>
-        <w:t>Derechos humanos, teorias y doc - Luis Manuel Marcano Salazar.pdf — p. 16 — similitud 0.0517</w:t>
+        <w:t>Derecho de la seguridad social - Alberto Briceno Ruiz.pdf — p. 147 — similitud 0.1656</w:t>
       </w:r>
     </w:p>
     <w:p>
@@ -1934,7 +2094,7 @@
         <w:ind w:left="360"/>
       </w:pPr>
       <w:r>
-        <w:t>“Esos eventos internacionales generaron cambios constitucionales; así, en Venezuela a partir de la Constitución de 1999 en su Capítulo IX se contemplan los derechos ambientales en los artículos 127 al 129, como un derecho de la persona susceptible de protección y a su vez un deber compartido con el Estado que imperiosamente debe protegerlo e imponer la conservación del equilibrio ecológico para las generaciones futuras, en el artículo 127 se consagra específicamente: “Es un derecho y un deber de cada generación proteger y mantener el ambiente en beneficio de sí misma y del mundo futuro.Toda persona tiene derecho individual y colectivamente a disfrutar de una vida y de un ambiente seguro...”</w:t>
+        <w:t>“7 Salario base de cotización y cuota Concepto L a Ley del Seguro Social (l ss) determina en el art. 5 A, fracc.”</w:t>
       </w:r>
     </w:p>
     <w:p>
@@ -1942,7 +2102,7 @@
         <w:pStyle w:val="Heading3"/>
       </w:pPr>
       <w:r>
-        <w:t>Como se hicieron los Derechos H - Ricardo Rabinovich Berkman.pdf — p. 141 — similitud 0.0484</w:t>
+        <w:t>Derecho de la seguridad social - Alberto Briceno Ruiz.pdf — p. 261 — similitud 0.1654</w:t>
       </w:r>
     </w:p>
     <w:p>
@@ -1950,7 +2110,7 @@
         <w:ind w:left="360"/>
       </w:pPr>
       <w:r>
-        <w:t>“Es la decisi- va lucha ideológica del siglo XXI, y la misión de nuestra generación", agrega- ba Bush a renglón seguido, colocando el ataque estadounidense a Irak en un nivel de necesidad apocalíptica, que hace acordar a los criterios de la "guerra santa", sobre los que volveremos más adelante. "El mundo está más seguro porque Saddam Hussein no está más en el poder. Y ahora el desafío es ayudar al pueblo iraquí a construir una de- mocracia que cumpla los sueños de los casi doce millones de iraquíes que salieron a votar en elecciones libres el último diciembre", concluía optimista el mandatario estadounidense213.”</w:t>
+        <w:t>“Laño afiliación del trabajador que sufrió el siniestro debe comprobarse por medio de otras probanzas, como la inspección, donde se asiente la irregularidad en que pudiera haber incurrido el patrón. Los elementos de prueba quedan a cargo del Instituto, cuando el obligado niegue la existencia de la relación laboral. Elementos Los elementos son los siguientes: La calificación médica del riesgo de trabajo.”</w:t>
       </w:r>
     </w:p>
     <w:p>
@@ -1958,7 +2118,7 @@
         <w:pStyle w:val="Heading3"/>
       </w:pPr>
       <w:r>
-        <w:t>Como se hicieron los Derechos H - Ricardo Rabinovich Berkman.pdf — p. 217 — similitud 0.0483</w:t>
+        <w:t>Curso de derechos humanos - Ana Maria Ibarra Olguin.pdf — p. 188 — similitud 0.1630</w:t>
       </w:r>
     </w:p>
     <w:p>
@@ -1966,7 +2126,7 @@
         <w:ind w:left="360"/>
       </w:pPr>
       <w:r>
-        <w:t>“Advierte: "Los árboles que se doblan conservan sus ramas, pero los que se resis- ten acaban arrancados de raíz" (que es como Creón terminará: sin des- cendientes). Y emplea una imagen característica de un griego (aunque de un ateniense más que de un beocio): " Aquel piloto que, seguro de lo que hace, ajusta la escota de ía vela y no la suelta, realiza el resto del viaje con el navio tumbado" (713-717). El corifeo trata de ponerlos de acuerdo.”</w:t>
+        <w:t>“ELEMENTOS QUE CONFORMAN EL DERECHO A LA IDENTIDAD Respecto de los elementos que conforman el derecho a la identidad, además del párrafo octavo del artículo 4 constitucional donde se reconoce el derecho a la identidad y al registro inmediato, la Ley General de los Derechos de Niñas, Niños y Adolescentes —publicada el 4 de diciembre en el Diario Oficial de la Federación (DOF)— en su artículo 19 establece que los elementos de este derecho son: 1) ser inscritos en el Registro Civil de manera inmediata y en tanto, tener nombre y apellidos, 2) contar con nacionalidad, y 3) conocer su filiación y su origen (bio- lógico).”</w:t>
       </w:r>
     </w:p>
     <w:p>
@@ -1974,7 +2134,7 @@
         <w:pStyle w:val="Heading3"/>
       </w:pPr>
       <w:r>
-        <w:t>Como se hicieron los Derechos H - Ricardo Rabinovich Berkman.pdf — p. 247 — similitud 0.0467</w:t>
+        <w:t>Ley del Seguro Social - Camara de Diputados del H. Cong.pdf — p. 13 — similitud 0.1609</w:t>
       </w:r>
     </w:p>
     <w:p>
@@ -1982,7 +2142,7 @@
         <w:ind w:left="360"/>
       </w:pPr>
       <w:r>
-        <w:t>“Y todo ello, en procura del bien y de la equidad. ¡Qué bien harían los sandios profesores que basan sus cursos en meras me^ morizaciones y repeticiones de los alumnos, en tener presente esto! §3. Ius natural e ius de gentes A Ulpiano le. atribuyen luego los compiladores el establecimiento de tres categorías dentro del ius privado (es decir, el "que contempla a la utilidad de 326 Así en numerosas fuentes. Por ejemplo, César (De belfo gofiico, 728.2).”</w:t>
+        <w:t>“En los casos previstos en la fracción III del artículo 30, si se modifican los elementos fijos del salario, el patrón deberá presentar el aviso de modificación dentro de los cinco días hábiles siguientes de la fecha en que cambie el salario. Si al concluir el bimestre respectivo hubo modificación de los elementos variables que se integran al salario, el patrón presentará al Instituto el aviso de modificación en los términos de la fracción II anterior.”</w:t>
       </w:r>
     </w:p>
     <w:p>
@@ -1990,7 +2150,7 @@
         <w:pStyle w:val="Heading3"/>
       </w:pPr>
       <w:r>
-        <w:t>Como se hicieron los Derechos H - Ricardo Rabinovich Berkman.pdf — p. 151 — similitud 0.0463</w:t>
+        <w:t>Curso de derechos humanos - Ana Maria Ibarra Olguin.pdf — p. 187 — similitud 0.1598</w:t>
       </w:r>
     </w:p>
     <w:p>
@@ -1998,7 +2158,7 @@
         <w:ind w:left="360"/>
       </w:pPr>
       <w:r>
-        <w:t>“162 RICARDO D. RABINOVICH-BERKMAN tencialismo, que "la mayor parte de los mortales se queja de la malignidad de la Naturaleza, por habernos engendrado para un tiempo tan breve y porque este espacio de tiempo que se nos dio se escurre tan velozmente"22* No sabemos cuándo llegará la muerte, pero es seguro que ella va a venir, Borges, de nuevo, escribe: "Tras el cristal ya gris la noche cesa y del alto de libros que una trunca sombra dilata por la vaga mesa, alguno habrá que no leeremos nunca"225. La muerte, en efecto pone limites (tal el título de este maravilloso poema) a nuestro tiempo.”</w:t>
+        <w:t>“El derecho a la identidad personal 187 III. LA VISIÓN ESTÁTICA Y DINÁMICA DEL DERECHO A LA IDENTIDAD El derecho a la identidad, como vimos en los párrafos anteriores, no sólo com- prende los elementos biológicos que pueden identificar a las personas, como el nombre y los apellidos, los cuales son casi invariables (a excepción de que se pida su modificación), sino que también incluye la forma en que las personas quieren externar sus caracteres hacia los demás, es decir, los atributos y las características que definen e individualizan a una persona, que la hacen sentir una misma y la diferencian de los demás.”</w:t>
       </w:r>
     </w:p>
     <w:p>
@@ -2006,7 +2166,7 @@
         <w:pStyle w:val="Heading3"/>
       </w:pPr>
       <w:r>
-        <w:t>Derechos humanos, teorias y doc - Luis Manuel Marcano Salazar.pdf — p. 135 — similitud 0.0462</w:t>
+        <w:t>Derecho de la seguridad social - Alberto Briceno Ruiz.pdf — p. 149 — similitud 0.1571</w:t>
       </w:r>
     </w:p>
     <w:p>
@@ -2014,7 +2174,7 @@
         <w:ind w:left="360"/>
       </w:pPr>
       <w:r>
-        <w:t>“Una segunda Resolución del Consejo de Europa, la 1/1990, relativa a la protección del Medio Ambiente a través del Derecho penal actualizó las recomendaciones de la anterior, estableciéndose la necesidad de elaborar un listado de tipos penales en los que se asegurase la protección adecuada al medio ambiente y a sus elementos integrantes (agua, aire, suelo, flora y fauna, así como a las personas); la regulación de las infracciones penales a través de tipos de peligro (abstracto, concreto o potencial); la delimitación en materia ambiental entre delitos (Derecho penal) e infracciones administrativas (Derecho administrativo) sobre la base de la gravedad y al riesgo de los comportamientos y, por...”</w:t>
+        <w:t>“En cambio, la Ley del Seguro Social, según la fracción xxix, apartado A, del artículo 123 constitucional, “comprenderá seguros de invalidez, de vida, de cesación involuntaria del trabajo, de enfermedades y accidentes y otros con ñnes análogos", de donde se sigue que esta última Ley presupone la existencia del contrato de trabajo, pero no lo regula, ni establece o define sus elementos integrantes, entre ellos el salario, pues todo ello corresponde a la Ley Federal del Trabajo. Sobre la base de que existe el con­ trato de trabajo, la Ley del Seguro Social desarrolla sus normas dentro del ámbito que le fija la fracción XXIX antes citada.- Séptima Época.”</w:t>
       </w:r>
     </w:p>
     <w:p>
@@ -2022,7 +2182,7 @@
         <w:pStyle w:val="Heading3"/>
       </w:pPr>
       <w:r>
-        <w:t>Derechos humanos, teorias y doc - Luis Manuel Marcano Salazar.pdf — p. 29 — similitud 0.0461</w:t>
+        <w:t>Curso de derechos humanos - Ana Maria Ibarra Olguin.pdf — p. 356 — similitud 0.1546</w:t>
       </w:r>
     </w:p>
     <w:p>
@@ -2030,7 +2190,7 @@
         <w:ind w:left="360"/>
       </w:pPr>
       <w:r>
-        <w:t>“15). De una vez manifiesta tajantemente su objetivo, no se detendrá a divagar y concibe al derecho libre de elementos metajurídicos; el hombre está escindido entre el mundo del “ser”y del “deber ser”; el hombre sólo es capaz de conocer lo dado, escapándosele toda metafísica; pretende (…)“brindar una definición de la norma jurídica totalmente independiente de la noción de norma moral (…) al afirmar la autonomía del derecho respecto de la moral.”</w:t>
+        <w:t>“Marat Paredes Montiel 356 se encuentra íntimamente vinculado con la incorporación de la perspectiva de la discapacidad en la administración de justicia como un servicio público.98 Otra herramienta útil para lograr la igualdad sustantiva y material se ha de- sarrollado en la carga dinámica de la prueba que puede llevar, excepcionalmente, a la inversión de la carga de la prueba, aplicando el principio de igualdad de las partes y a su vez del debido proceso como una herramienta de interpretación implementada por el juzgador para solventar cualquier situación que, de facto, impida mantener el equilibrio entre las partes.99 ¿Qué es la inversión de la carga de la prueba?”</w:t>
       </w:r>
     </w:p>
     <w:p>
@@ -2038,7 +2198,7 @@
         <w:pStyle w:val="Heading3"/>
       </w:pPr>
       <w:r>
-        <w:t>Los derechos humanos en Mexico - Emilio Alvarez Icaza Longoria.pdf — p. 47 — similitud 0.0453</w:t>
+        <w:t>Derecho de la seguridad social - Alberto Briceno Ruiz.pdf — p. 264 — similitud 0.1536</w:t>
       </w:r>
     </w:p>
     <w:p>
@@ -2046,7 +2206,7 @@
         <w:ind w:left="360"/>
       </w:pPr>
       <w:r>
-        <w:t>“Sin embargo, la transparencia electoral, que facilita la elección demo- crática de los gobernantes, no garantiza de facto la rendición de cuen- tas. El paradigma ético de la democracia exige conductas y actitudes ciudadanas continuas que salvaguarden el ejercicio plural del poder político de los resabios de carácter autoritario, el uso regular y sis- temático de los mecanismos de toma de decisiones que considera el Estado democrático de derecho, y el acceso a la información pública que transparenta la gestión pública y permite una rendición de cuen- tas a satisfacción.”</w:t>
+        <w:t>“El im ss al fincar un adeudo por concepto de capital constitutivo, debe motivarlo y fundarlo, esto es, señalar la fecha en que ocurrió el accidente, dar a conocer las partidas, y como se fijo el monto de las mismas, es decir; que se deben especificar los subsidios pagados y servicios que prestó el Instituto, así como el monto de dichas partidas cuyo reembolso se exige, además de que para fundar el cobro del capital constitutivo no basta que se cite el artículo 96 de la Ley del Seguro Social, que señala la obligación del patrón de responder de la responsabilidad derivada de un accidente, sino que es menester que cada renglón individual del cobro que constituye el capital constitutivo...”</w:t>
       </w:r>
     </w:p>
     <w:p>
@@ -2054,7 +2214,7 @@
         <w:pStyle w:val="Heading3"/>
       </w:pPr>
       <w:r>
-        <w:t>Como se hicieron los Derechos H - Ricardo Rabinovich Berkman.pdf — p. 125 — similitud 0.0447</w:t>
+        <w:t>Derecho de la seguridad social - Alberto Briceno Ruiz.pdf — p. 265 — similitud 0.1532</w:t>
       </w:r>
     </w:p>
     <w:p>
@@ -2062,7 +2222,7 @@
         <w:ind w:left="360"/>
       </w:pPr>
       <w:r>
-        <w:t>“Esta posición generó ácidas críticas, y hasta asombro por parte de pensa- : dores que se manifestaban en general coincidentes con las ideas de Rawls. Sin :.;í embargo, y con todo lo problemático que el tema es, no deja de tratarse de una alternativa coherente con la creencia en la posibilidad de una base objetiva de la que se puedan desprender los derechos (o libertades) fundamentales.”</w:t>
+        <w:t>“El causante obligado, generalmente el patrón, debe conocer cada uno de los elementos que tuvo en cuenta la autoridad fiscal para determinar los di­ versos rubros que integran el capital constitutivo fincado en su contra a que se refiere el art. 79 de la Ley, además de tener a su alcance el sistema que el Instituto hubiera utilizado para calcularlos, así como el origen y destino de los mismos.”</w:t>
       </w:r>
     </w:p>
     <w:p>
@@ -2070,7 +2230,7 @@
         <w:pStyle w:val="Heading3"/>
       </w:pPr>
       <w:r>
-        <w:t>Como se hicieron los Derechos H - Ricardo Rabinovich Berkman.pdf — p. 211 — similitud 0.0434</w:t>
+        <w:t>Derecho de la seguridad social - Alberto Briceno Ruiz.pdf — p. 13 — similitud 0.1467</w:t>
       </w:r>
     </w:p>
     <w:p>
@@ -2078,7 +2238,7 @@
         <w:ind w:left="360"/>
       </w:pPr>
       <w:r>
-        <w:t>“Así que, para horror de Creón, Me- neceo, su primogénito, se suicida arrojándose desde una de las torres. El sacrificio de Meneceo hace a los tebanos sentirse seguros, así que salen a combatir. Ante los muros, Eteocles y Polinices se enfrentan en combate singular.”</w:t>
+        <w:t>“Queda claro que en nuestro país la seguridad social ha sido preocupación tanto de la administración pública como del sector académico, que mucho ha aportado para su mejor concepción y funcionamiento. En este marco apa­ rece la presente obra titulada Derecho de la seguridad social, de la autoría de Don Alberto Briceño Ruiz, distinguido catedrático universitario, quien desde hace casi 40 años ha impartido la asignatura en la Facultad de Derecho de la Universidad Nacional Autónoma de México (unam), en donde cuenta con la categoría de profesor titular nivel “C”. Briceño Ruiz es, además, presidente de la Academia Mexicana de Derecho de la Seguridad Social, que fundó hace poco más de 10 años.”</w:t>
       </w:r>
     </w:p>
     <w:p>
@@ -2086,7 +2246,7 @@
         <w:pStyle w:val="Heading3"/>
       </w:pPr>
       <w:r>
-        <w:t>Derechos humanos, teorias y doc - Luis Manuel Marcano Salazar.pdf — p. 128 — similitud 0.0433</w:t>
+        <w:t>Ley del Instituto de Seguridad - Camara de Diputados del H. Cong.pdf — p. 23 — similitud 0.1428</w:t>
       </w:r>
     </w:p>
     <w:p>
@@ -2094,7 +2254,7 @@
         <w:ind w:left="360"/>
       </w:pPr>
       <w:r>
-        <w:t>“También se convino en prestar asistencia a fin de aumentar las oportunidades de empleo generador de ingresos, teniendo en cuenta la Declaración de Principios de la Organización Internacional del Trabajo relativa a los Derechos Fundamentales en el Trabajo. 11.- Además, en que es necesario que las empresas del sector privado cumplan la obligación de rendir cuentas, rendición que ha de tener lugar en un entorno reglamentario transparente y estable. 127”</w:t>
+        <w:t>“El Trabajador o sus Familiares Derechohabientes deberán solicitar al Instituto la calificación del probable riesgo de trabajo dentro de los treinta días hábiles siguientes a que haya ocurrido, en los términos que señale el reglamento respectivo y demás disposiciones aplicables. No procederá la solicitud de calificación, ni se reconocerá un riesgo del trabajo, si éste no hubiere sido notificado al Instituto en los términos de este artículo. Artículo 61.”</w:t>
       </w:r>
     </w:p>
     <w:p>
@@ -2102,7 +2262,7 @@
         <w:pStyle w:val="Heading3"/>
       </w:pPr>
       <w:r>
-        <w:t>Derechos humanos, teorias y doc - Luis Manuel Marcano Salazar.pdf — p. 148 — similitud 0.0405</w:t>
+        <w:t>Derecho de la seguridad social - Alberto Briceno Ruiz.pdf — p. 23 — similitud 0.1405</w:t>
       </w:r>
     </w:p>
     <w:p>
@@ -2110,7 +2270,23 @@
         <w:ind w:left="360"/>
       </w:pPr>
       <w:r>
-        <w:t>“Por ello, se propone que ante una posible reforma de la Organización de las Naciones Unidas el poder de decisión no puede seguir en cónclave de cinco. La misma dinámica evolutiva pauta directrices que no pueden pasar desapercibidas, el derretimiento de las capas de hielo, la desaparición de glaciares está aumentando el nivel del mar afectando los ecosistemas e incrementando los riesgos para el normal desarrollo de las actividades humanas, la desertización crece, los deslaves e inundaciones son 147”</w:t>
+        <w:t>“Sierra López, "Inseguridad, seguridad jurídica y seguridad social”, en Boletín de Información Jurídica, IMSS, núm. 15, septiembre-octubre de 1985.”</w:t>
+      </w:r>
+    </w:p>
+    <w:p>
+      <w:pPr>
+        <w:pStyle w:val="Heading3"/>
+      </w:pPr>
+      <w:r>
+        <w:t>Ley del Seguro Social - Camara de Diputados del H. Cong.pdf — p. 58 — similitud 0.1359</w:t>
+      </w:r>
+    </w:p>
+    <w:p>
+      <w:pPr>
+        <w:ind w:left="360"/>
+      </w:pPr>
+      <w:r>
+        <w:t>“LEY DEL SEGURO SOCIAL CÁMARA DE DIPUTADOS DEL H. CONGRESO DE LA UNIÓN Secretaría General Secretaría de Servicios Parlamentarios Última Reforma DOF 15-01-2026 como la actualización y recargos que se generen en los términos de los artículos 15 fracción V, 251 fracciones XIV y XVIII, y demás relativos de esta Ley.”</w:t>
       </w:r>
     </w:p>
     <w:p>
@@ -2121,7 +2297,7 @@
         <w:t xml:space="preserve">Observación automática: </w:t>
       </w:r>
       <w:r>
-        <w:t>La ficha presenta coincidencias débiles; se recomienda validar manualmente las citas. Se agruparon referencias de múltiples fuentes para enriquecer el concepto. Hay 23 referencia(s) de baja similitud que podrían introducir ruido.</w:t>
+        <w:t>La ficha presenta coincidencias útiles, pero conviene revisar la pertinencia de cada cita. Se agruparon referencias de múltiples fuentes para enriquecer el concepto.</w:t>
       </w:r>
     </w:p>
     <w:p>
@@ -2129,7 +2305,7 @@
         <w:pStyle w:val="Heading2"/>
       </w:pPr>
       <w:r>
-        <w:t>Ficha 06. Seguro social</w:t>
+        <w:t>Ficha 06. límites</w:t>
       </w:r>
     </w:p>
     <w:p>
@@ -2140,7 +2316,7 @@
         <w:t xml:space="preserve">Fuentes: </w:t>
       </w:r>
       <w:r>
-        <w:t>Como se hicieron los Derechos H - Ricardo Rabinovich Berkman.pdf; Derechos humanos, teorias y doc - Luis Manuel Marcano Salazar.pdf; Los derechos humanos en Mexico - Emilio Alvarez Icaza Longoria.pdf</w:t>
+        <w:t>Constitucion Politica de los Es - Camara de Diputados del H. Cong.pdf; Curso de derechos humanos - Ana Maria Ibarra Olguin.pdf</w:t>
       </w:r>
     </w:p>
     <w:p>
@@ -2151,7 +2327,7 @@
         <w:t xml:space="preserve">Ubicaciones: </w:t>
       </w:r>
       <w:r>
-        <w:t>Como se hicieron los Derechos H - Ricardo Rabinovich Berkman.pdf, p. 125; Como se hicieron los Derechos H - Ricardo Rabinovich Berkman.pdf, p. 141; Como se hicieron los Derechos H - Ricardo Rabinovich Berkman.pdf, p. 168; Como se hicieron los Derechos H - Ricardo Rabinovich Berkman.pdf, p. 217; Como se hicieron los Derechos H - Ricardo Rabinovich Berkman.pdf, p. 285; Derechos humanos, teorias y doc - Luis Manuel Marcano Salazar.pdf, p. 108; Derechos humanos, teorias y doc - Luis Manuel Marcano Salazar.pdf, p. 16; Derechos humanos, teorias y doc - Luis Manuel Marcano Salazar.pdf, p. 23; Derechos humanos, teorias y doc - Luis Manuel Marcano Salazar.pdf, p. 29; Derechos humanos, teorias y doc - Luis Manuel Marcano Salazar.pdf, p. 32; Derechos humanos, teorias y doc - Luis Manuel Marcano Salazar.pdf, p. 39; Derechos humanos, teorias y doc - Luis Manuel Marcano Salazar.pdf, p. 47; Derechos humanos, teorias y doc - Luis Manuel Marcano Salazar.pdf, p. 54; Derechos humanos, teorias y doc - Luis Manuel Marcano Salazar.pdf, p. 58; Derechos humanos, teorias y doc - Luis Manuel Marcano Salazar.pdf, p. 82; Derechos humanos, teorias y doc - Luis Manuel Marcano Salazar.pdf, p. 83; Los derechos humanos en Mexico - Emilio Alvarez Icaza Longoria.pdf, p. 15; Los derechos humanos en Mexico - Emilio Alvarez Icaza Longoria.pdf, p. 29; Los derechos humanos en Mexico - Emilio Alvarez Icaza Longoria.pdf, p. 35; Los derechos humanos en Mexico - Emilio Alvarez Icaza Longoria.pdf, p. 47; Los derechos humanos en Mexico - Emilio Alvarez Icaza Longoria.pdf, p. 52; Los derechos humanos en Mexico - Emilio Alvarez Icaza Longoria.pdf, p. 61; Los derechos humanos en Mexico - Emilio Alvarez Icaza Longoria.pdf, p. 69</w:t>
+        <w:t>Constitucion Politica de los Es - Camara de Diputados del H. Cong.pdf, p. 61; Curso de derechos humanos - Ana Maria Ibarra Olguin.pdf, p. 133; Curso de derechos humanos - Ana Maria Ibarra Olguin.pdf, p. 135; Curso de derechos humanos - Ana Maria Ibarra Olguin.pdf, p. 140; Curso de derechos humanos - Ana Maria Ibarra Olguin.pdf, p. 152; Curso de derechos humanos - Ana Maria Ibarra Olguin.pdf, p. 161; Curso de derechos humanos - Ana Maria Ibarra Olguin.pdf, p. 166; Curso de derechos humanos - Ana Maria Ibarra Olguin.pdf, p. 167; Curso de derechos humanos - Ana Maria Ibarra Olguin.pdf, p. 172; Curso de derechos humanos - Ana Maria Ibarra Olguin.pdf, p. 176; Curso de derechos humanos - Ana Maria Ibarra Olguin.pdf, p. 24; Curso de derechos humanos - Ana Maria Ibarra Olguin.pdf, p. 306; Curso de derechos humanos - Ana Maria Ibarra Olguin.pdf, p. 335; Curso de derechos humanos - Ana Maria Ibarra Olguin.pdf, p. 389; Curso de derechos humanos - Ana Maria Ibarra Olguin.pdf, p. 39; Curso de derechos humanos - Ana Maria Ibarra Olguin.pdf, p. 42; Curso de derechos humanos - Ana Maria Ibarra Olguin.pdf, p. 514; Curso de derechos humanos - Ana Maria Ibarra Olguin.pdf, p. 71; Curso de derechos humanos - Ana Maria Ibarra Olguin.pdf, p. 739; Curso de derechos humanos - Ana Maria Ibarra Olguin.pdf, p. 75; Curso de derechos humanos - Ana Maria Ibarra Olguin.pdf, p. 78</w:t>
       </w:r>
     </w:p>
     <w:p>
@@ -2159,7 +2335,7 @@
         <w:pStyle w:val="Heading3"/>
       </w:pPr>
       <w:r>
-        <w:t>Los derechos humanos en Mexico - Emilio Alvarez Icaza Longoria.pdf — p. 61 — similitud 0.1354</w:t>
+        <w:t>Curso de derechos humanos - Ana Maria Ibarra Olguin.pdf — p. 167 — similitud 0.2636</w:t>
       </w:r>
     </w:p>
     <w:p>
@@ -2167,7 +2343,7 @@
         <w:ind w:left="360"/>
       </w:pPr>
       <w:r>
-        <w:t>“Por ello, construir un sistema de seguridad pública eficaz y confiable implica que reconozcamos la complejidad de la tarea de mantener el orden público en congruencia con la vigencia integral de los derechos humanos de cada persona, tanto los civiles y políti- cos, como los económicos, sociales y culturales.”</w:t>
+        <w:t>“El derecho al libre desarrollo de la personalidad 167 derechos pueden ser limitados siempre que las restricciones sean “necesarias” o “proporcionales” para garantizar ciertos fines importantes, como los derechos de terceros y/o el orden público. Así, en lo que sigue nos referiremos al primer tipo como los “límites internos” y al segundo como “límites externos” del derecho. 2.  Los límites internos del derecho al libre desarrollo de la personalidad A.  ¿Todo está prima facie protegido?”</w:t>
       </w:r>
     </w:p>
     <w:p>
@@ -2175,7 +2351,7 @@
         <w:pStyle w:val="Heading3"/>
       </w:pPr>
       <w:r>
-        <w:t>Derechos humanos, teorias y doc - Luis Manuel Marcano Salazar.pdf — p. 82 — similitud 0.1041</w:t>
+        <w:t>Curso de derechos humanos - Ana Maria Ibarra Olguin.pdf — p. 166 — similitud 0.2514</w:t>
       </w:r>
     </w:p>
     <w:p>
@@ -2183,7 +2359,7 @@
         <w:ind w:left="360"/>
       </w:pPr>
       <w:r>
-        <w:t>“forma enmendada por el Protocolo N º 11 • Protocolo N º 5 de la Convención para la Protección de los Derechos Humanos y las Libertades Fundamentales, se modifican los artículos 22 y 40 de la Convención • Convenio Europeo para la adopción de niños • Convenio europeo sobre la repatriación de los menores • Convenio europeo sobre inmunidad de los Estados • Protocolo adicional al Convenio Europeo para la inmunidad de los Estado • Convenio Europeo para la Seguridad Social • Acuerdo Complementario para la Aplicación de la Convención Europea para la Seguridad Social • Convenio Europeo sobre la no Aplicabilidad de las Limitaciones legales a los crímenes de lesa humanidad y crímenes de guerra •...”</w:t>
+        <w:t>“Como se observa, la Primera Sala parece entender que el derecho al libre desa- rrollo de la personalidad no sólo impone límites negativos al Estado, es decir, obli- gaciones de no hacer o de no intervención, sino que también posee una dimensión positiva que orienta o dota de contenido a otros derechos fundamentales (como el derecho a la educación), lo cual puede traducirse en obligaciones positivas o de hacer para el Estado (en este caso, la obligación de proporcionar una educación orientada a garantizar la autonomía de las personas con base en ciertos conteni- dos mínimos). VIII.”</w:t>
       </w:r>
     </w:p>
     <w:p>
@@ -2191,7 +2367,7 @@
         <w:pStyle w:val="Heading3"/>
       </w:pPr>
       <w:r>
-        <w:t>Derechos humanos, teorias y doc - Luis Manuel Marcano Salazar.pdf — p. 32 — similitud 0.0981</w:t>
+        <w:t>Curso de derechos humanos - Ana Maria Ibarra Olguin.pdf — p. 135 — similitud 0.2443</w:t>
       </w:r>
     </w:p>
     <w:p>
@@ -2199,7 +2375,7 @@
         <w:ind w:left="360"/>
       </w:pPr>
       <w:r>
-        <w:t>“El marxismo presentaba una realidad en un contexto social que llevó incluso a la Iglesia a pronunciarse en la celebre encíclica Rerum novarum de León XIII; la lucha de clases, las condiciones infrahumanas, la desvalorización del trabajo humano, presentan un nuevo matiz que fuera de las desviaciones y radicalismo implementado por la Rusia bolchevique, pone en evidencia el surgimiento de ideólogos que darán nuevos visos a la realidad circundante.”</w:t>
+        <w:t>“Se trata de una cuestión muy debatida en la doctrina y frente a la cual se han ofrecido diferentes respuestas, las cuales han sido construidas a partir de dos grandes modelos o visiones contra- puestas sobre la estructura de los derechos (muy específicamente los derechos de libertad) las cuales denominaremos para efectos de este trabajo como la teoría interna y la teoría externa de los derechos fundamentales.2 Como se verá, una distinción fundamental entre estos modelos radica en la forma en la que cada uno de ellos entiende la relación entre el contenido o alcance de los derechos y sus respectivos límites o restricciones constitucionales. 1.”</w:t>
       </w:r>
     </w:p>
     <w:p>
@@ -2207,7 +2383,7 @@
         <w:pStyle w:val="Heading3"/>
       </w:pPr>
       <w:r>
-        <w:t>Los derechos humanos en Mexico - Emilio Alvarez Icaza Longoria.pdf — p. 29 — similitud 0.0963</w:t>
+        <w:t>Curso de derechos humanos - Ana Maria Ibarra Olguin.pdf — p. 133 — similitud 0.2243</w:t>
       </w:r>
     </w:p>
     <w:p>
@@ -2215,7 +2391,7 @@
         <w:ind w:left="360"/>
       </w:pPr>
       <w:r>
-        <w:t>“28 Los derechos humanos en México 2) El derecho a la seguridad social, a un nivel de vida adecuado y a los niveles más altos posibles de bienestar físico y mental. 3) El derecho a la educación y el disfrute de los beneficios de la libertad cultural y el progreso científico.”</w:t>
+        <w:t>“IV. EL DERECHO AL LIBRE DESARROLLO DE LA PERSONALIDAD COMO EXPRESIÓN JURÍDICA DEL PRINCIPIO DE AUTONOMÍA PERSONAL. V.”</w:t>
       </w:r>
     </w:p>
     <w:p>
@@ -2223,7 +2399,7 @@
         <w:pStyle w:val="Heading3"/>
       </w:pPr>
       <w:r>
-        <w:t>Derechos humanos, teorias y doc - Luis Manuel Marcano Salazar.pdf — p. 83 — similitud 0.0906</w:t>
+        <w:t>Curso de derechos humanos - Ana Maria Ibarra Olguin.pdf — p. 71 — similitud 0.2178</w:t>
       </w:r>
     </w:p>
     <w:p>
@@ -2231,7 +2407,7 @@
         <w:ind w:left="360"/>
       </w:pPr>
       <w:r>
-        <w:t>“a la Prevención de la Tortura y los Tratos Inhumanos o Degradantes • Protocolo del Convenio Europeo de Seguridad Social • Convenio Marco para la Protección de las Minorías Nacionales • Convenio Europeo sobre el Ejercicio de los Derechos del Niño • Sexto Protocolo del Acuerdo General sobre Privilegios e Inmunidades del Consejo de Europa • Carta Social Europea • Convenio Europeo sobre la Nacionalidad • Protocolo adicional al Convenio sobre traslado de personas condenadas • Protocolo Adicional a la Convención para la Protección de los Derechos Humanos y la Dignidad del Ser Humano con respecto a las aplicaciones de la Biología y la Medicina, sobre la prohibición de la clonación de seres humanos...”</w:t>
+        <w:t>“Un problema complicado de la etapa de necesidad es su borrosa delimitación con la fase de proporcionalidad en sentido estricto, y que muy esencialmente se puede resumir así: esta tercera etapa requiere apreciar la intensidad de la satis- facción que obtiene el fin legítimo que se pretende realizar con la restricción del derecho fundamental, lo que tradicionalmente ha sido considerado como parte de la ponderación de la última fase de esta técnica.148 En mi opinión, examinar esta intensidad de satisfacción del fin legítimo no es adentrarse a la ponderación: ésta valora, como expresaré luego, más factores; y es innecesario desglosar cada paso del examen de proporcionalidad (lo que si se...”</w:t>
       </w:r>
     </w:p>
     <w:p>
@@ -2239,7 +2415,7 @@
         <w:pStyle w:val="Heading3"/>
       </w:pPr>
       <w:r>
-        <w:t>Los derechos humanos en Mexico - Emilio Alvarez Icaza Longoria.pdf — p. 52 — similitud 0.0891</w:t>
+        <w:t>Curso de derechos humanos - Ana Maria Ibarra Olguin.pdf — p. 133 — similitud 0.2093</w:t>
       </w:r>
     </w:p>
     <w:p>
@@ -2247,7 +2423,7 @@
         <w:ind w:left="360"/>
       </w:pPr>
       <w:r>
-        <w:t>“Esto habrá de ser un instrumento valioso que señale a las auto- ridades lo que está detrás de cada uno de los expedientes de queja; es decir: las personas. Cabe señalar que el modelo de queja es enmarcado dentro de un Modelo Institucional, cuyo objetivo es la construcción de una ins- titución que defienda los derechos humanos de las y los ciudadanos (Defensoría del Pueblo). Modelo de la CDHDF De este modo, el Modelo se basa en los siguientes principios: Autonomía.”</w:t>
+        <w:t>“VIII. LOS LÍMITES DEL DERECHO. 1.”</w:t>
       </w:r>
     </w:p>
     <w:p>
@@ -2255,7 +2431,7 @@
         <w:pStyle w:val="Heading3"/>
       </w:pPr>
       <w:r>
-        <w:t>Los derechos humanos en Mexico - Emilio Alvarez Icaza Longoria.pdf — p. 15 — similitud 0.0830</w:t>
+        <w:t>Constitucion Politica de los Es - Camara de Diputados del H. Cong.pdf — p. 61 — similitud 0.1967</w:t>
       </w:r>
     </w:p>
     <w:p>
@@ -2263,7 +2439,7 @@
         <w:ind w:left="360"/>
       </w:pPr>
       <w:r>
-        <w:t>“Nuevo orden internacional En la actualidad, 192 países soberanos integran la lista de Estados miembros de las Naciones Unidas, cuya finalidad es mante- ner la paz y seguridad internacionales, así como promover las rela- ciones de amistad entre las naciones y el progreso social. México es parte de esta organización desde el 7 de noviembre de 1945.”</w:t>
+        <w:t>“Artículo reformado DOF 07-02-1931, 19-12-1931, 22-03-1934, 16-01-1935, 16-01-1952, 08-10-1974 Artículo 46. Las entidades federativas pueden arreglar entre sí y en cualquier momento, por convenios amistosos, sus respectivos límites; pero no se llevarán a efecto esos arreglos sin la aprobación de la Cámara de Senadores.”</w:t>
       </w:r>
     </w:p>
     <w:p>
@@ -2271,7 +2447,7 @@
         <w:pStyle w:val="Heading3"/>
       </w:pPr>
       <w:r>
-        <w:t>Derechos humanos, teorias y doc - Luis Manuel Marcano Salazar.pdf — p. 47 — similitud 0.0806</w:t>
+        <w:t>Curso de derechos humanos - Ana Maria Ibarra Olguin.pdf — p. 389 — similitud 0.1952</w:t>
       </w:r>
     </w:p>
     <w:p>
@@ -2279,7 +2455,7 @@
         <w:ind w:left="360"/>
       </w:pPr>
       <w:r>
-        <w:t>“Aún, los visos de protección de los derechos humanos no se vislumbraban. En este contexto las variables que caracterizaron el modelo Iglesia- Institución contribuyeron a esta concepción por lo que al respecto se precisa analizarlas debido a su repercusión en lo social, cultural, político, económico e ideológico. 2.3.2.1- Principales características del modelo Iglesia-Institución 1.- Se resaltaban los aspectos visibles, sociales, institucionales y organi- zativos, existía una autocomprensión en el que predominaba lo jurídico, la dimensión de la Iglesia como misterio se mitiga; no ejerce gran influencia este aspecto.”</w:t>
+        <w:t>“Actualmente es posible distinguir en la doctrina y la jurisprudencia comparada dos grandes concepciones sobre el principio de proporcionalidad en materia pe- nal: una estricta, que refiere a “la exigencia de adecuación entre la gravedad de la pena y de delito”; y una más amplia, la cual recae sobre un “examen más global sobre los costes y los beneficios de toda intervención punitiva, orientado a veri- ficar su idoneidad, necesidad y estricta proporcionalidad”.93 La primera de estas vertientes se relaciona con la preocupación de los Ilustrados de que los delitos más graves recibieran una sanción mayor.94 La segunda, en cambio, se relaciona con la “prohibición de exceso” y la práctica actual...”</w:t>
       </w:r>
     </w:p>
     <w:p>
@@ -2287,7 +2463,7 @@
         <w:pStyle w:val="Heading3"/>
       </w:pPr>
       <w:r>
-        <w:t>Derechos humanos, teorias y doc - Luis Manuel Marcano Salazar.pdf — p. 58 — similitud 0.0703</w:t>
+        <w:t>Curso de derechos humanos - Ana Maria Ibarra Olguin.pdf — p. 39 — similitud 0.1908</w:t>
       </w:r>
     </w:p>
     <w:p>
@@ -2295,7 +2471,7 @@
         <w:ind w:left="360"/>
       </w:pPr>
       <w:r>
-        <w:t>“Es el proceso de positivización de las garantías; d) Los derechos reconocidos comienzan a ampliarse, en procura de otros derechos y hacia un estado de bienestar. • En este proceso de expansión a partir de la mitad del siglo XIX, emergen los derechos económicos, sociales y culturales; en este interregnum se hace necesario destacar el valor de las luchas por las reivindicaciones obreras y otras pretensiones de carácter social. León XIII en el año 1891 promulga la primera encíclica social de la Iglesia denominada “Rerum novarum”, como un grito convincente por las precarias condiciones indignas en que se encontraban los obreros; siendo execrables la situación de miseria que debían soportar.”</w:t>
+        <w:t>“Capítulo 1 Proporcionalidad y restricción de derechos fundamentales Rubén Sánchez Gil* SUMARIO: I. INTRODUCCIÓN.”</w:t>
       </w:r>
     </w:p>
     <w:p>
@@ -2303,7 +2479,7 @@
         <w:pStyle w:val="Heading3"/>
       </w:pPr>
       <w:r>
-        <w:t>Como se hicieron los Derechos H - Ricardo Rabinovich Berkman.pdf — p. 285 — similitud 0.0701</w:t>
+        <w:t>Curso de derechos humanos - Ana Maria Ibarra Olguin.pdf — p. 152 — similitud 0.1882</w:t>
       </w:r>
     </w:p>
     <w:p>
@@ -2311,7 +2487,7 @@
         <w:ind w:left="360"/>
       </w:pPr>
       <w:r>
-        <w:t>“Esta visión seria coherente con la de Marcel Simón, uno de los máximos especialistas en este período. Él entiende que los primeros conflictos de as- pecto intercultural no se habrían dado entre cristianos de origen israelita y cristianos de origen pagano, sino entre cristianos de origen israelita palestino, con lengua materna hebrea o aramea, y cristianos de origen israelita pero he- lenístico, llegados de las comunidades de la diáspora y greco-parlantes358. Para los tiempos de Pablo de Tarse, empero, la presencia de conversos de origen gentil parece haber sido lo suficientemente importante como para qué se generasen las controversias acerca de la obligatoriedad de la circuncisión.”</w:t>
+        <w:t>“Undurraga, por ejemplo, considera que dicho concepto tiene la ventaja de reflejar, por un lado, “las condiciones de libertad que requiere el ejercicio de la autonomía” y, por otro, “la idea de que la capacidad para la autonomía es gradual e implica un proceso de autocreación y no una condición estática”, aunado a que “transmite la idea de que las personas tienen una identidad única y que es valioso crear las condiciones para que esta personalidad pueda desplegarse auténticamen- te”.71 Sea como fuere, en el caso de México este debate terminológico parece haber quedado zanjado, pues la Corte ya ha reconocido la existencia de un derecho fun- damental implícito en la Constitución al libre...”</w:t>
       </w:r>
     </w:p>
     <w:p>
@@ -2319,7 +2495,7 @@
         <w:pStyle w:val="Heading3"/>
       </w:pPr>
       <w:r>
-        <w:t>Los derechos humanos en Mexico - Emilio Alvarez Icaza Longoria.pdf — p. 69 — similitud 0.0696</w:t>
+        <w:t>Curso de derechos humanos - Ana Maria Ibarra Olguin.pdf — p. 161 — similitud 0.1839</w:t>
       </w:r>
     </w:p>
     <w:p>
@@ -2327,7 +2503,7 @@
         <w:ind w:left="360"/>
       </w:pPr>
       <w:r>
-        <w:t>“Modelo de defensa que coloca en el cen- tro a las personas al asumirlas como ciudadanas y ciudadanos que ejercen sus derechos. Asimismo, la calificación y los proce- dimientos de investigación de quejas se llevan a cabo, en este modelo, a partir de las disposiciones del derecho internacional de los derechos humanos y bajo un enfoque de integralidad de los mismos. Progresividad.”</w:t>
+        <w:t>“El derecho al libre desarrollo de la personalidad 161 En segundo término, la Corte explicó que el derecho al libre desarrollo de la personalidad tiene una dimensión externa y una interna.”</w:t>
       </w:r>
     </w:p>
     <w:p>
@@ -2335,7 +2511,7 @@
         <w:pStyle w:val="Heading3"/>
       </w:pPr>
       <w:r>
-        <w:t>Derechos humanos, teorias y doc - Luis Manuel Marcano Salazar.pdf — p. 29 — similitud 0.0650</w:t>
+        <w:t>Curso de derechos humanos - Ana Maria Ibarra Olguin.pdf — p. 78 — similitud 0.1838</w:t>
       </w:r>
     </w:p>
     <w:p>
@@ -2343,7 +2519,7 @@
         <w:ind w:left="360"/>
       </w:pPr>
       <w:r>
-        <w:t>“Luis Manuel Marcano Salazar K Larenz al diferenciar el sistema de Savigny y Puchta señala: (…) Puchta es el primero en presentar el Derecho como un sistema lógico jerarquizado, que presenta más bien la forma de una pirámide (…) Tal método racional, al que sólo la terminología «organicista» de Puchta nos permite emparentar con el historicismo, se pretende «genealógico» y aspira, en palabras del propio autor, a conocer las proposiciones del Derecho en su conexión sistemática «como recíprocamente condicionadas y derivadas unas de otras» (…) Con ello la Ciencia del Derecho (Jurisprudencia) tomaba carta de naturaleza como autentica fuente del Derecho”.29 Los juristas son los llamados a extraer...”</w:t>
+        <w:t>“Un ámbito “natural” de aplicación del es- crutinio ordinario —nivel al que plenamente aplican las críticas sustantivas ante- riores— es el ámbito de las libertades económicas y de los derechos patrimoniales en general.185 Pero recientemente, el Pleno de la Suprema Corte determinó que para valorar las restricciones a la libertad de comercio deben emplearse todas las etapas del juicio de proporcionalidad: fin legítimo, idoneidad, necesidad y pro- porcionalidad.186 Por supuesto, estoy de acuerdo con el último criterio; pero el punto es aclarar el errático uso, y aparentemente voluble intercambiabilidad, entre el test de pro- porcionalidad y la doctrina del escrutinio judicial.”</w:t>
       </w:r>
     </w:p>
     <w:p>
@@ -2351,7 +2527,7 @@
         <w:pStyle w:val="Heading3"/>
       </w:pPr>
       <w:r>
-        <w:t>Derechos humanos, teorias y doc - Luis Manuel Marcano Salazar.pdf — p. 23 — similitud 0.0647</w:t>
+        <w:t>Curso de derechos humanos - Ana Maria Ibarra Olguin.pdf — p. 389 — similitud 0.1819</w:t>
       </w:r>
     </w:p>
     <w:p>
@@ -2359,7 +2535,7 @@
         <w:ind w:left="360"/>
       </w:pPr>
       <w:r>
-        <w:t>“Luis Manuel Marcano Salazar Por consiguiente, a pesar de las leyes de naturaleza (que cada uno observa cuando tiene la voluntad de observarlas, cuando puede hacerlo de modo seguro) si no se ha instituido o no es suficientemente grande para nuestra seguridad, cada uno se fiará tan sólo, y podrá hacerlo legalmente, sobre su propia fuerza y maña, para protegerse contra los demás hombres.”</w:t>
+        <w:t>“En México, la Suprema Corte ha sostenido que nuestra Constitución reconoce ambas vertientes del principio de proporcionalidad, si bien a partir de fundamen- tos constitucionales distintos.96 En primer lugar, ha dicho que la Constitución garantiza un principio de proporcionalidad en sentido estricto, el cual deriva di- rectamente del artículo 22 constitucional y cuya violación debe analizarse bajo una lógica retributiva. En segundo lugar, ha reconocido que la Constitución tam- bién consagra un principio de proporcionalidad en sentido amplio, el cual debe cumplir toda medida legislativa que intervengan derechos fundamentales.”</w:t>
       </w:r>
     </w:p>
     <w:p>
@@ -2367,7 +2543,7 @@
         <w:pStyle w:val="Heading3"/>
       </w:pPr>
       <w:r>
-        <w:t>Derechos humanos, teorias y doc - Luis Manuel Marcano Salazar.pdf — p. 54 — similitud 0.0616</w:t>
+        <w:t>Curso de derechos humanos - Ana Maria Ibarra Olguin.pdf — p. 75 — similitud 0.1799</w:t>
       </w:r>
     </w:p>
     <w:p>
@@ -2375,7 +2551,7 @@
         <w:ind w:left="360"/>
       </w:pPr>
       <w:r>
-        <w:t>“2.3.5.3.- Características de las declaraciones francesas Su origen histórico es muy discutido; sin embargo pueden exponerse tres posturas básicas.”</w:t>
+        <w:t>“El Pleno de la Suprema Corte así lo ha reconocido también recientemente al seña- lar que los límites de los derechos fundamentales tampoco son absolutos169 y que ha de encontrarse un punto de equilibrio entre la eficacia de estos derechos y la posibili- dad de imponerles límites.170 Ésta es una solución muy similar a la de una sentencia clásica del Tribunal Constitucional Federal alemán, el Caso de las Farmacias, en el cual señaló que el legislador “no puede determinar libremente el contenido de los de- 164 Como el artículo 6o., párrafo primero, constitucional. 165 “GARANTÍA…”, cit., nota 110.”</w:t>
       </w:r>
     </w:p>
     <w:p>
@@ -2383,7 +2559,7 @@
         <w:pStyle w:val="Heading3"/>
       </w:pPr>
       <w:r>
-        <w:t>Los derechos humanos en Mexico - Emilio Alvarez Icaza Longoria.pdf — p. 47 — similitud 0.0604</w:t>
+        <w:t>Curso de derechos humanos - Ana Maria Ibarra Olguin.pdf — p. 24 — similitud 0.1795</w:t>
       </w:r>
     </w:p>
     <w:p>
@@ -2391,7 +2567,7 @@
         <w:ind w:left="360"/>
       </w:pPr>
       <w:r>
-        <w:t>“El Conapred es la institución rectora para promover políticas que buscan contribuir al desarrollo cultural y social a través de la inclusión social, garantizando el derecho a la igualdad, que es el primero de los derechos fundamentales en la Constitución federal. Sin duda, las movilizaciones de las osc lograron un avance en materia de derechos humanos gracias al impacto que tuvieron en la”</w:t>
+        <w:t>“Luego, encontramos diversos artículos sobre los derechos que han tenido mayor desarrollo en la Suprema Corte de Justicia de la Nación. Así, se presentan los de derechos de libertad, como el libre desarrollo de la personalidad, la libertad de expresión y de información, y el derecho a la identidad personal. La obra también incluye un capítulo sobre garantías penales, comprendiendo la relevancia del debido proceso y la presunción de inocencia, como fundamentos de la libertad.”</w:t>
       </w:r>
     </w:p>
     <w:p>
@@ -2399,7 +2575,7 @@
         <w:pStyle w:val="Heading3"/>
       </w:pPr>
       <w:r>
-        <w:t>Derechos humanos, teorias y doc - Luis Manuel Marcano Salazar.pdf — p. 16 — similitud 0.0596</w:t>
+        <w:t>Curso de derechos humanos - Ana Maria Ibarra Olguin.pdf — p. 306 — similitud 0.1784</w:t>
       </w:r>
     </w:p>
     <w:p>
@@ -2407,7 +2583,7 @@
         <w:ind w:left="360"/>
       </w:pPr>
       <w:r>
-        <w:t>“Esos eventos internacionales generaron cambios constitucionales; así, en Venezuela a partir de la Constitución de 1999 en su Capítulo IX se contemplan los derechos ambientales en los artículos 127 al 129, como un derecho de la persona susceptible de protección y a su vez un deber compartido con el Estado que imperiosamente debe protegerlo e imponer la conservación del equilibrio ecológico para las generaciones futuras, en el artículo 127 se consagra específicamente: “Es un derecho y un deber de cada generación proteger y mantener el ambiente en beneficio de sí misma y del mundo futuro.Toda persona tiene derecho individual y colectivamente a disfrutar de una vida y de un ambiente seguro...”</w:t>
+        <w:t>“Por otra parte, los límites a la reelección reducen la rendición de cuentas de los representantes a través de las elecciones; impiden la profesionalización; debilitan al legislativo frente al ejecutivo; aumentan la influen- 75 Opinión Consultiva OC-28/21, supra, párrafos 126 a 146.”</w:t>
       </w:r>
     </w:p>
     <w:p>
@@ -2415,7 +2591,7 @@
         <w:pStyle w:val="Heading3"/>
       </w:pPr>
       <w:r>
-        <w:t>Los derechos humanos en Mexico - Emilio Alvarez Icaza Longoria.pdf — p. 35 — similitud 0.0593</w:t>
+        <w:t>Curso de derechos humanos - Ana Maria Ibarra Olguin.pdf — p. 172 — similitud 0.1722</w:t>
       </w:r>
     </w:p>
     <w:p>
@@ -2423,7 +2599,7 @@
         <w:ind w:left="360"/>
       </w:pPr>
       <w:r>
-        <w:t>“El Convenio Europeo, junto con sus protocolos adicionales, constituyen un tratado general de derechos civiles y políticos. Los derechos sociales, económicos y culturales están consagrados en la Carta Social Europea (1961-1965) y sus protocolos adicionales y revisiones en la Carta Social Europea Revisada (1996-1999). -Carta Social”</w:t>
+        <w:t>“Lo anterior, pues en ningún caso estas conductas podrían admi- tir cobertura constitucional.116 2. Los límites externos del derecho: el principio de proporcionalidad Corresponde ahora analizar los límites externos del derecho al libre desarrollo de la personalidad. Como se dijo, estos se refieren a las condiciones bajo las cua- les resulta válido limitar el supuesto de hecho de un derecho fundamental a nivel infraconstitucional, en aras de tutelar otro interés constitucional.”</w:t>
       </w:r>
     </w:p>
     <w:p>
@@ -2431,7 +2607,7 @@
         <w:pStyle w:val="Heading3"/>
       </w:pPr>
       <w:r>
-        <w:t>Como se hicieron los Derechos H - Ricardo Rabinovich Berkman.pdf — p. 125 — similitud 0.0557</w:t>
+        <w:t>Curso de derechos humanos - Ana Maria Ibarra Olguin.pdf — p. 140 — similitud 0.1718</w:t>
       </w:r>
     </w:p>
     <w:p>
@@ -2439,7 +2615,7 @@
         <w:ind w:left="360"/>
       </w:pPr>
       <w:r>
-        <w:t>“Esta posición generó ácidas críticas, y hasta asombro por parte de pensa- : dores que se manifestaban en general coincidentes con las ideas de Rawls. Sin :.;í embargo, y con todo lo problemático que el tema es, no deja de tratarse de una alternativa coherente con la creencia en la posibilidad de una base objetiva de la que se puedan desprender los derechos (o libertades) fundamentales.”</w:t>
+        <w:t>“Para algunos autores, por ejemplo, mientras que la teoría interna privilegia a la co- munidad y el concepto de libertad positiva, la teoría externa refleja una postura más liberal, pues reconoce la libertad negativa del individuo como base filosófica del Estado. Cfr.”</w:t>
       </w:r>
     </w:p>
     <w:p>
@@ -2447,7 +2623,7 @@
         <w:pStyle w:val="Heading3"/>
       </w:pPr>
       <w:r>
-        <w:t>Como se hicieron los Derechos H - Ricardo Rabinovich Berkman.pdf — p. 141 — similitud 0.0556</w:t>
+        <w:t>Curso de derechos humanos - Ana Maria Ibarra Olguin.pdf — p. 133 — similitud 0.1688</w:t>
       </w:r>
     </w:p>
     <w:p>
@@ -2455,7 +2631,7 @@
         <w:ind w:left="360"/>
       </w:pPr>
       <w:r>
-        <w:t>“Es la decisi- va lucha ideológica del siglo XXI, y la misión de nuestra generación", agrega- ba Bush a renglón seguido, colocando el ataque estadounidense a Irak en un nivel de necesidad apocalíptica, que hace acordar a los criterios de la "guerra santa", sobre los que volveremos más adelante. "El mundo está más seguro porque Saddam Hussein no está más en el poder. Y ahora el desafío es ayudar al pueblo iraquí a construir una de- mocracia que cumpla los sueños de los casi doce millones de iraquíes que salieron a votar en elecciones libres el último diciembre", concluía optimista el mandatario estadounidense213.”</w:t>
+        <w:t>“2. La teoría externa de los derechos. 3.”</w:t>
       </w:r>
     </w:p>
     <w:p>
@@ -2463,7 +2639,7 @@
         <w:pStyle w:val="Heading3"/>
       </w:pPr>
       <w:r>
-        <w:t>Como se hicieron los Derechos H - Ricardo Rabinovich Berkman.pdf — p. 217 — similitud 0.0555</w:t>
+        <w:t>Curso de derechos humanos - Ana Maria Ibarra Olguin.pdf — p. 176 — similitud 0.1647</w:t>
       </w:r>
     </w:p>
     <w:p>
@@ -2471,7 +2647,7 @@
         <w:ind w:left="360"/>
       </w:pPr>
       <w:r>
-        <w:t>“Advierte: "Los árboles que se doblan conservan sus ramas, pero los que se resis- ten acaban arrancados de raíz" (que es como Creón terminará: sin des- cendientes). Y emplea una imagen característica de un griego (aunque de un ateniense más que de un beocio): " Aquel piloto que, seguro de lo que hace, ajusta la escota de ía vela y no la suelta, realiza el resto del viaje con el navio tumbado" (713-717). El corifeo trata de ponerlos de acuerdo.”</w:t>
+        <w:t>“Carlos Gustavo Ponce Núñez 176 juego, así como la seguridad de las premisas epistémicas (empíricas y normativas) respecto de cada uno de ellos.119 3.  ¿Consistencia argumentativa? A pesar de lo dicho anteriormente, debe decirse que la Corte no siempre ha sido consistente con el uso de esta metodología, pues no siempre ha fijado los límites del derecho al libre desarrollo de la personalidad a través de un test de proporcionalidad.”</w:t>
       </w:r>
     </w:p>
     <w:p>
@@ -2479,7 +2655,7 @@
         <w:pStyle w:val="Heading3"/>
       </w:pPr>
       <w:r>
-        <w:t>Derechos humanos, teorias y doc - Luis Manuel Marcano Salazar.pdf — p. 108 — similitud 0.0548</w:t>
+        <w:t>Curso de derechos humanos - Ana Maria Ibarra Olguin.pdf — p. 335 — similitud 0.1453</w:t>
       </w:r>
     </w:p>
     <w:p>
@@ -2487,7 +2663,7 @@
         <w:ind w:left="360"/>
       </w:pPr>
       <w:r>
-        <w:t>“También se puede apreciar la influencia de del ius naturalismo en la admisión positiva Latinoamericana del Derecho Internacional, así se tiene que las bases del sistema jurídico está en el hecho de que el ser humano es, ante todo, un ser racional y social, de allí que este enfoque extrapolado a la sociedad internacional que está constituida por seres humanos, también tiende hacia la racionalidad y que los mismos actores establecen ciertas normas para la vida social internacional; así lo expone Toro Jiménez (2004), “La fundamentación del Derecho Internacional Público, como Derecho Positivo, en el Derecho Natural, reside en el mandato, originario de este último, de que los sujetos del Derecho...”</w:t>
+        <w:t>“Acceso a la justicia y debido proceso 335 Sin embargo, en el contexto interamericano, a pesar de su relevancia, no tiene reconocimiento expreso dentro de los catálogos de derechos fundamentales, sino que ha sido la jurisprudencia de la Corte Interamericana de Derechos Humanos la que lo ha ido definiendo y reconociendo como un derecho humano independiente del debido proceso26 a partir de lo previsto en los artículos 827 y 2528 en relación con el artículo 1.129 de la Convención Americana sobre Derechos Humanos. y VII.”</w:t>
       </w:r>
     </w:p>
     <w:p>
@@ -2495,7 +2671,7 @@
         <w:pStyle w:val="Heading3"/>
       </w:pPr>
       <w:r>
-        <w:t>Como se hicieron los Derechos H - Ricardo Rabinovich Berkman.pdf — p. 168 — similitud 0.0537</w:t>
+        <w:t>Curso de derechos humanos - Ana Maria Ibarra Olguin.pdf — p. 335 — similitud 0.1228</w:t>
       </w:r>
     </w:p>
     <w:p>
@@ -2503,7 +2679,7 @@
         <w:ind w:left="360"/>
       </w:pPr>
       <w:r>
-        <w:t>“VI. LAS PRIMERAS IDEAS SOBRE LOS LÍMITES AL PODER LEGÍTIMO "Alik mahrí tappaa ushezeb shá tuúdu iduú ibirshú liissur" ("Quien va primero, salva a su camarada, quien conoce el camino cuida a su amigo'"). Epopeya de GuiJgamesh, Tablilla IH §1.”</w:t>
+        <w:t>“Los Estados Partes se comprometen: a) a garantizar que la autoridad competente prevista por el sistema legal del Estado decidirá sobre los derechos de toda persona que interponga tal recur- so; b) a desarrollar las posibilidades de recurso judicial, y c) a garantizar el cumplimiento, por las autoridades competentes, de toda decisión en que se haya estimado procedente el recurso. 29 Convención Americana sobre Derechos Humanos. Artículo 1.”</w:t>
       </w:r>
     </w:p>
     <w:p>
@@ -2511,7 +2687,7 @@
         <w:pStyle w:val="Heading3"/>
       </w:pPr>
       <w:r>
-        <w:t>Derechos humanos, teorias y doc - Luis Manuel Marcano Salazar.pdf — p. 39 — similitud 0.0536</w:t>
+        <w:t>Curso de derechos humanos - Ana Maria Ibarra Olguin.pdf — p. 42 — similitud 0.1223</w:t>
       </w:r>
     </w:p>
     <w:p>
@@ -2519,7 +2695,55 @@
         <w:ind w:left="360"/>
       </w:pPr>
       <w:r>
-        <w:t>“Se imponen a todas las normas del Derecho creado por el Soberano y son un límite a su acción. (p.26) Para los positivistas, el hombre, en razón del desarrollo histórico de la sociedad, se encuentra revestido de derechos variables y sometidos al flujo del devenir que impone la convivencia social, consideran que estos derechos son únicamente aquellos reconocidos expresamente en el texto constitucional por el propio Estado, teniendo por ello un carácter constitutivo su consagración.”</w:t>
+        <w:t>“REQUISITOS PARA RESTRINGIRLOS O SUSPENDER- LOS CONFORME A LOS ARTÍCULOS 1o. DE LA CONSTITUCIÓN POLÍTICA DE LOS ESTADOS UNIDOS MEXICANOS Y 30 DE LA CONVENCIÓN AMERICANA SOBRE DERECHOS HUMANOS”, Primera Sala, Semanario Judicial de la Federación y su Gaceta, 10a. época, lib. XXII, julio de 2013, t.”</w:t>
+      </w:r>
+    </w:p>
+    <w:p>
+      <w:pPr>
+        <w:pStyle w:val="Heading3"/>
+      </w:pPr>
+      <w:r>
+        <w:t>Curso de derechos humanos - Ana Maria Ibarra Olguin.pdf — p. 166 — similitud 0.1206</w:t>
+      </w:r>
+    </w:p>
+    <w:p>
+      <w:pPr>
+        <w:ind w:left="360"/>
+      </w:pPr>
+      <w:r>
+        <w:t>“LOS LÍMITES DEL DERECHO 1. Límites internos y límites externos de los derechos De acuerdo con un sector de la doctrina, existen dos tipos de disposiciones constitucionales relacionadas con el límite y el alcance de los derechos.”</w:t>
+      </w:r>
+    </w:p>
+    <w:p>
+      <w:pPr>
+        <w:pStyle w:val="Heading3"/>
+      </w:pPr>
+      <w:r>
+        <w:t>Curso de derechos humanos - Ana Maria Ibarra Olguin.pdf — p. 514 — similitud 0.1194</w:t>
+      </w:r>
+    </w:p>
+    <w:p>
+      <w:pPr>
+        <w:ind w:left="360"/>
+      </w:pPr>
+      <w:r>
+        <w:t>“El principio de paridad de género en materia electoral se introdujo a nuestro país con la reforma político-electoral de 2014, a través de la cual se estableció en la fracción I del artículo 41 constitucional204 la obligación a cargo de los partidos ciudadanos y las ciudadanas que soliciten su registro de manera independiente y cumplan con los requisitos, condiciones y términos que determine la legislación; 202 Convención Americana sobre Derechos Humanos ARTÍCULO 24. Igualdad ante la Ley Todas las personas son iguales ante la ley.”</w:t>
+      </w:r>
+    </w:p>
+    <w:p>
+      <w:pPr>
+        <w:pStyle w:val="Heading3"/>
+      </w:pPr>
+      <w:r>
+        <w:t>Curso de derechos humanos - Ana Maria Ibarra Olguin.pdf — p. 739 — similitud 0.1178</w:t>
+      </w:r>
+    </w:p>
+    <w:p>
+      <w:pPr>
+        <w:ind w:left="360"/>
+      </w:pPr>
+      <w:r>
+        <w:t>“Ante ello, Vázquez logra dilucidar algunas pautas que pueden ser de orientación metodológica a la hora de aplicar esta categoría:98 en primer lugar, se deberá identificar el contenido esencial del derecho, en aras de establecer la finalidad y las obligaciones fundamentales que derivan del principio del que se trate; en segundo, establecer si existen sistemas de indicadores que pue- dan ser abordados en relación con el derecho en cuestión; en tercero, cuestionar si se han elaborado diagnósticos periódicos sobre el contexto de restricciones materiales, para hacer efectivo el contenido esencial de los derechos; en cuarto lugar, definir si hay políticas públicas, planes de acción o...”</w:t>
       </w:r>
     </w:p>
     <w:p>
@@ -2530,7 +2754,7 @@
         <w:t xml:space="preserve">Observación automática: </w:t>
       </w:r>
       <w:r>
-        <w:t>La ficha presenta coincidencias débiles; se recomienda validar manualmente las citas. Se agruparon referencias de múltiples fuentes para enriquecer el concepto. Hay 15 referencia(s) de baja similitud que podrían introducir ruido.</w:t>
+        <w:t>La ficha presenta coincidencias útiles, pero conviene revisar la pertinencia de cada cita. Se agruparon referencias de múltiples fuentes para enriquecer el concepto.</w:t>
       </w:r>
     </w:p>
     <w:p>
@@ -2538,7 +2762,7 @@
         <w:pStyle w:val="Heading2"/>
       </w:pPr>
       <w:r>
-        <w:t>Ficha 07. características del seguro privado</w:t>
+        <w:t>Ficha 07. seguro</w:t>
       </w:r>
     </w:p>
     <w:p>
@@ -2549,7 +2773,7 @@
         <w:t xml:space="preserve">Fuentes: </w:t>
       </w:r>
       <w:r>
-        <w:t>Como se hicieron los Derechos H - Ricardo Rabinovich Berkman.pdf; Derechos humanos, teorias y doc - Luis Manuel Marcano Salazar.pdf; Los derechos humanos en Mexico - Emilio Alvarez Icaza Longoria.pdf</w:t>
+        <w:t>Curso de derechos humanos - Ana Maria Ibarra Olguin.pdf; Derecho de la seguridad social - Alberto Briceno Ruiz.pdf; Derecho humano a la seguridad s - Jose Luis Belmont Lugo.pdf; El derecho a la seguridad socia - Diana Beatriz Gonzalez Carvallo.pdf; Evolucion de la  Seguridad Soci - Ernesto Cotonieto-Martinez.pdf; La seguridad social y los  desa - Ana Belem Hernandez.pdf; Ley del Instituto de Seguridad - Camara de Diputados del H. Cong.pdf; Ley del Seguro Social - Camara de Diputados del H. Cong.pdf</w:t>
       </w:r>
     </w:p>
     <w:p>
@@ -2560,7 +2784,7 @@
         <w:t xml:space="preserve">Ubicaciones: </w:t>
       </w:r>
       <w:r>
-        <w:t>Como se hicieron los Derechos H - Ricardo Rabinovich Berkman.pdf, p. 122; Como se hicieron los Derechos H - Ricardo Rabinovich Berkman.pdf, p. 141; Como se hicieron los Derechos H - Ricardo Rabinovich Berkman.pdf, p. 198; Como se hicieron los Derechos H - Ricardo Rabinovich Berkman.pdf, p. 217; Como se hicieron los Derechos H - Ricardo Rabinovich Berkman.pdf, p. 238; Como se hicieron los Derechos H - Ricardo Rabinovich Berkman.pdf, p. 33; Como se hicieron los Derechos H - Ricardo Rabinovich Berkman.pdf, p. 82; Como se hicieron los Derechos H - Ricardo Rabinovich Berkman.pdf, p. 91; Derechos humanos, teorias y doc - Luis Manuel Marcano Salazar.pdf, p. 103; Derechos humanos, teorias y doc - Luis Manuel Marcano Salazar.pdf, p. 113; Derechos humanos, teorias y doc - Luis Manuel Marcano Salazar.pdf, p. 128; Derechos humanos, teorias y doc - Luis Manuel Marcano Salazar.pdf, p. 135; Derechos humanos, teorias y doc - Luis Manuel Marcano Salazar.pdf, p. 16; Derechos humanos, teorias y doc - Luis Manuel Marcano Salazar.pdf, p. 23; Derechos humanos, teorias y doc - Luis Manuel Marcano Salazar.pdf, p. 29; Derechos humanos, teorias y doc - Luis Manuel Marcano Salazar.pdf, p. 54; Derechos humanos, teorias y doc - Luis Manuel Marcano Salazar.pdf, p. 56; Derechos humanos, teorias y doc - Luis Manuel Marcano Salazar.pdf, p. 82; Derechos humanos, teorias y doc - Luis Manuel Marcano Salazar.pdf, p. 83; Los derechos humanos en Mexico - Emilio Alvarez Icaza Longoria.pdf, p. 26; Los derechos humanos en Mexico - Emilio Alvarez Icaza Longoria.pdf, p. 29; Los derechos humanos en Mexico - Emilio Alvarez Icaza Longoria.pdf, p. 8</w:t>
+        <w:t>Curso de derechos humanos - Ana Maria Ibarra Olguin.pdf, p. 913; Derecho de la seguridad social - Alberto Briceno Ruiz.pdf, p. 138; Derecho de la seguridad social - Alberto Briceno Ruiz.pdf, p. 24; Derecho de la seguridad social - Alberto Briceno Ruiz.pdf, p. 25; Derecho de la seguridad social - Alberto Briceno Ruiz.pdf, p. 26; Derecho de la seguridad social - Alberto Briceno Ruiz.pdf, p. 27; Derecho de la seguridad social - Alberto Briceno Ruiz.pdf, p. 28; Derecho de la seguridad social - Alberto Briceno Ruiz.pdf, p. 313; Derecho de la seguridad social - Alberto Briceno Ruiz.pdf, p. 38; Derecho de la seguridad social - Alberto Briceno Ruiz.pdf, p. 381; Derecho de la seguridad social - Alberto Briceno Ruiz.pdf, p. 382; Derecho de la seguridad social - Alberto Briceno Ruiz.pdf, p. 39; Derecho de la seguridad social - Alberto Briceno Ruiz.pdf, p. 51; Derecho de la seguridad social - Alberto Briceno Ruiz.pdf, p. 66; Derecho humano a la seguridad s - Jose Luis Belmont Lugo.pdf, p. 3; El derecho a la seguridad socia - Diana Beatriz Gonzalez Carvallo.pdf, p. 190; El derecho a la seguridad socia - Diana Beatriz Gonzalez Carvallo.pdf, p. 293; Evolucion de la  Seguridad Soci - Ernesto Cotonieto-Martinez.pdf, p. 17; La seguridad social y los  desa - Ana Belem Hernandez.pdf, p. 17; La seguridad social y los  desa - Ana Belem Hernandez.pdf, p. 36; Ley del Instituto de Seguridad - Camara de Diputados del H. Cong.pdf, p. 47; Ley del Seguro Social - Camara de Diputados del H. Cong.pdf, p. 102; Ley del Seguro Social - Camara de Diputados del H. Cong.pdf, p. 119; Ley del Seguro Social - Camara de Diputados del H. Cong.pdf, p. 26; Ley del Seguro Social - Camara de Diputados del H. Cong.pdf, p. 75</w:t>
       </w:r>
     </w:p>
     <w:p>
@@ -2568,7 +2792,7 @@
         <w:pStyle w:val="Heading3"/>
       </w:pPr>
       <w:r>
-        <w:t>Derechos humanos, teorias y doc - Luis Manuel Marcano Salazar.pdf — p. 113 — similitud 0.0952</w:t>
+        <w:t>Derecho de la seguridad social - Alberto Briceno Ruiz.pdf — p. 66 — similitud 0.2786</w:t>
       </w:r>
     </w:p>
     <w:p>
@@ -2576,7 +2800,7 @@
         <w:ind w:left="360"/>
       </w:pPr>
       <w:r>
-        <w:t>“Derecho a la vida Toda persona tiene derecho a que se respete su vida. Este derecho estará protegido por la ley y, en general, a partir del momento de la concepción. Nadie puede ser privado de la vida arbitrariamente.”</w:t>
+        <w:t>“Seguro obligatorio de invalidez, vejez y muerte: a) Seguro de los obreros. b) Seguro de los empleados. c) Seguro de los mineros. 4.”</w:t>
       </w:r>
     </w:p>
     <w:p>
@@ -2584,7 +2808,7 @@
         <w:pStyle w:val="Heading3"/>
       </w:pPr>
       <w:r>
-        <w:t>Derechos humanos, teorias y doc - Luis Manuel Marcano Salazar.pdf — p. 82 — similitud 0.0912</w:t>
+        <w:t>Derecho de la seguridad social - Alberto Briceno Ruiz.pdf — p. 138 — similitud 0.2644</w:t>
       </w:r>
     </w:p>
     <w:p>
@@ -2592,7 +2816,7 @@
         <w:ind w:left="360"/>
       </w:pPr>
       <w:r>
-        <w:t>“forma enmendada por el Protocolo N º 11 • Protocolo N º 5 de la Convención para la Protección de los Derechos Humanos y las Libertades Fundamentales, se modifican los artículos 22 y 40 de la Convención • Convenio Europeo para la adopción de niños • Convenio europeo sobre la repatriación de los menores • Convenio europeo sobre inmunidad de los Estados • Protocolo adicional al Convenio Europeo para la inmunidad de los Estado • Convenio Europeo para la Seguridad Social • Acuerdo Complementario para la Aplicación de la Convención Europea para la Seguridad Social • Convenio Europeo sobre la no Aplicabilidad de las Limitaciones legales a los crímenes de lesa humanidad y crímenes de guerra •...”</w:t>
+        <w:t>“122 Las leyes del Seguro Social En éste, sólo se otorgan prestaciones en especie dentro del seguro de en­ fermedades y maternidad, tanto para los reconocidos por la Ley: cónyuge, concubino(a), descendientes y ascendientes, como para aquellos que depen­ dan económicamente del asegurado (art, 241) y que no estén protegidos. Las modalidades que se convengan {art.”</w:t>
       </w:r>
     </w:p>
     <w:p>
@@ -2600,7 +2824,7 @@
         <w:pStyle w:val="Heading3"/>
       </w:pPr>
       <w:r>
-        <w:t>Derechos humanos, teorias y doc - Luis Manuel Marcano Salazar.pdf — p. 128 — similitud 0.0816</w:t>
+        <w:t>Ley del Seguro Social - Camara de Diputados del H. Cong.pdf — p. 75 — similitud 0.2189</w:t>
       </w:r>
     </w:p>
     <w:p>
@@ -2608,7 +2832,7 @@
         <w:ind w:left="360"/>
       </w:pPr>
       <w:r>
-        <w:t>“Como colaboradores sociales, seguiremos bregando por la formación de asociaciones estables con todos los grandes grupos, respetando el importante papel independiente que desempeña cada uno de ellos. 9.- Conviniendo que en la realización de sus actividades legítimas el sector privado, incluidas tanto las grandes empresas como las pequeñas, tiene el deber de contribuir a la evolución de comunidades y sociedades equitativas y sostenibles. 10.”</w:t>
+        <w:t>“CONGRESO DE LA UNIÓN Secretaría General Secretaría de Servicios Parlamentarios Última Reforma DOF 15-01-2026 I. Administrar los seguros de riesgos de trabajo, enfermedades y maternidad, invalidez y vida, guarderías y prestaciones sociales, salud para la familia, adicionales y otros, así como prestar los servicios de beneficio colectivo que señala esta Ley; Fracción reformada DOF 20-12-2001 II. Satisfacer las prestaciones que se establecen en esta Ley; III.”</w:t>
       </w:r>
     </w:p>
     <w:p>
@@ -2616,7 +2840,7 @@
         <w:pStyle w:val="Heading3"/>
       </w:pPr>
       <w:r>
-        <w:t>Los derechos humanos en Mexico - Emilio Alvarez Icaza Longoria.pdf — p. 29 — similitud 0.0809</w:t>
+        <w:t>Derecho de la seguridad social - Alberto Briceno Ruiz.pdf — p. 39 — similitud 0.2185</w:t>
       </w:r>
     </w:p>
     <w:p>
@@ -2624,7 +2848,7 @@
         <w:ind w:left="360"/>
       </w:pPr>
       <w:r>
-        <w:t>“28 Los derechos humanos en México 2) El derecho a la seguridad social, a un nivel de vida adecuado y a los niveles más altos posibles de bienestar físico y mental. 3) El derecho a la educación y el disfrute de los beneficios de la libertad cultural y el progreso científico.”</w:t>
+        <w:t>“El seguro facultativo da al asegurado en el régimen obligatorio la posibilidad de incorporar al sistema del seguro social a familiares o personas que no tie­ nen el carácter de beneficiarios, mediante convenios que al respecto celebren. Representa una facilidad para el asegurado, al poder inscribir a personas que dependen de él, con la facilidad de inscribirlos y poder darlos de baja, sin ma­ yor trámite.”</w:t>
       </w:r>
     </w:p>
     <w:p>
@@ -2632,7 +2856,7 @@
         <w:pStyle w:val="Heading3"/>
       </w:pPr>
       <w:r>
-        <w:t>Derechos humanos, teorias y doc - Luis Manuel Marcano Salazar.pdf — p. 128 — similitud 0.0778</w:t>
+        <w:t>Derecho de la seguridad social - Alberto Briceno Ruiz.pdf — p. 51 — similitud 0.2111</w:t>
       </w:r>
     </w:p>
     <w:p>
@@ -2640,7 +2864,7 @@
         <w:ind w:left="360"/>
       </w:pPr>
       <w:r>
-        <w:t>“10. También se convino en prestar asistencia a fin de aumentar las oportunidades de empleo generador de ingresos, teniendo en cuenta la Declaración de Principios de la Organización Internacional del Trabajo relativa a los Derechos Fundamentales en el Trabajo. 11.- Además, en que es necesario que las empresas del sector privado cumplan la obligación de rendir cuentas, rendición que ha de tener lugar en un entorno reglamentario transparente y estable.”</w:t>
+        <w:t>“Son características del aseguramiento la obligatoriedad en cuanto a los esclavos mayores de 10 años, con valor fijado por su dueño en el momento de iniciarse el seguro por inscripción en el registro, pagando por los asegurados una prima anual por semestres, proporcional a la estimación registrada. En caso de siniestro; esto es, si ocurría el riesgo previsto de la fuga del esclavo y no se le restituía al poder de su dueño en el plazo de dos meses, el seguro pagaba al propie­ tario el importe del valor asegurado.”</w:t>
       </w:r>
     </w:p>
     <w:p>
@@ -2648,7 +2872,7 @@
         <w:pStyle w:val="Heading3"/>
       </w:pPr>
       <w:r>
-        <w:t>Derechos humanos, teorias y doc - Luis Manuel Marcano Salazar.pdf — p. 113 — similitud 0.0776</w:t>
+        <w:t>Ley del Instituto de Seguridad - Camara de Diputados del H. Cong.pdf — p. 47 — similitud 0.2091</w:t>
       </w:r>
     </w:p>
     <w:p>
@@ -2656,7 +2880,7 @@
         <w:ind w:left="360"/>
       </w:pPr>
       <w:r>
-        <w:t>“Luis Manuel Marcano Salazar el PIDCP y las Declaraciones (Universal y Americana) guardan silencio sobre la cuestión de saber cuándo hay que reconocer y proteger la vida. Se estima conveniente señalar algunos instrumentos internacionales que consagran el derecho a la vida 4.1.1.- Declaración Universal de Derechos Humanos Artículo 3 Todo individuo tiene derecho a la vida, a la libertad y a la seguridad de su persona. 4.1.2.- Pacto Internacional de Derechos Civiles y Políticos (PIDCP) Artículo 6 1.”</w:t>
+        <w:t>“CONGRESO DE LA UNIÓN Secretaría General Secretaría de Servicios Parlamentarios Última Reforma DOF 15-01-2026 Artículo 143. Los Trabajadores que por tener relación laboral con dos o más patrones coticen simultáneamente al Instituto y al IMSS, tendrán derecho a recibir atención médica y demás servicios del seguro de salud por parte de ambos. Artículo 144.”</w:t>
       </w:r>
     </w:p>
     <w:p>
@@ -2664,7 +2888,7 @@
         <w:pStyle w:val="Heading3"/>
       </w:pPr>
       <w:r>
-        <w:t>Derechos humanos, teorias y doc - Luis Manuel Marcano Salazar.pdf — p. 83 — similitud 0.0732</w:t>
+        <w:t>Derecho de la seguridad social - Alberto Briceno Ruiz.pdf — p. 313 — similitud 0.2058</w:t>
       </w:r>
     </w:p>
     <w:p>
@@ -2672,7 +2896,7 @@
         <w:ind w:left="360"/>
       </w:pPr>
       <w:r>
-        <w:t>“a la Prevención de la Tortura y los Tratos Inhumanos o Degradantes • Protocolo del Convenio Europeo de Seguridad Social • Convenio Marco para la Protección de las Minorías Nacionales • Convenio Europeo sobre el Ejercicio de los Derechos del Niño • Sexto Protocolo del Acuerdo General sobre Privilegios e Inmunidades del Consejo de Europa • Carta Social Europea • Convenio Europeo sobre la Nacionalidad • Protocolo adicional al Convenio sobre traslado de personas condenadas • Protocolo Adicional a la Convención para la Protección de los Derechos Humanos y la Dignidad del Ser Humano con respecto a las aplicaciones de la Biología y la Medicina, sobre la prohibición de la clonación de seres humanos...”</w:t>
+        <w:t>“Las sociedades mercantiles en ei seguro ue retiro, cesantía en edad avanzada y vejez 2 9 7 nombre del trabajador o de sus beneficiarios un seguro de sobrevivencia, en los términos que determine la Comisión de Seguros y Fianzas: Artículo 189.”</w:t>
       </w:r>
     </w:p>
     <w:p>
@@ -2680,7 +2904,7 @@
         <w:pStyle w:val="Heading3"/>
       </w:pPr>
       <w:r>
-        <w:t>Derechos humanos, teorias y doc - Luis Manuel Marcano Salazar.pdf — p. 29 — similitud 0.0726</w:t>
+        <w:t>Derecho de la seguridad social - Alberto Briceno Ruiz.pdf — p. 26 — similitud 0.2012</w:t>
       </w:r>
     </w:p>
     <w:p>
@@ -2688,7 +2912,7 @@
         <w:ind w:left="360"/>
       </w:pPr>
       <w:r>
-        <w:t>“15). De una vez manifiesta tajantemente su objetivo, no se detendrá a divagar y concibe al derecho libre de elementos metajurídicos; el hombre está escindido entre el mundo del “ser”y del “deber ser”; el hombre sólo es capaz de conocer lo dado, escapándosele toda metafísica; pretende (…)“brindar una definición de la norma jurídica totalmente independiente de la noción de norma moral (…) al afirmar la autonomía del derecho respecto de la moral.”</w:t>
+        <w:t>“La se­ guridad es el género; el seguro social, su instrumento. Desde luego, diversas disciplinas como la medicina, ergonomía, economía, estadística y matemática guardan relación con la seguridad y gravan o benefician su desarrollo, depen­ diendo, en buena parte, de la eficacia del seguro social. La relación entre seguridad social y seguro social, con sus distinciones, se presenta en el cuadro siguiente:”</w:t>
       </w:r>
     </w:p>
     <w:p>
@@ -2696,7 +2920,7 @@
         <w:pStyle w:val="Heading3"/>
       </w:pPr>
       <w:r>
-        <w:t>Los derechos humanos en Mexico - Emilio Alvarez Icaza Longoria.pdf — p. 26 — similitud 0.0724</w:t>
+        <w:t>Ley del Seguro Social - Camara de Diputados del H. Cong.pdf — p. 102 — similitud 0.2001</w:t>
       </w:r>
     </w:p>
     <w:p>
@@ -2704,7 +2928,7 @@
         <w:ind w:left="360"/>
       </w:pPr>
       <w:r>
-        <w:t>“Por otro, se presenta la historia, características y funcionamiento del sistema Ombudsman, y se aborda el trabajo que realizan algunas osc para la defensa de los derechos humanos a nivel internacional. 4.1 Principales instrumentos de defensa y protección 4.1.1 El sistema internacional Los primeros antecedentes en torno a la integración de un sistema jurídico internacional de protección de las personas se encuentran en la definición del Derecho Internacional Humanitario (dih), con- cebido en el siglo xix, cuyo antecedente más claro, a su vez, puede Antecedentes en el siglo XIX”</w:t>
+        <w:t>“Artículo reformado DOF 14-12-2005 Artículo 300. El derecho de los asegurados o sus beneficiarios para reclamar el pago de las prestaciones en dinero, respecto a los seguros de riesgos de trabajo, enfermedades y maternidad, invalidez y vida y guarderías y prestaciones sociales prescribe en un año de acuerdo con las reglas siguientes: I. Cualquier mensualidad de una pensión, asignación familiar o ayuda asistencial, así como el aguinaldo; II.”</w:t>
       </w:r>
     </w:p>
     <w:p>
@@ -2712,7 +2936,7 @@
         <w:pStyle w:val="Heading3"/>
       </w:pPr>
       <w:r>
-        <w:t>Derechos humanos, teorias y doc - Luis Manuel Marcano Salazar.pdf — p. 128 — similitud 0.0718</w:t>
+        <w:t>Derecho de la seguridad social - Alberto Briceno Ruiz.pdf — p. 38 — similitud 0.1984</w:t>
       </w:r>
     </w:p>
     <w:p>
@@ -2720,7 +2944,7 @@
         <w:ind w:left="360"/>
       </w:pPr>
       <w:r>
-        <w:t>“También se convino en prestar asistencia a fin de aumentar las oportunidades de empleo generador de ingresos, teniendo en cuenta la Declaración de Principios de la Organización Internacional del Trabajo relativa a los Derechos Fundamentales en el Trabajo. 11.- Además, en que es necesario que las empresas del sector privado cumplan la obligación de rendir cuentas, rendición que ha de tener lugar en un entorno reglamentario transparente y estable. 127”</w:t>
+        <w:t>“22 Principios estructurales generan derechos a su favor, por lo que se trata más de un servicio de bene­ ficencia, que corresponde a la Secretaría de Salud y compite con el llamado "Seguro Popular”. Regímenes de Seguro En el art.”</w:t>
       </w:r>
     </w:p>
     <w:p>
@@ -2728,7 +2952,7 @@
         <w:pStyle w:val="Heading3"/>
       </w:pPr>
       <w:r>
-        <w:t>Como se hicieron los Derechos H - Ricardo Rabinovich Berkman.pdf — p. 82 — similitud 0.0667</w:t>
+        <w:t>Ley del Seguro Social - Camara de Diputados del H. Cong.pdf — p. 119 — similitud 0.1930</w:t>
       </w:r>
     </w:p>
     <w:p>
@@ -2736,7 +2960,7 @@
         <w:ind w:left="360"/>
       </w:pPr>
       <w:r>
-        <w:t>“Empero, podría suceder que un hombre excelente se enamorase de una mujer justamente atraído por esa defor- midad. O que ella le generase a la víctima un contrato cinematográfico millona- rio, por adecuarse perfectamente a las características físicas de un personaje. Es decir, que no hay certeza deí perjuicio futuro.”</w:t>
+        <w:t>“LEY DEL SEGURO SOCIAL CÁMARA DE DIPUTADOS DEL H. CONGRESO DE LA UNIÓN Secretaría General Secretaría de Servicios Parlamentarios Última Reforma DOF 15-01-2026 DECRETO por el que se reforman diversas disposiciones de la Ley del Seguro Social.”</w:t>
       </w:r>
     </w:p>
     <w:p>
@@ -2744,7 +2968,7 @@
         <w:pStyle w:val="Heading3"/>
       </w:pPr>
       <w:r>
-        <w:t>Derechos humanos, teorias y doc - Luis Manuel Marcano Salazar.pdf — p. 113 — similitud 0.0658</w:t>
+        <w:t>Derecho de la seguridad social - Alberto Briceno Ruiz.pdf — p. 381 — similitud 0.1897</w:t>
       </w:r>
     </w:p>
     <w:p>
@@ -2752,7 +2976,7 @@
         <w:ind w:left="360"/>
       </w:pPr>
       <w:r>
-        <w:t>“Este derecho estará protegido por la ley. Nadie podrá ser privado de la vida arbitrariamente. 4.1.3.- Declaración Americana de los Derechos y Deberes del Hombre Artículo I.”</w:t>
+        <w:t>“Las divido en administrativas y fiscalizadoras. Entre las primera está administrar los seguros de riesgos de trabajo, enfermedades y maternidad, invalidez y vida, guarderías y prestaciones sociales, salud para la familia, adicionales y otros. Si bien no menciona el seguro de retiro, cesantía en edad avanzada y vejez, su consideración no deja lugar a duda.”</w:t>
       </w:r>
     </w:p>
     <w:p>
@@ -2760,7 +2984,7 @@
         <w:pStyle w:val="Heading3"/>
       </w:pPr>
       <w:r>
-        <w:t>Como se hicieron los Derechos H - Ricardo Rabinovich Berkman.pdf — p. 33 — similitud 0.0643</w:t>
+        <w:t>Derecho de la seguridad social - Alberto Briceno Ruiz.pdf — p. 28 — similitud 0.1874</w:t>
       </w:r>
     </w:p>
     <w:p>
@@ -2768,7 +2992,7 @@
         <w:ind w:left="360"/>
       </w:pPr>
       <w:r>
-        <w:t>“Porque lo que hace a una paella ser tal, su esencia, son el arroz y los mariscos (característicos ambos de la región de Valencia). La idea de que determinados derechos fueran esenciales implicaría pensar que éstos hacen al ser humano, que integran la sustancia de éste. Es decir, que sin esas prerrogativas no tengo un ser humano.”</w:t>
+        <w:t>“Me atrevería a sostener que se remonta al momento mismo de la creación, en que el universo y los sistemas de planetas son producto de una armonía de fuerzas. El seguro social nació a fines del siglo XIX por la acción decidida de los gobiernos europeos, casi al tiempo que se estructura el derecho del trabajo, sin contar con su dinámica. Las publicaciones al respecto son escasas y su vinculación con la legislación laboral persiste hasta nuestros días.”</w:t>
       </w:r>
     </w:p>
     <w:p>
@@ -2776,7 +3000,7 @@
         <w:pStyle w:val="Heading3"/>
       </w:pPr>
       <w:r>
-        <w:t>Derechos humanos, teorias y doc - Luis Manuel Marcano Salazar.pdf — p. 56 — similitud 0.0626</w:t>
+        <w:t>Derecho humano a la seguridad s - Jose Luis Belmont Lugo.pdf — p. 3 — similitud 0.1786</w:t>
       </w:r>
     </w:p>
     <w:p>
@@ -2784,7 +3008,7 @@
         <w:ind w:left="360"/>
       </w:pPr>
       <w:r>
-        <w:t>“Sin embargo, también patrocina la necesidad de un pacto entre las individualidades para formar un gobierno (…) las voluntades individuales siguen siendo el origen y forman los elementos esenciales; pero, consideradas separadamente, su poder sería nulo, puesto que sólo reside en el conjunto44.Tal es el origen de un gobierno, ejercido por procuración; coincide con Locke, en legar una porción de poder «a algunos de ellos» el pueblo es numeroso y es imposible consultarlo en su totalidad por toda la nación; esta delegación no implica un desprendimiento total del poder soberano. Expone su celebre tesis acerca del poder constituyente originario de esta manera:”</w:t>
+        <w:t>“11 3. Fuente internacional del derecho a la seguridad social . . . . . . . . . . . . . . . . . . . 13 4.”</w:t>
       </w:r>
     </w:p>
     <w:p>
@@ -2792,7 +3016,7 @@
         <w:pStyle w:val="Heading3"/>
       </w:pPr>
       <w:r>
-        <w:t>Derechos humanos, teorias y doc - Luis Manuel Marcano Salazar.pdf — p. 54 — similitud 0.0600</w:t>
+        <w:t>Ley del Seguro Social - Camara de Diputados del H. Cong.pdf — p. 75 — similitud 0.1702</w:t>
       </w:r>
     </w:p>
     <w:p>
@@ -2800,7 +3024,7 @@
         <w:ind w:left="360"/>
       </w:pPr>
       <w:r>
-        <w:t>“• La doctrina de Jellinek, para quien la Declaración francesa emuló las declaraciones norteamericanas que a su vez surgieron ideológicamente de las concepciones puritanas mayormente inspiradas por inmigrantes protestantes. • La doctrina francesa, a partir de las tesis de Boutmy polemizando con Jellinek, que desecha tanto la paternidad americana como germánica, insistiendo en su derivación por el influjo de la literatura europea, y especialmente del pensamiento ilustrado francés del siglo XVIII. • La doctrina ecléctica, consistente en afirmar que son compatibles tanto el criterio de Jellinek como la tesis oposicionista de Boutmy.”</w:t>
+        <w:t>“Recaudar y cobrar las cuotas de los seguros de riesgos de trabajo, enfermedades y maternidad, invalidez y vida, guarderías y prestaciones sociales, salud para la familia y adicionales, los capitales constitutivos, así como sus accesorios legales, percibir los demás recursos del Instituto, y llevar a cabo programas de regularización de pago de cuotas. De igual forma, recaudar y cobrar las cuotas y sus accesorios legales del seguro de retiro, cesantía en edad avanzada y vejez; Fracción reformada DOF 20-12-2001 XIII.”</w:t>
       </w:r>
     </w:p>
     <w:p>
@@ -2808,7 +3032,7 @@
         <w:pStyle w:val="Heading3"/>
       </w:pPr>
       <w:r>
-        <w:t>Derechos humanos, teorias y doc - Luis Manuel Marcano Salazar.pdf — p. 103 — similitud 0.0595</w:t>
+        <w:t>Curso de derechos humanos - Ana Maria Ibarra Olguin.pdf — p. 913 — similitud 0.1700</w:t>
       </w:r>
     </w:p>
     <w:p>
@@ -2816,7 +3040,7 @@
         <w:ind w:left="360"/>
       </w:pPr>
       <w:r>
-        <w:t>“En el mismo la Comisión explana enfáticamente como debe ser interpretado el artículo 30 de la Convención Americana sobre Derechos Humanos, criterio que esta a su vez compaginado con el discernimiento de la Corte Interamericana de Derechos Humanos, es decir ambos organismos integrantes del sistema de protección de los derechos humanos en Latinoamérica, no tienen divergencias y quien alegue mejor razonamiento a este precedente debe desmontar todo un sistema que poco a poco ha ido sentando unas bases sólidas en reconocimiento y defensa de los derechos humanos; por lo que: (…) Al respecto, la CIDH reitera que las únicas restricciones admisibles para regular el ejercicio y goce de los derechos...”</w:t>
+        <w:t>“El derecho a la seguridad social 913 causa de muerte —de viudez en el matrimonio y en el concubinato, de orfandad y ascendencia— y servicios de guarderías. La inmensa mayoría de sentencias de la SCJN sobre seguridad social se origina en litigios dentro del modelo contributivo de aseguramiento social. Las pocas que hay sobre “programas sociales”, o modelo de seguridad social no contributivo, no le dicen, por razones que habrá que explorar con más detenimiento, “derecho a la seguridad social” al derecho a la seguridad social.”</w:t>
       </w:r>
     </w:p>
     <w:p>
@@ -2824,7 +3048,7 @@
         <w:pStyle w:val="Heading3"/>
       </w:pPr>
       <w:r>
-        <w:t>Como se hicieron los Derechos H - Ricardo Rabinovich Berkman.pdf — p. 122 — similitud 0.0582</w:t>
+        <w:t>Derecho de la seguridad social - Alberto Briceno Ruiz.pdf — p. 26 — similitud 0.1676</w:t>
       </w:r>
     </w:p>
     <w:p>
@@ -2832,7 +3056,7 @@
         <w:ind w:left="360"/>
       </w:pPr>
       <w:r>
-        <w:t>“Soy de tal clase social, tengo tales ingresos económicos, mi piel es de tal color, nací en un hogar de determinada religión, poseo esta inclinación sexual, sigo aquellas ideas políticas, padezco un defecto físico.,&gt; Así es que sugiere que la respuesta sólo podría surgir de un ejercicio mental Es decir, un procedimiento ficticio ¿Es ello un disparate? Todas las teorías pactistas, que plantean al contrato social como base de la estructura política y jurídica humana, parten de una ficción, que sus seguido- res saben perfectamente que lo es.”</w:t>
+        <w:t>“Asimismo, en la medida de su eficacia y cuidadosa administración, el se­ guro social es un instrumento de paz social, especialmente en esta época en la que los problemas internos se han hecho evidentes con mayores índices de inseguridad. Seguridad social y seguro social La existencia de la seguridad social supone y condiciona al seguro social; el crecimiento del seguro social amplía el marco de la seguridad social.”</w:t>
       </w:r>
     </w:p>
     <w:p>
@@ -2840,7 +3064,7 @@
         <w:pStyle w:val="Heading3"/>
       </w:pPr>
       <w:r>
-        <w:t>Como se hicieron los Derechos H - Ricardo Rabinovich Berkman.pdf — p. 198 — similitud 0.0575</w:t>
+        <w:t>Derecho de la seguridad social - Alberto Briceno Ruiz.pdf — p. 27 — similitud 0.1412</w:t>
       </w:r>
     </w:p>
     <w:p>
@@ -2848,7 +3072,7 @@
         <w:ind w:left="360"/>
       </w:pPr>
       <w:r>
-        <w:t>“Como ésta, también del Éxodo, que se relaciona con disposiciones de la piedra de Ha- mmurabi: "El que hiera a un hombre de modo que en efecto muera, ha de ser muerto sin falta" (21.12). Otras, buscan resguardar elementos esenciales del ser humano en forma bastante minuciosa: "Y en caso de que unos hombres se pongan a reñir y uno efectivamente hiera a su prójimo con una piedra o un azadón y este no mue- ra, pero tenga que quedarse en cama; sí se levanta y va andando fuera sobre algún sostén suyo, entonces el que lo haya herido tiene que estar libre de cas- tigo; dará compensación solo por el tiempo que se haya perdido del trabajo de aquel hasta que lo tenga completamente sanado" (21,18-19).”</w:t>
+        <w:t>“La materia y el objeto del seguro social lo constituyen las necesi­ dades contingentes, que son condición para satisfacer de manera normal las permanentes. De lo contingente a lo permanente, en gradación; del seguro social a la seguridad social por coordinación. La seguridad social incluye a todos los seres humanos, en beneficio de la humanidad y las sociedades, cualesquiera que sean el lugar y el tiempo de su existencia.”</w:t>
       </w:r>
     </w:p>
     <w:p>
@@ -2856,7 +3080,7 @@
         <w:pStyle w:val="Heading3"/>
       </w:pPr>
       <w:r>
-        <w:t>Los derechos humanos en Mexico - Emilio Alvarez Icaza Longoria.pdf — p. 8 — similitud 0.0550</w:t>
+        <w:t>La seguridad social y los  desa - Ana Belem Hernandez.pdf — p. 17 — similitud 0.1184</w:t>
       </w:r>
     </w:p>
     <w:p>
@@ -2864,7 +3088,7 @@
         <w:ind w:left="360"/>
       </w:pPr>
       <w:r>
-        <w:t>“La presente obra constituye una guía para entender el concepto, desa- rrollo e importancia de los derechos humanos en el ámbito interna- cional y nacional de manera rápida y sencilla. Para ello, se aborda su historia y el contexto en el que se originaron; se desarrolla breve- mente el concepto, las características y los diferentes derechos huma- nos que existen; se analizan los instrumentos que los resguardan en el ámbito nacional, internacional y regional, así como las características y funcionamiento del sistema Ombudsman, herramienta fundamen- tal para su protección y defensa alrededor del mundo.”</w:t>
+        <w:t>“Esto quiere decir que la oit com- parte una visión integral de la seguridad social, a través de un sistema que sea flexible para adaptarse al grado de desarrollo económico y perseguir los objetivos de la uni- versalidad: reducir la pobreza y refrenar la inseguridad social por medio de los derechos sociales, la promoción del crecimiento a largo plazo, la distribución justa del in- greso, la ausencia de discriminación y la seguridad nacio- nal e internacional.”</w:t>
       </w:r>
     </w:p>
     <w:p>
@@ -2872,7 +3096,7 @@
         <w:pStyle w:val="Heading3"/>
       </w:pPr>
       <w:r>
-        <w:t>Derechos humanos, teorias y doc - Luis Manuel Marcano Salazar.pdf — p. 23 — similitud 0.0517</w:t>
+        <w:t>La seguridad social y los  desa - Ana Belem Hernandez.pdf — p. 36 — similitud 0.1156</w:t>
       </w:r>
     </w:p>
     <w:p>
@@ -2880,7 +3104,7 @@
         <w:ind w:left="360"/>
       </w:pPr>
       <w:r>
-        <w:t>“Luis Manuel Marcano Salazar Por consiguiente, a pesar de las leyes de naturaleza (que cada uno observa cuando tiene la voluntad de observarlas, cuando puede hacerlo de modo seguro) si no se ha instituido o no es suficientemente grande para nuestra seguridad, cada uno se fiará tan sólo, y podrá hacerlo legalmente, sobre su propia fuerza y maña, para protegerse contra los demás hombres.”</w:t>
+        <w:t>“bajadores tienen al seguro social, como uno de los instru- mentos principales de la seguridad social.37 Lo cierto es que en la actualidad se ha replanteado su contenido y alcance, debido a que históricamente se había situado como una es- tructura de los seguros, con miras sólo en algunos países —sobre todo desarrollados— a ampliar la cobertura a toda la población (principio de universalización), pero ahora tal cobertura se ha ampliado poco a poco, también para el caso de países en desarrollo, tal como ocurre con algunos Esta- dos de América del Sur, en donde el derecho a la seguridad social universal ha tenido una cobertura más amplia.”</w:t>
       </w:r>
     </w:p>
     <w:p>
@@ -2888,7 +3112,7 @@
         <w:pStyle w:val="Heading3"/>
       </w:pPr>
       <w:r>
-        <w:t>Como se hicieron los Derechos H - Ricardo Rabinovich Berkman.pdf — p. 91 — similitud 0.0481</w:t>
+        <w:t>Derecho de la seguridad social - Alberto Briceno Ruiz.pdf — p. 25 — similitud 0.1152</w:t>
       </w:r>
     </w:p>
     <w:p>
@@ -2896,7 +3120,7 @@
         <w:ind w:left="360"/>
       </w:pPr>
       <w:r>
-        <w:t>“No la ha iniciado, ni ha sido demandado en ella. Tampoco hay riesgo de que se le extienda la demanda. Sin embargo, posee un marcado interés en la resolución final de ese litigio.”</w:t>
+        <w:t>“3. El valor del bien ha de ser suficiente para justificar la creación y el mantenimiento del contrato del seguro. 4.”</w:t>
       </w:r>
     </w:p>
     <w:p>
@@ -2904,7 +3128,7 @@
         <w:pStyle w:val="Heading3"/>
       </w:pPr>
       <w:r>
-        <w:t>Derechos humanos, teorias y doc - Luis Manuel Marcano Salazar.pdf — p. 16 — similitud 0.0478</w:t>
+        <w:t>Ley del Seguro Social - Camara de Diputados del H. Cong.pdf — p. 26 — similitud 0.1133</w:t>
       </w:r>
     </w:p>
     <w:p>
@@ -2912,7 +3136,7 @@
         <w:ind w:left="360"/>
       </w:pPr>
       <w:r>
-        <w:t>“Esos eventos internacionales generaron cambios constitucionales; así, en Venezuela a partir de la Constitución de 1999 en su Capítulo IX se contemplan los derechos ambientales en los artículos 127 al 129, como un derecho de la persona susceptible de protección y a su vez un deber compartido con el Estado que imperiosamente debe protegerlo e imponer la conservación del equilibrio ecológico para las generaciones futuras, en el artículo 127 se consagra específicamente: “Es un derecho y un deber de cada generación proteger y mantener el ambiente en beneficio de sí misma y del mundo futuro.Toda persona tiene derecho individual y colectivamente a disfrutar de una vida y de un ambiente seguro...”</w:t>
+        <w:t>“LEY DEL SEGURO SOCIAL CÁMARA DE DIPUTADOS DEL H. CONGRESO DE LA UNIÓN Secretaría General Secretaría de Servicios Parlamentarios Última Reforma DOF 15-01-2026 Donde: V = 28 años, que es la duración promedio de vida activa de un individuo que no haya sido víctima de un accidente mortal o de incapacidad permanente total.”</w:t>
       </w:r>
     </w:p>
     <w:p>
@@ -2920,7 +3144,7 @@
         <w:pStyle w:val="Heading3"/>
       </w:pPr>
       <w:r>
-        <w:t>Como se hicieron los Derechos H - Ricardo Rabinovich Berkman.pdf — p. 238 — similitud 0.0452</w:t>
+        <w:t>Derecho de la seguridad social - Alberto Briceno Ruiz.pdf — p. 24 — similitud 0.1074</w:t>
       </w:r>
     </w:p>
     <w:p>
@@ -2928,7 +3152,7 @@
         <w:ind w:left="360"/>
       </w:pPr>
       <w:r>
-        <w:t>“No caben dudas para Aristóteles, en punto a que el "an- thropos" es un "zóon", un animal. Entonces, habrá características que le sean idiosincrásicas (como el ser "poUtico") y otras que comparta con las bestias.”</w:t>
+        <w:t>“8 Principios estructurales se disuelva en una multitud de elementos particulares, sino que esté asegurada de una continuidad. Es la Seguridad la que une nuestra vida presente y nuestra vida futura por un lazo de prudencia y de previsión y perpetúa nuestra existencia en las generaciones que nos siguen.11 Exposición al riesgo Atención a la contingencia o adversidad Riesgo Persona 1 I Contingencia Desequilibrio i 1 Prestación Equilibrio Seguro La connotación de seguro es más limitada y, me atrevo a decir, menos preten­ ciosa; una simple noción de seguro nos brinda la idea de protección. La protección supone un riesgo y éste la necesidad de atender una con­ tingencia.”</w:t>
       </w:r>
     </w:p>
     <w:p>
@@ -2936,7 +3160,7 @@
         <w:pStyle w:val="Heading3"/>
       </w:pPr>
       <w:r>
-        <w:t>Derechos humanos, teorias y doc - Luis Manuel Marcano Salazar.pdf — p. 135 — similitud 0.0450</w:t>
+        <w:t>El derecho a la seguridad socia - Diana Beatriz Gonzalez Carvallo.pdf — p. 293 — similitud 0.1069</w:t>
       </w:r>
     </w:p>
     <w:p>
@@ -2944,7 +3168,7 @@
         <w:ind w:left="360"/>
       </w:pPr>
       <w:r>
-        <w:t>“Una segunda Resolución del Consejo de Europa, la 1/1990, relativa a la protección del Medio Ambiente a través del Derecho penal actualizó las recomendaciones de la anterior, estableciéndose la necesidad de elaborar un listado de tipos penales en los que se asegurase la protección adecuada al medio ambiente y a sus elementos integrantes (agua, aire, suelo, flora y fauna, así como a las personas); la regulación de las infracciones penales a través de tipos de peligro (abstracto, concreto o potencial); la delimitación en materia ambiental entre delitos (Derecho penal) e infracciones administrativas (Derecho administrativo) sobre la base de la gravedad y al riesgo de los comportamientos y, por...”</w:t>
+        <w:t>“Sin embargo, el beneficio proveniente del SSDI de Elma representaba en cierta medida un retorno de sus propias contribuciones al impuesto sobre la nómina, con las cuales se adquirían ahorros para el retiro y un contrato de seguro contra discapacidad. Sin duda, la seguridad social redistribuye el ingreso al dar a los trabajadores con menos ingresos una ventaja relativa comparada con una prima de seguro puramente actuarial.24 Aun así, los beneficios públicos recibidos por Elma tenían un componente sustancial privado, justo como si estuviera retirando sus ahorros o hubiese adquirido un seguro privado por discapacidad.”</w:t>
       </w:r>
     </w:p>
     <w:p>
@@ -2952,7 +3176,7 @@
         <w:pStyle w:val="Heading3"/>
       </w:pPr>
       <w:r>
-        <w:t>Como se hicieron los Derechos H - Ricardo Rabinovich Berkman.pdf — p. 141 — similitud 0.0448</w:t>
+        <w:t>El derecho a la seguridad socia - Diana Beatriz Gonzalez Carvallo.pdf — p. 190 — similitud 0.1064</w:t>
       </w:r>
     </w:p>
     <w:p>
@@ -2960,7 +3184,7 @@
         <w:ind w:left="360"/>
       </w:pPr>
       <w:r>
-        <w:t>“Es la decisi- va lucha ideológica del siglo XXI, y la misión de nuestra generación", agrega- ba Bush a renglón seguido, colocando el ataque estadounidense a Irak en un nivel de necesidad apocalíptica, que hace acordar a los criterios de la "guerra santa", sobre los que volveremos más adelante. "El mundo está más seguro porque Saddam Hussein no está más en el poder. Y ahora el desafío es ayudar al pueblo iraquí a construir una de- mocracia que cumpla los sueños de los casi doce millones de iraquíes que salieron a votar en elecciones libres el último diciembre", concluía optimista el mandatario estadounidense213.”</w:t>
+        <w:t>“166 El derecho a la seguridad social y las responsabilidades de cuidado (CADI) y los Centros de Desarrollo Infantil (CAI), ambos dirigidos a la población abierta, con financiamiento de gobiernos estatales, en el primer caso, y financiamiento mixto, en el segundo.”</w:t>
       </w:r>
     </w:p>
     <w:p>
@@ -2968,7 +3192,7 @@
         <w:pStyle w:val="Heading3"/>
       </w:pPr>
       <w:r>
-        <w:t>Como se hicieron los Derechos H - Ricardo Rabinovich Berkman.pdf — p. 217 — similitud 0.0447</w:t>
+        <w:t>Ley del Seguro Social - Camara de Diputados del H. Cong.pdf — p. 26 — similitud 0.1025</w:t>
       </w:r>
     </w:p>
     <w:p>
@@ -2976,7 +3200,39 @@
         <w:ind w:left="360"/>
       </w:pPr>
       <w:r>
-        <w:t>“Advierte: "Los árboles que se doblan conservan sus ramas, pero los que se resis- ten acaban arrancados de raíz" (que es como Creón terminará: sin des- cendientes). Y emplea una imagen característica de un griego (aunque de un ateniense más que de un beocio): " Aquel piloto que, seguro de lo que hace, ajusta la escota de ía vela y no la suelta, realiza el resto del viaje con el navio tumbado" (713-717). El corifeo trata de ponerlos de acuerdo.”</w:t>
+        <w:t>“D = Número de defunciones. M = 0.005, que es la prima mínima de riesgo. Al inscribirse por primera vez en el Instituto o al cambiar de actividad, las empresas cubrirán, en la clase que les corresponda conforme al reglamento, la prima media.”</w:t>
+      </w:r>
+    </w:p>
+    <w:p>
+      <w:pPr>
+        <w:pStyle w:val="Heading3"/>
+      </w:pPr>
+      <w:r>
+        <w:t>Evolucion de la  Seguridad Soci - Ernesto Cotonieto-Martinez.pdf — p. 17 — similitud 0.1024</w:t>
+      </w:r>
+    </w:p>
+    <w:p>
+      <w:pPr>
+        <w:ind w:left="360"/>
+      </w:pPr>
+      <w:r>
+        <w:t>“regulación del mercado desde un modelo proteccionista durante 30 años que lo llevó a un acelerado crecimiento del PIB y a la tan ansiada estabilidad social y política. Congruentemente, se presentaron dos avances sumamente significativos sobre seguridad social en este periodo histórico fueron: a) después de más de una década fue promulgada la Ley del Seguro Social después y b) se crearon las dos instituciones que hasta el momento son las más importantes en México: IMSS e ISSSTE.”</w:t>
+      </w:r>
+    </w:p>
+    <w:p>
+      <w:pPr>
+        <w:pStyle w:val="Heading3"/>
+      </w:pPr>
+      <w:r>
+        <w:t>Derecho de la seguridad social - Alberto Briceno Ruiz.pdf — p. 382 — similitud 0.0988</w:t>
+      </w:r>
+    </w:p>
+    <w:p>
+      <w:pPr>
+        <w:ind w:left="360"/>
+      </w:pPr>
+      <w:r>
+        <w:t>“Seguro Social. Medios de defensa por los patrones y demás sujetos obligados en los términos de esta Ley, con base en los datos o hechos que conozca -derivados de sus facultades como autoridad fiscal—, o bien apoyándose en expedientes proporcionados por otras autoridades fiscales, pudiendo ratificar o rectificar la clase y la prima de riesgo de las empresas para definir las cuotas correspondientes al seguro de riesgos de trabajo. Uno de los rubros más discutidos en la doctrina y ante el Tribunal Federal de Justicia Fiscal y Administrativa es determinar y hacer efectivo el monto de los capitales constitutivos, que ni son capitales ni tiene justificación que sean constitutivos.”</w:t>
       </w:r>
     </w:p>
     <w:p>
@@ -2987,7 +3243,7 @@
         <w:t xml:space="preserve">Observación automática: </w:t>
       </w:r>
       <w:r>
-        <w:t>La ficha presenta coincidencias débiles; se recomienda validar manualmente las citas. Se agruparon referencias de múltiples fuentes para enriquecer el concepto. Hay 22 referencia(s) de baja similitud que podrían introducir ruido.</w:t>
+        <w:t>La ficha presenta coincidencias útiles, pero conviene revisar la pertinencia de cada cita. Se agruparon referencias de múltiples fuentes para enriquecer el concepto.</w:t>
       </w:r>
     </w:p>
     <w:p>
@@ -2995,7 +3251,7 @@
         <w:pStyle w:val="Heading2"/>
       </w:pPr>
       <w:r>
-        <w:t>Ficha 08. características del seguro social</w:t>
+        <w:t>Ficha 08. naturaleza</w:t>
       </w:r>
     </w:p>
     <w:p>
@@ -3006,7 +3262,7 @@
         <w:t xml:space="preserve">Fuentes: </w:t>
       </w:r>
       <w:r>
-        <w:t>Como se hicieron los Derechos H - Ricardo Rabinovich Berkman.pdf; Derechos humanos, teorias y doc - Luis Manuel Marcano Salazar.pdf; Los derechos humanos en Mexico - Emilio Alvarez Icaza Longoria.pdf</w:t>
+        <w:t>Constitucion Politica de los Es - Camara de Diputados del H. Cong.pdf; Curso de derechos humanos - Ana Maria Ibarra Olguin.pdf; Derecho de la seguridad social - Alberto Briceno Ruiz.pdf; Derecho humano a la seguridad s - Jose Luis Belmont Lugo.pdf; El derecho a la seguridad socia - Diana Beatriz Gonzalez Carvallo.pdf; Ley del Seguro Social - Camara de Diputados del H. Cong.pdf</w:t>
       </w:r>
     </w:p>
     <w:p>
@@ -3017,7 +3273,7 @@
         <w:t xml:space="preserve">Ubicaciones: </w:t>
       </w:r>
       <w:r>
-        <w:t>Como se hicieron los Derechos H - Ricardo Rabinovich Berkman.pdf, p. 125; Como se hicieron los Derechos H - Ricardo Rabinovich Berkman.pdf, p. 168; Como se hicieron los Derechos H - Ricardo Rabinovich Berkman.pdf, p. 25; Como se hicieron los Derechos H - Ricardo Rabinovich Berkman.pdf, p. 280; Como se hicieron los Derechos H - Ricardo Rabinovich Berkman.pdf, p. 285; Como se hicieron los Derechos H - Ricardo Rabinovich Berkman.pdf, p. 33; Derechos humanos, teorias y doc - Luis Manuel Marcano Salazar.pdf, p. 117; Derechos humanos, teorias y doc - Luis Manuel Marcano Salazar.pdf, p. 118; Derechos humanos, teorias y doc - Luis Manuel Marcano Salazar.pdf, p. 23; Derechos humanos, teorias y doc - Luis Manuel Marcano Salazar.pdf, p. 29; Derechos humanos, teorias y doc - Luis Manuel Marcano Salazar.pdf, p. 47; Derechos humanos, teorias y doc - Luis Manuel Marcano Salazar.pdf, p. 58; Derechos humanos, teorias y doc - Luis Manuel Marcano Salazar.pdf, p. 59; Derechos humanos, teorias y doc - Luis Manuel Marcano Salazar.pdf, p. 61; Derechos humanos, teorias y doc - Luis Manuel Marcano Salazar.pdf, p. 82; Derechos humanos, teorias y doc - Luis Manuel Marcano Salazar.pdf, p. 83; Los derechos humanos en Mexico - Emilio Alvarez Icaza Longoria.pdf, p. 20; Los derechos humanos en Mexico - Emilio Alvarez Icaza Longoria.pdf, p. 29; Los derechos humanos en Mexico - Emilio Alvarez Icaza Longoria.pdf, p. 47; Los derechos humanos en Mexico - Emilio Alvarez Icaza Longoria.pdf, p. 50; Los derechos humanos en Mexico - Emilio Alvarez Icaza Longoria.pdf, p. 52; Los derechos humanos en Mexico - Emilio Alvarez Icaza Longoria.pdf, p. 69; Los derechos humanos en Mexico - Emilio Alvarez Icaza Longoria.pdf, p. 8</w:t>
+        <w:t>Constitucion Politica de los Es - Camara de Diputados del H. Cong.pdf, p. 120; Constitucion Politica de los Es - Camara de Diputados del H. Cong.pdf, p. 143; Curso de derechos humanos - Ana Maria Ibarra Olguin.pdf, p. 140; Curso de derechos humanos - Ana Maria Ibarra Olguin.pdf, p. 55; Curso de derechos humanos - Ana Maria Ibarra Olguin.pdf, p. 597; Curso de derechos humanos - Ana Maria Ibarra Olguin.pdf, p. 784; Curso de derechos humanos - Ana Maria Ibarra Olguin.pdf, p. 913; Derecho de la seguridad social - Alberto Briceno Ruiz.pdf, p. 133; Derecho de la seguridad social - Alberto Briceno Ruiz.pdf, p. 23; Derecho de la seguridad social - Alberto Briceno Ruiz.pdf, p. 327; Derecho de la seguridad social - Alberto Briceno Ruiz.pdf, p. 339; Derecho de la seguridad social - Alberto Briceno Ruiz.pdf, p. 34; Derecho de la seguridad social - Alberto Briceno Ruiz.pdf, p. 383; Derecho de la seguridad social - Alberto Briceno Ruiz.pdf, p. 401; Derecho humano a la seguridad s - Jose Luis Belmont Lugo.pdf, p. 3; El derecho a la seguridad socia - Diana Beatriz Gonzalez Carvallo.pdf, p. 336; El derecho a la seguridad socia - Diana Beatriz Gonzalez Carvallo.pdf, p. 398; El derecho a la seguridad socia - Diana Beatriz Gonzalez Carvallo.pdf, p. 412; Ley del Seguro Social - Camara de Diputados del H. Cong.pdf, p. 104; Ley del Seguro Social - Camara de Diputados del H. Cong.pdf, p. 56; Ley del Seguro Social - Camara de Diputados del H. Cong.pdf, p. 79</w:t>
       </w:r>
     </w:p>
     <w:p>
@@ -3025,7 +3281,7 @@
         <w:pStyle w:val="Heading3"/>
       </w:pPr>
       <w:r>
-        <w:t>Derechos humanos, teorias y doc - Luis Manuel Marcano Salazar.pdf — p. 82 — similitud 0.1166</w:t>
+        <w:t>Derecho de la seguridad social - Alberto Briceno Ruiz.pdf — p. 23 — similitud 0.1719</w:t>
       </w:r>
     </w:p>
     <w:p>
@@ -3033,7 +3289,7 @@
         <w:ind w:left="360"/>
       </w:pPr>
       <w:r>
-        <w:t>“forma enmendada por el Protocolo N º 11 • Protocolo N º 5 de la Convención para la Protección de los Derechos Humanos y las Libertades Fundamentales, se modifican los artículos 22 y 40 de la Convención • Convenio Europeo para la adopción de niños • Convenio europeo sobre la repatriación de los menores • Convenio europeo sobre inmunidad de los Estados • Protocolo adicional al Convenio Europeo para la inmunidad de los Estado • Convenio Europeo para la Seguridad Social • Acuerdo Complementario para la Aplicación de la Convención Europea para la Seguridad Social • Convenio Europeo sobre la no Aplicabilidad de las Limitaciones legales a los crímenes de lesa humanidad y crímenes de guerra •...”</w:t>
+        <w:t>“Sierra López, "Inseguridad, seguridad jurídica y seguridad social”, en Boletín de Información Jurídica, IMSS, núm. 15, septiembre-octubre de 1985.”</w:t>
       </w:r>
     </w:p>
     <w:p>
@@ -3041,7 +3297,7 @@
         <w:pStyle w:val="Heading3"/>
       </w:pPr>
       <w:r>
-        <w:t>Derechos humanos, teorias y doc - Luis Manuel Marcano Salazar.pdf — p. 83 — similitud 0.1009</w:t>
+        <w:t>Ley del Seguro Social - Camara de Diputados del H. Cong.pdf — p. 79 — similitud 0.1711</w:t>
       </w:r>
     </w:p>
     <w:p>
@@ -3049,7 +3305,7 @@
         <w:ind w:left="360"/>
       </w:pPr>
       <w:r>
-        <w:t>“a la Prevención de la Tortura y los Tratos Inhumanos o Degradantes • Protocolo del Convenio Europeo de Seguridad Social • Convenio Marco para la Protección de las Minorías Nacionales • Convenio Europeo sobre el Ejercicio de los Derechos del Niño • Sexto Protocolo del Acuerdo General sobre Privilegios e Inmunidades del Consejo de Europa • Carta Social Europea • Convenio Europeo sobre la Nacionalidad • Protocolo adicional al Convenio sobre traslado de personas condenadas • Protocolo Adicional a la Convención para la Protección de los Derechos Humanos y la Dignidad del Ser Humano con respecto a las aplicaciones de la Biología y la Medicina, sobre la prohibición de la clonación de seres humanos...”</w:t>
+        <w:t>“CONGRESO DE LA UNIÓN Secretaría General Secretaría de Servicios Parlamentarios Última Reforma DOF 15-01-2026 I. Los bienes muebles e inmuebles de cualquier naturaleza, con excepción de aquellos provenientes de adjudicación o dación en pago por adeudo de cuotas obrero patronales, capitales constitutivos y accesorios, así como cualquier otro que se afecte expresamente a las reservas que el Instituto deba constituir en términos de esta Ley; II. Los derechos de propiedad y posesión de bienes muebles e inmuebles, cualquiera que sea su naturaleza jurídica, que por justo título obren en poder del Instituto; III.”</w:t>
       </w:r>
     </w:p>
     <w:p>
@@ -3057,7 +3313,7 @@
         <w:pStyle w:val="Heading3"/>
       </w:pPr>
       <w:r>
-        <w:t>Derechos humanos, teorias y doc - Luis Manuel Marcano Salazar.pdf — p. 117 — similitud 0.0898</w:t>
+        <w:t>Curso de derechos humanos - Ana Maria Ibarra Olguin.pdf — p. 784 — similitud 0.1688</w:t>
       </w:r>
     </w:p>
     <w:p>
@@ -3065,7 +3321,7 @@
         <w:ind w:left="360"/>
       </w:pPr>
       <w:r>
-        <w:t>“Coexistimos en el mismo cosmos y en la misma naturaleza con un origen y un destino comunes (…) la ley suprema del universo es la de la solidaridad y la cooperación de todos con todos”. (55) siguiendo a este autor se puede inferir que la solidaridad es un vínculo que ha unido al Hombre en su (…) “salto de la animalidad a la humanidad y a la creación de la socializad que se expresa por el lenguaje” (…); entonces quien pretenda que las catástrofes, tragedias, calamidades, desastres etc. Producto de las acometidas naturales se evitan y solucionan aisladamente está errado.”</w:t>
+        <w:t>“46. 33 Por ejemplo, la Constitución Política de la Ciudad de México establece en su artículo 18, para garantizar el derecho a la preservación y protección de la naturaleza, que se expedirá una ley secundaria en la cual se reconozcan y protejan los derechos de la naturaleza, conformada por todos sus ecosistemas y especies, como un ente colectivo de derechos. En otros casos, como la Constitución de Ecuador, se hace referencia únicamente a la naturaleza.”</w:t>
       </w:r>
     </w:p>
     <w:p>
@@ -3073,7 +3329,7 @@
         <w:pStyle w:val="Heading3"/>
       </w:pPr>
       <w:r>
-        <w:t>Como se hicieron los Derechos H - Ricardo Rabinovich Berkman.pdf — p. 280 — similitud 0.0897</w:t>
+        <w:t>El derecho a la seguridad socia - Diana Beatriz Gonzalez Carvallo.pdf — p. 412 — similitud 0.1654</w:t>
       </w:r>
     </w:p>
     <w:p>
@@ -3081,7 +3337,7 @@
         <w:ind w:left="360"/>
       </w:pPr>
       <w:r>
-        <w:t>“Sin embargo, como también adelantamos, ello no ten- día a formar una clase elitista de hombres de derecho (y, si esa elite surgió, no fue por esto), porque el árabe coránico es, por definición, eí más enseñado. De modo que el efecto, en el caso islámico, puede considerarse de hecho in- verso, realmente paradoja!.”</w:t>
+        <w:t>“Esto se traduce en que en algunos países estos derechos aún están excluidos de una protección constitucional (tutela constitucional) (Courtis, 2010). Efectivamente, tradicionalmente se ha considerado que los DESC son de naturaleza jurídica distinta a los derechos civiles y políticos, considerándose que son vagos, de naturaleza inherentemente positiva y dependientes de recursos disponibles (Sepúlveda, 2005). Esta visión limitada de la naturaleza jurídica de los DESC, ha sido ampliamente debatida en la doctrina, y se pue- de considerar como un debate superado (Sepúlveda, 2001).”</w:t>
       </w:r>
     </w:p>
     <w:p>
@@ -3089,7 +3345,7 @@
         <w:pStyle w:val="Heading3"/>
       </w:pPr>
       <w:r>
-        <w:t>Los derechos humanos en Mexico - Emilio Alvarez Icaza Longoria.pdf — p. 52 — similitud 0.0873</w:t>
+        <w:t>Curso de derechos humanos - Ana Maria Ibarra Olguin.pdf — p. 784 — similitud 0.1646</w:t>
       </w:r>
     </w:p>
     <w:p>
@@ -3097,7 +3353,7 @@
         <w:ind w:left="360"/>
       </w:pPr>
       <w:r>
-        <w:t>“En la cdhdf opera un ser- vicio civil de carrera para la profesionalización de su personal, que busca mayor eficiencia en su mandato con el objetivo de elevar la calidad de los servicios que ofrece a la ciudadanía. Integralidad de los derechos humanos. En el ejercicio de sus actua- ciones se atiende y promueve la vigencia integral de los derechos humanos, con el fin de que las y los ciudadanos ejerzan plenamente todos sus derechos.”</w:t>
+        <w:t>“En España, la municipalidad de Los Alcázares, en Murcia, adoptó la iniciativa legislativa popular para reconocer al Mar Menor y toda su cuenca como sujeto de derechos. 34 En el derecho comparado es emblemático el Capítulo Séptimo de la Constitución de Ecua- dor denominado “Derechos de la naturaleza”, en el cual se enumeran como derechos de la naturaleza el respeto a su existencia, el mantenimiento y la regeneración de sus ciclos vitales, estructura, funciones y procesos evolutivos, y el derecho a la restauración. 35 Véase Stone, Christopher.”</w:t>
       </w:r>
     </w:p>
     <w:p>
@@ -3105,7 +3361,7 @@
         <w:pStyle w:val="Heading3"/>
       </w:pPr>
       <w:r>
-        <w:t>Los derechos humanos en Mexico - Emilio Alvarez Icaza Longoria.pdf — p. 29 — similitud 0.0872</w:t>
+        <w:t>Derecho de la seguridad social - Alberto Briceno Ruiz.pdf — p. 383 — similitud 0.1643</w:t>
       </w:r>
     </w:p>
     <w:p>
@@ -3113,7 +3369,7 @@
         <w:ind w:left="360"/>
       </w:pPr>
       <w:r>
-        <w:t>“28 Los derechos humanos en México 2) El derecho a la seguridad social, a un nivel de vida adecuado y a los niveles más altos posibles de bienestar físico y mental. 3) El derecho a la educación y el disfrute de los beneficios de la libertad cultural y el progreso científico.”</w:t>
+        <w:t>“253) por los bienes muebles e inmuebles de cualquier naturaleza, con excepción de aquellos provenientes de adjudicación o dación en pago por adeudo de cuotas obrero- patronales, capitales constitutivos y accesorios, así como cualquier otro que afecte expresamente a las reservas que el Instituto deba constituir en tér­ minos de esta Ley; los derechos de propiedad y posesión de bienes muebles e inmuebles, cualquiera que sea su naturaleza jurídica, que por justo título obren en su poder; los derechos de cualquier naturaleza que el instituto ob­ tenga o pueda obtener; las donaciones, las herencias, los legados, las adjudi­ caciones, los subsidios y las transferencias que se hagan a su favor en...”</w:t>
       </w:r>
     </w:p>
     <w:p>
@@ -3121,7 +3377,7 @@
         <w:pStyle w:val="Heading3"/>
       </w:pPr>
       <w:r>
-        <w:t>Los derechos humanos en Mexico - Emilio Alvarez Icaza Longoria.pdf — p. 52 — similitud 0.0754</w:t>
+        <w:t>Curso de derechos humanos - Ana Maria Ibarra Olguin.pdf — p. 784 — similitud 0.1569</w:t>
       </w:r>
     </w:p>
     <w:p>
@@ -3129,7 +3385,7 @@
         <w:ind w:left="360"/>
       </w:pPr>
       <w:r>
-        <w:t>“Esto habrá de ser un instrumento valioso que señale a las auto- ridades lo que está detrás de cada uno de los expedientes de queja; es decir: las personas. Cabe señalar que el modelo de queja es enmarcado dentro de un Modelo Institucional, cuyo objetivo es la construcción de una ins- titución que defienda los derechos humanos de las y los ciudadanos (Defensoría del Pueblo). Modelo de la CDHDF De este modo, el Modelo se basa en los siguientes principios: Autonomía.”</w:t>
+        <w:t>“En varios países se ha declarado legislativa o judicialmente que ciertos ecosistemas o especies tienen derechos y pue- den ser representados legalmente. Entre muchos casos, la Corte Constitucional en Colombia reconoció como sujeto de derechos al Río Atrato en Colombia. En Australia, legislativamente se han reconocido derechos como entidades vivientes indivisibles que tienen derechos a ecosis- temas como el Great Ocean Road y el río Yarra, y lo mismo ocurrió en Nueva Zelanda con el río Whanganui.”</w:t>
       </w:r>
     </w:p>
     <w:p>
@@ -3137,7 +3393,7 @@
         <w:pStyle w:val="Heading3"/>
       </w:pPr>
       <w:r>
-        <w:t>Derechos humanos, teorias y doc - Luis Manuel Marcano Salazar.pdf — p. 47 — similitud 0.0701</w:t>
+        <w:t>Derecho de la seguridad social - Alberto Briceno Ruiz.pdf — p. 133 — similitud 0.1544</w:t>
       </w:r>
     </w:p>
     <w:p>
@@ -3145,7 +3401,7 @@
         <w:ind w:left="360"/>
       </w:pPr>
       <w:r>
-        <w:t>“Aún, los visos de protección de los derechos humanos no se vislumbraban. En este contexto las variables que caracterizaron el modelo Iglesia- Institución contribuyeron a esta concepción por lo que al respecto se precisa analizarlas debido a su repercusión en lo social, cultural, político, económico e ideológico. 2.3.2.1- Principales características del modelo Iglesia-Institución 1.- Se resaltaban los aspectos visibles, sociales, institucionales y organi- zativos, existía una autocomprensión en el que predominaba lo jurídico, la dimensión de la Iglesia como misterio se mitiga; no ejerce gran influencia este aspecto.”</w:t>
+        <w:t>“Estas normas ponen en seria duda la participación, en cualquier forma de sociedades anónimas de capital variable, que son personas jurídicas colectivas, de naturaleza particular.”</w:t>
       </w:r>
     </w:p>
     <w:p>
@@ -3153,7 +3409,7 @@
         <w:pStyle w:val="Heading3"/>
       </w:pPr>
       <w:r>
-        <w:t>Derechos humanos, teorias y doc - Luis Manuel Marcano Salazar.pdf — p. 61 — similitud 0.0698</w:t>
+        <w:t>Ley del Seguro Social - Camara de Diputados del H. Cong.pdf — p. 104 — similitud 0.1504</w:t>
       </w:r>
     </w:p>
     <w:p>
@@ -3161,7 +3417,7 @@
         <w:ind w:left="360"/>
       </w:pPr>
       <w:r>
-        <w:t>“7.Irreversibles. 2.3.6.1.- Universalidad Esta característica implica que todas las personas son titulares de los derechos humanos y no pueden invocarse diferencias de regímenes políticos, sociales o culturales como pretexto para ofenderlos o menoscabarlos.La universalidad es inherente a los derechos fundamentales del hombre porque se trata de derechos que son expresión de la dignidad intrínseca de todo individuo, debiendo, en ese sentido, ser aceptados y respetados por todos los Estados, con independencia de su sistema ideológico-político, económico y socio-cultural.”</w:t>
+        <w:t>“Presentar al Instituto los avisos afiliatorios, formularios, comprobantes de afiliación, registros de obras o cédulas de determinación de cuotas obrero patronales con datos falsos, salvo aquéllos que por su naturaleza no sean de su responsabilidad; VII. No llevar los registros de nóminas o listas de raya, en los términos que señala la Ley y el Reglamento para el Pago de Cuotas del Seguro Social; VIII.”</w:t>
       </w:r>
     </w:p>
     <w:p>
@@ -3169,7 +3425,7 @@
         <w:pStyle w:val="Heading3"/>
       </w:pPr>
       <w:r>
-        <w:t>Los derechos humanos en Mexico - Emilio Alvarez Icaza Longoria.pdf — p. 47 — similitud 0.0678</w:t>
+        <w:t>Ley del Seguro Social - Camara de Diputados del H. Cong.pdf — p. 56 — similitud 0.1456</w:t>
       </w:r>
     </w:p>
     <w:p>
@@ -3177,7 +3433,7 @@
         <w:ind w:left="360"/>
       </w:pPr>
       <w:r>
-        <w:t>“En la medida en que el ifai promueva el escrutinio ciudadano a través del acceso a la información pública, y realice una difusión amplia sobre la utilidad social que genera la supervisión continua de la gestión pública, se configurará con más fuerza una figura de Ombudsman “Defensor de la Información”. De esta manera, en México se ha pasado de la protesta de los sesenta y setenta a la propuesta y la construcción de los principios democrá- ticos del siglo xxi.”</w:t>
+        <w:t>“El Instituto suspenderá el pago de la pensión garantizada cuando el pensionado reingrese a un trabajo sujeto al régimen obligatorio. El pensionado por cesantía en edad avanzada o vejez que disfrute de una pensión garantizada no podrá recibir otra de igual naturaleza. La pensión que corresponda a los beneficiarios del pensionado fallecido, se entregará a éstos aun cuando estuvieran gozando de otra pensión de cualquier naturaleza.”</w:t>
       </w:r>
     </w:p>
     <w:p>
@@ -3185,7 +3441,7 @@
         <w:pStyle w:val="Heading3"/>
       </w:pPr>
       <w:r>
-        <w:t>Derechos humanos, teorias y doc - Luis Manuel Marcano Salazar.pdf — p. 29 — similitud 0.0650</w:t>
+        <w:t>El derecho a la seguridad socia - Diana Beatriz Gonzalez Carvallo.pdf — p. 336 — similitud 0.1446</w:t>
       </w:r>
     </w:p>
     <w:p>
@@ -3193,7 +3449,7 @@
         <w:ind w:left="360"/>
       </w:pPr>
       <w:r>
-        <w:t>“Luis Manuel Marcano Salazar K Larenz al diferenciar el sistema de Savigny y Puchta señala: (…) Puchta es el primero en presentar el Derecho como un sistema lógico jerarquizado, que presenta más bien la forma de una pirámide (…) Tal método racional, al que sólo la terminología «organicista» de Puchta nos permite emparentar con el historicismo, se pretende «genealógico» y aspira, en palabras del propio autor, a conocer las proposiciones del Derecho en su conexión sistemática «como recíprocamente condicionadas y derivadas unas de otras» (…) Con ello la Ciencia del Derecho (Jurisprudencia) tomaba carta de naturaleza como autentica fuente del Derecho”.29 Los juristas son los llamados a extraer...”</w:t>
+        <w:t>“Además de los DESC expresamente consagrados en las constituciones na- cionales, se debe de tener en cuenta los tratados internacionales de derechos humanos adoptados tanto a nivel de las Naciones Unidas, como a nivel de la Organización de Estados Americanos (OEA). Estos tratados internacionales, que consagran una amplitud de derechos,3 han sido incorporados en las 1  Véase, por ejemplo, Constitución del Estado Plurinacional de Bolivia, Constitución de Colombia, Constitución de la República Bolivariana de Venezuela, Constitución de Brasil, Constitución del Ecuador, Constitución de la República de Paraguay.”</w:t>
       </w:r>
     </w:p>
     <w:p>
@@ -3201,7 +3457,7 @@
         <w:pStyle w:val="Heading3"/>
       </w:pPr>
       <w:r>
-        <w:t>Los derechos humanos en Mexico - Emilio Alvarez Icaza Longoria.pdf — p. 20 — similitud 0.0640</w:t>
+        <w:t>Curso de derechos humanos - Ana Maria Ibarra Olguin.pdf — p. 784 — similitud 0.1435</w:t>
       </w:r>
     </w:p>
     <w:p>
@@ -3209,7 +3465,7 @@
         <w:ind w:left="360"/>
       </w:pPr>
       <w:r>
-        <w:t>“Por ello, es fundamental tener presente que el único límite a todos los derechos humanos de una persona son los derechos de los demás. Responsabilidad social 3.2 Características Las principales características de los derechos humanos son: Requisitos mínimos Son universales. Se aplican a todas las personas por igual, pues todos tenemos la misma dignidad.”</w:t>
+        <w:t>“Alejandra Rabasa Salinas 784 Los elementos sustantivos principales alrededor de los cuales se ha ido cons- truyendo la doctrina de los derechos de la naturaleza se refieren sobre todo a la identificación de los entes de derechos que deben ser protegidos33 y la definición de sus derechos34.”</w:t>
       </w:r>
     </w:p>
     <w:p>
@@ -3217,7 +3473,7 @@
         <w:pStyle w:val="Heading3"/>
       </w:pPr>
       <w:r>
-        <w:t>Derechos humanos, teorias y doc - Luis Manuel Marcano Salazar.pdf — p. 47 — similitud 0.0632</w:t>
+        <w:t>Derecho de la seguridad social - Alberto Briceno Ruiz.pdf — p. 34 — similitud 0.1359</w:t>
       </w:r>
     </w:p>
     <w:p>
@@ -3225,7 +3481,7 @@
         <w:ind w:left="360"/>
       </w:pPr>
       <w:r>
-        <w:t>“En este contexto las variables que caracterizaron el modelo Iglesia- Institución contribuyeron a esta concepción por lo que al respecto se precisa analizarlas debido a su repercusión en lo social, cultural, político, económico e ideológico. 2.3.2.1- Principales características del modelo Iglesia-Institución 1.- Se resaltaban los aspectos visibles, sociales, institucionales y organi- zativos, existía una autocomprensión en el que predominaba lo jurídico, la dimensión de la Iglesia como misterio se mitiga; no ejerce gran influencia este aspecto.”</w:t>
+        <w:t>“No es válido estimar que en razón a los grupos que se tutelan, por la naturaleza jurídica de la institución o por cualquier otra razón, los principios reguladores y los conceptos sean diversos. La naturale­ za jurídica del seguro social debía ser la misma, tratándose del Apartado A, del Apartado B del art.”</w:t>
       </w:r>
     </w:p>
     <w:p>
@@ -3233,7 +3489,7 @@
         <w:pStyle w:val="Heading3"/>
       </w:pPr>
       <w:r>
-        <w:t>Derechos humanos, teorias y doc - Luis Manuel Marcano Salazar.pdf — p. 58 — similitud 0.0628</w:t>
+        <w:t>Derecho de la seguridad social - Alberto Briceno Ruiz.pdf — p. 327 — similitud 0.1301</w:t>
       </w:r>
     </w:p>
     <w:p>
@@ -3241,7 +3497,7 @@
         <w:ind w:left="360"/>
       </w:pPr>
       <w:r>
-        <w:t>“Es el proceso de positivización de las garantías; d) Los derechos reconocidos comienzan a ampliarse, en procura de otros derechos y hacia un estado de bienestar. • En este proceso de expansión a partir de la mitad del siglo XIX, emergen los derechos económicos, sociales y culturales; en este interregnum se hace necesario destacar el valor de las luchas por las reivindicaciones obreras y otras pretensiones de carácter social. León XIII en el año 1891 promulga la primera encíclica social de la Iglesia denominada “Rerum novarum”, como un grito convincente por las precarias condiciones indignas en que se encontraban los obreros; siendo execrables la situación de miseria que debían soportar.”</w:t>
+        <w:t>“Consar, Afore y Siefore 311 derechos civiles y políticos; contar con reconocida experiencia en materia económica, financiera, jurídica o de seguridad social; no tener nexos patrimo­ niales con los accionistas que formen el grupo de control de los participantes en los SAR sujetos a la supervisión de la Comisión, ni con los funcionarios de primer y segundo nivel de los mismos, así como no ser cónyuge ni tener re­ lación de parentesco consanguíneo dentro del segundo grado con dichas per­ sonas; no haber sido inhabilitado para ejercer el comercio o para desempeñar un empleo, cargo o comisión en el servicio público o en el sistema financiero mexicano y gozar de reconocida solvencia moral, y no...”</w:t>
       </w:r>
     </w:p>
     <w:p>
@@ -3249,7 +3505,7 @@
         <w:pStyle w:val="Heading3"/>
       </w:pPr>
       <w:r>
-        <w:t>Los derechos humanos en Mexico - Emilio Alvarez Icaza Longoria.pdf — p. 50 — similitud 0.0618</w:t>
+        <w:t>El derecho a la seguridad socia - Diana Beatriz Gonzalez Carvallo.pdf — p. 412 — similitud 0.1296</w:t>
       </w:r>
     </w:p>
     <w:p>
@@ -3257,7 +3513,7 @@
         <w:ind w:left="360"/>
       </w:pPr>
       <w:r>
-        <w:t>“En la medida en que las acciones de las autoridades públicas incorporen el factor humano dentro de los mecanismos de gestión gubernamental, y que ese mismo sea reconocido como una con- dición básica de gobernabilidad democrática, entonces la efectiva”</w:t>
+        <w:t>“Efectivamente, tradicionalmente se ha considerado que los DESC son de naturaleza jurídica distinta a los derechos civiles y políticos, considerándose que son vagos, de naturaleza inherentemente positiva y dependientes de recursos disponibles (Sepúlveda, 2005). Esta visión limitada de la naturaleza jurídica de los DESC, ha sido ampliamente debatida en la doctrina, y se pue- de considerar como un debate superado (Sepúlveda, 2001). Naturalmente, es posible argumentar que algunas obligaciones impuestas por los DESC requieren una mayor inversión pública que los derechos civiles y políticos, pero eso sería más un problema de grado que de fondo.”</w:t>
       </w:r>
     </w:p>
     <w:p>
@@ -3265,7 +3521,7 @@
         <w:pStyle w:val="Heading3"/>
       </w:pPr>
       <w:r>
-        <w:t>Los derechos humanos en Mexico - Emilio Alvarez Icaza Longoria.pdf — p. 8 — similitud 0.0616</w:t>
+        <w:t>Derecho de la seguridad social - Alberto Briceno Ruiz.pdf — p. 339 — similitud 0.1278</w:t>
       </w:r>
     </w:p>
     <w:p>
@@ -3273,7 +3529,7 @@
         <w:ind w:left="360"/>
       </w:pPr>
       <w:r>
-        <w:t>“La presente obra constituye una guía para entender el concepto, desa- rrollo e importancia de los derechos humanos en el ámbito interna- cional y nacional de manera rápida y sencilla. Para ello, se aborda su historia y el contexto en el que se originaron; se desarrolla breve- mente el concepto, las características y los diferentes derechos huma- nos que existen; se analizan los instrumentos que los resguardan en el ámbito nacional, internacional y regional, así como las características y funcionamiento del sistema Ombudsman, herramienta fundamen- tal para su protección y defensa alrededor del mundo.”</w:t>
+        <w:t>“Entre sus conseje­ ros, tendrán consejeros independientes, quienes serán expertos en materia financiera, económica, jurídica o de seguridad social; tendrán limitación en su actuación, de tal forma que se les impide tener algún nexo patrimonial con las administradoras; tampoco serán trabajadores de los accionistas que detenten el control o con los funcionarios de dichas administradoras. Los asuntos que se programen en el orden del día deberán ser aprobados por la mayoría de los accionistas y de los miembros del consejo de administración.”</w:t>
       </w:r>
     </w:p>
     <w:p>
@@ -3281,7 +3537,7 @@
         <w:pStyle w:val="Heading3"/>
       </w:pPr>
       <w:r>
-        <w:t>Derechos humanos, teorias y doc - Luis Manuel Marcano Salazar.pdf — p. 117 — similitud 0.0603</w:t>
+        <w:t>Constitucion Politica de los Es - Camara de Diputados del H. Cong.pdf — p. 120 — similitud 0.1234</w:t>
       </w:r>
     </w:p>
     <w:p>
@@ -3289,7 +3545,7 @@
         <w:ind w:left="360"/>
       </w:pPr>
       <w:r>
-        <w:t>“Sólo el que ha sufrido una guerra sabe lo que es la guerra. (…) Sólo el que sufrió la terrible y horrorosa (no encuentro palabras más intensas) tragedia de Vargas, puede saber realmente lo que fue.15 Al reconocer la tuición a la vida, al ambiente y más aún a las generaciones que aún son una expectativa es porque existen razones para ello. La interdependencia, indivisibilidad y universalidad de los derechos humanos, no permite su encasillamiento, de allí, que la progresividad como principio inmanente en su estudio no admite que el Hombre se detenga en beneficio propio.”</w:t>
+        <w:t>“Párrafo reformado DOF 31-12-1994, 07-02-2014, 29-01-2016, 15-09-2024 Las sanciones consistirán en la destitución del servidor público y en su inhabilitación para desempeñar funciones, empleos, cargos o comisiones de cualquier naturaleza en el servicio público. 120 de 414”</w:t>
       </w:r>
     </w:p>
     <w:p>
@@ -3297,7 +3553,7 @@
         <w:pStyle w:val="Heading3"/>
       </w:pPr>
       <w:r>
-        <w:t>Como se hicieron los Derechos H - Ricardo Rabinovich Berkman.pdf — p. 285 — similitud 0.0597</w:t>
+        <w:t>Curso de derechos humanos - Ana Maria Ibarra Olguin.pdf — p. 913 — similitud 0.1182</w:t>
       </w:r>
     </w:p>
     <w:p>
@@ -3305,7 +3561,7 @@
         <w:ind w:left="360"/>
       </w:pPr>
       <w:r>
-        <w:t>“Esta visión seria coherente con la de Marcel Simón, uno de los máximos especialistas en este período. Él entiende que los primeros conflictos de as- pecto intercultural no se habrían dado entre cristianos de origen israelita y cristianos de origen pagano, sino entre cristianos de origen israelita palestino, con lengua materna hebrea o aramea, y cristianos de origen israelita pero he- lenístico, llegados de las comunidades de la diáspora y greco-parlantes358. Para los tiempos de Pablo de Tarse, empero, la presencia de conversos de origen gentil parece haber sido lo suficientemente importante como para qué se generasen las controversias acerca de la obligatoriedad de la circuncisión.”</w:t>
+        <w:t>“El derecho a la seguridad social 913 causa de muerte —de viudez en el matrimonio y en el concubinato, de orfandad y ascendencia— y servicios de guarderías. La inmensa mayoría de sentencias de la SCJN sobre seguridad social se origina en litigios dentro del modelo contributivo de aseguramiento social. Las pocas que hay sobre “programas sociales”, o modelo de seguridad social no contributivo, no le dicen, por razones que habrá que explorar con más detenimiento, “derecho a la seguridad social” al derecho a la seguridad social.”</w:t>
       </w:r>
     </w:p>
     <w:p>
@@ -3313,7 +3569,7 @@
         <w:pStyle w:val="Heading3"/>
       </w:pPr>
       <w:r>
-        <w:t>Derechos humanos, teorias y doc - Luis Manuel Marcano Salazar.pdf — p. 118 — similitud 0.0594</w:t>
+        <w:t>Derecho humano a la seguridad s - Jose Luis Belmont Lugo.pdf — p. 3 — similitud 0.1126</w:t>
       </w:r>
     </w:p>
     <w:p>
@@ -3321,7 +3577,7 @@
         <w:ind w:left="360"/>
       </w:pPr>
       <w:r>
-        <w:t>“Todos los derechos tienen una dimensión social, en la medida en que son ejercidos por individuos o grupos en un contexto social; pero, ciertos derechos como los de solidaridad, se relacionan en mayor grado con la propia comunidad. Así ha quedado establecido en sentencia de fecha 30/06/2000 emanada del Tribunal Supremo de Justicia en Sala Constitucional de Venezuela: La Sala Constitucional en este sentido va a delinear notas características congruentes con los derechos de solidaridad en los cuales se enmarcan una serie de valores y principios que se implican en la calidad de vida y el bien común.”</w:t>
+        <w:t>“5 1. Los derechos humanos y el derecho humano a la seguridad social . . . . . . . . . . . . . . . . . . . 5 2.”</w:t>
       </w:r>
     </w:p>
     <w:p>
@@ -3329,7 +3585,7 @@
         <w:pStyle w:val="Heading3"/>
       </w:pPr>
       <w:r>
-        <w:t>Los derechos humanos en Mexico - Emilio Alvarez Icaza Longoria.pdf — p. 69 — similitud 0.0593</w:t>
+        <w:t>El derecho a la seguridad socia - Diana Beatriz Gonzalez Carvallo.pdf — p. 398 — similitud 0.1071</w:t>
       </w:r>
     </w:p>
     <w:p>
@@ -3337,7 +3593,7 @@
         <w:ind w:left="360"/>
       </w:pPr>
       <w:r>
-        <w:t>“Modelo de defensa que coloca en el cen- tro a las personas al asumirlas como ciudadanas y ciudadanos que ejercen sus derechos. Asimismo, la calificación y los proce- dimientos de investigación de quejas se llevan a cabo, en este modelo, a partir de las disposiciones del derecho internacional de los derechos humanos y bajo un enfoque de integralidad de los mismos. Progresividad.”</w:t>
+        <w:t>“Las estrategias para la infancia implementadas en la región a menudo tienen un enfoque explícito de derechos, enfatizando como objetivos primordiales la igualdad de todos los niños y niñas en el desarrollo de capacidades, la priorización de la niñez como sujeto de derechos y el interés superior del niño, entre otros.”</w:t>
       </w:r>
     </w:p>
     <w:p>
@@ -3345,7 +3601,7 @@
         <w:pStyle w:val="Heading3"/>
       </w:pPr>
       <w:r>
-        <w:t>Como se hicieron los Derechos H - Ricardo Rabinovich Berkman.pdf — p. 33 — similitud 0.0587</w:t>
+        <w:t>Constitucion Politica de los Es - Camara de Diputados del H. Cong.pdf — p. 143 — similitud 0.1035</w:t>
       </w:r>
     </w:p>
     <w:p>
@@ -3353,7 +3609,7 @@
         <w:ind w:left="360"/>
       </w:pPr>
       <w:r>
-        <w:t>“Porque lo que hace a una paella ser tal, su esencia, son el arroz y los mariscos (característicos ambos de la región de Valencia). La idea de que determinados derechos fueran esenciales implicaría pensar que éstos hacen al ser humano, que integran la sustancia de éste. Es decir, que sin esas prerrogativas no tengo un ser humano.”</w:t>
+        <w:t>“CONGRESO DE LA UNIÓN Secretaría General Secretaría de Servicios Parlamentarios Últimas Reformas DOF 02-06-2026 X. La Constitución Política local garantizará que las funciones de procuración de justicia en la Ciudad de México se realicen con base en los principios de autonomía, eficiencia, imparcialidad, legalidad, objetividad, profesionalismo, responsabilidad, perspectiva de género y respeto a los derechos humanos. Fracción reformada DOF 15-11-2024 XI.”</w:t>
       </w:r>
     </w:p>
     <w:p>
@@ -3361,7 +3617,7 @@
         <w:pStyle w:val="Heading3"/>
       </w:pPr>
       <w:r>
-        <w:t>Derechos humanos, teorias y doc - Luis Manuel Marcano Salazar.pdf — p. 23 — similitud 0.0579</w:t>
+        <w:t>Curso de derechos humanos - Ana Maria Ibarra Olguin.pdf — p. 597 — similitud 0.1021</w:t>
       </w:r>
     </w:p>
     <w:p>
@@ -3369,7 +3625,7 @@
         <w:ind w:left="360"/>
       </w:pPr>
       <w:r>
-        <w:t>“Luis Manuel Marcano Salazar Por consiguiente, a pesar de las leyes de naturaleza (que cada uno observa cuando tiene la voluntad de observarlas, cuando puede hacerlo de modo seguro) si no se ha instituido o no es suficientemente grande para nuestra seguridad, cada uno se fiará tan sólo, y podrá hacerlo legalmente, sobre su propia fuerza y maña, para protegerse contra los demás hombres.”</w:t>
+        <w:t>“Los derechos de las personas con discapacidad 597 El artículo 12 de la CDPD,63 en términos de la doctrina mexicana, abarca tanto la capacidad de goce como la de ejercicio, pues prevé el concepto de igual reconocimiento ante la ley, en relación con el concepto de personalidad jurídica como con el de capacidad jurídica. Es decir, se refiere tanto a la capacidad de la persona para ser sujeto de derechos y obligaciones como a la capacidad de actuar bajo la ley.”</w:t>
       </w:r>
     </w:p>
     <w:p>
@@ -3377,7 +3633,7 @@
         <w:pStyle w:val="Heading3"/>
       </w:pPr>
       <w:r>
-        <w:t>Derechos humanos, teorias y doc - Luis Manuel Marcano Salazar.pdf — p. 59 — similitud 0.0576</w:t>
+        <w:t>Derecho de la seguridad social - Alberto Briceno Ruiz.pdf — p. 401 — similitud 0.0978</w:t>
       </w:r>
     </w:p>
     <w:p>
@@ -3385,7 +3641,7 @@
         <w:ind w:left="360"/>
       </w:pPr>
       <w:r>
-        <w:t>“2.3.5.5. 1- Características de las declaraciones del siglo XX • La Declaración francesa de los Derechos del Hombre y del Ciudadano, prosigue como el gran hito inspirador tanto en el orden constitucional interno (Preámbulo de las constituciones francesas de 1946 y 1958)48, como de las declaraciones estricto sensu, por ejemplo la Declaración Universal de los Derechos Humanos; contribuyendo a la consagración constitucional e internacional definitiva de los derechos económicos, sociales y culturales; se entreve la vigencia y reconocimiento de los llamados derechos de «tercera generación ».”</w:t>
+        <w:t>“16 Medios de defensa contra el IMSS Naturaleza jurídica de la cuota os diferentes medios de defensa por parte del patrón conducen a los recur­ sos administrativos, y por parte del trabajador se inician con la queja. Para analizarlos, debemos partir de la naturaleza jurídica de la cuota; es decir, se hace indispensable retomar lo que en el capítulo respectivo dije sobre la natu­ raleza jurídica de la aportación.”</w:t>
       </w:r>
     </w:p>
     <w:p>
@@ -3393,7 +3649,7 @@
         <w:pStyle w:val="Heading3"/>
       </w:pPr>
       <w:r>
-        <w:t>Como se hicieron los Derechos H - Ricardo Rabinovich Berkman.pdf — p. 125 — similitud 0.0557</w:t>
+        <w:t>Curso de derechos humanos - Ana Maria Ibarra Olguin.pdf — p. 55 — similitud 0.0931</w:t>
       </w:r>
     </w:p>
     <w:p>
@@ -3401,7 +3657,7 @@
         <w:ind w:left="360"/>
       </w:pPr>
       <w:r>
-        <w:t>“Esta posición generó ácidas críticas, y hasta asombro por parte de pensa- : dores que se manifestaban en general coincidentes con las ideas de Rawls. Sin :.;í embargo, y con todo lo problemático que el tema es, no deja de tratarse de una alternativa coherente con la creencia en la posibilidad de una base objetiva de la que se puedan desprender los derechos (o libertades) fundamentales.”</w:t>
+        <w:t>“Proporcionalidad y restricción de derechos fundamentales 55 En las ciencias sociales —incluyendo la “teoría de las decisiones”—, la “racionali- dad” se ha buscado a través de “criterios metodológicos apropiados”, “con el auxilio de técnicas muy formalizadas, en relación con el comportamiento individual y colectivo[,] y con la elección racional de los medios con vistas a determinados fines”.68 En estos procedimientos puede realizarse una “estima[ción] [de] los objetivos, intereses y valores con base en su utilidad”, “para comparar entre sus diversas utilidades y llevar a cabo elecciones con el más alto grado de probabilidad de mejorar la utilidad esperada”, lo que “constituye, pues, un...”</w:t>
       </w:r>
     </w:p>
     <w:p>
@@ -3409,7 +3665,7 @@
         <w:pStyle w:val="Heading3"/>
       </w:pPr>
       <w:r>
-        <w:t>Como se hicieron los Derechos H - Ricardo Rabinovich Berkman.pdf — p. 25 — similitud 0.0557</w:t>
+        <w:t>Curso de derechos humanos - Ana Maria Ibarra Olguin.pdf — p. 140 — similitud 0.0919</w:t>
       </w:r>
     </w:p>
     <w:p>
@@ -3417,23 +3673,7 @@
         <w:ind w:left="360"/>
       </w:pPr>
       <w:r>
-        <w:t>“La siguiente: "Conjunto de características o cualidades originales que destacan en algunas personas-. Son ideas muy cercanas y se confunden.”</w:t>
-      </w:r>
-    </w:p>
-    <w:p>
-      <w:pPr>
-        <w:pStyle w:val="Heading3"/>
-      </w:pPr>
-      <w:r>
-        <w:t>Como se hicieron los Derechos H - Ricardo Rabinovich Berkman.pdf — p. 168 — similitud 0.0537</w:t>
-      </w:r>
-    </w:p>
-    <w:p>
-      <w:pPr>
-        <w:ind w:left="360"/>
-      </w:pPr>
-      <w:r>
-        <w:t>“VI. LAS PRIMERAS IDEAS SOBRE LOS LÍMITES AL PODER LEGÍTIMO "Alik mahrí tappaa ushezeb shá tuúdu iduú ibirshú liissur" ("Quien va primero, salva a su camarada, quien conoce el camino cuida a su amigo'"). Epopeya de GuiJgamesh, Tablilla IH §1.”</w:t>
+        <w:t>“Para algunos autores, por ejemplo, mientras que la teoría interna privilegia a la co- munidad y el concepto de libertad positiva, la teoría externa refleja una postura más liberal, pues reconoce la libertad negativa del individuo como base filosófica del Estado. Cfr.”</w:t>
       </w:r>
     </w:p>
     <w:p>
@@ -3444,448 +3684,7 @@
         <w:t xml:space="preserve">Observación automática: </w:t>
       </w:r>
       <w:r>
-        <w:t>La ficha presenta coincidencias débiles; se recomienda validar manualmente las citas. Se agruparon referencias de múltiples fuentes para enriquecer el concepto. Hay 20 referencia(s) de baja similitud que podrían introducir ruido.</w:t>
-      </w:r>
-    </w:p>
-    <w:p>
-      <w:pPr>
-        <w:pStyle w:val="Heading2"/>
-      </w:pPr>
-      <w:r>
-        <w:t>Ficha 09. Contingencia</w:t>
-      </w:r>
-    </w:p>
-    <w:p>
-      <w:r>
-        <w:rPr>
-          <w:b/>
-        </w:rPr>
-        <w:t xml:space="preserve">Fuentes: </w:t>
-      </w:r>
-      <w:r>
-        <w:t>Como se hicieron los Derechos H - Ricardo Rabinovich Berkman.pdf; Derechos humanos, teorias y doc - Luis Manuel Marcano Salazar.pdf; Los derechos humanos en Mexico - Emilio Alvarez Icaza Longoria.pdf</w:t>
-      </w:r>
-    </w:p>
-    <w:p>
-      <w:r>
-        <w:rPr>
-          <w:b/>
-        </w:rPr>
-        <w:t xml:space="preserve">Ubicaciones: </w:t>
-      </w:r>
-      <w:r>
-        <w:t>Como se hicieron los Derechos H - Ricardo Rabinovich Berkman.pdf, p. 123; Como se hicieron los Derechos H - Ricardo Rabinovich Berkman.pdf, p. 130; Como se hicieron los Derechos H - Ricardo Rabinovich Berkman.pdf, p. 145; Como se hicieron los Derechos H - Ricardo Rabinovich Berkman.pdf, p. 166; Como se hicieron los Derechos H - Ricardo Rabinovich Berkman.pdf, p. 237; Como se hicieron los Derechos H - Ricardo Rabinovich Berkman.pdf, p. 238; Como se hicieron los Derechos H - Ricardo Rabinovich Berkman.pdf, p. 242; Como se hicieron los Derechos H - Ricardo Rabinovich Berkman.pdf, p. 245; Como se hicieron los Derechos H - Ricardo Rabinovich Berkman.pdf, p. 279; Como se hicieron los Derechos H - Ricardo Rabinovich Berkman.pdf, p. 67; Como se hicieron los Derechos H - Ricardo Rabinovich Berkman.pdf, p. 93; Derechos humanos, teorias y doc - Luis Manuel Marcano Salazar.pdf, p. 111; Derechos humanos, teorias y doc - Luis Manuel Marcano Salazar.pdf, p. 114; Derechos humanos, teorias y doc - Luis Manuel Marcano Salazar.pdf, p. 116; Derechos humanos, teorias y doc - Luis Manuel Marcano Salazar.pdf, p. 117; Derechos humanos, teorias y doc - Luis Manuel Marcano Salazar.pdf, p. 21; Derechos humanos, teorias y doc - Luis Manuel Marcano Salazar.pdf, p. 29; Derechos humanos, teorias y doc - Luis Manuel Marcano Salazar.pdf, p. 35; Derechos humanos, teorias y doc - Luis Manuel Marcano Salazar.pdf, p. 64; Derechos humanos, teorias y doc - Luis Manuel Marcano Salazar.pdf, p. 78; Derechos humanos, teorias y doc - Luis Manuel Marcano Salazar.pdf, p. 82; Los derechos humanos en Mexico - Emilio Alvarez Icaza Longoria.pdf, p. 12</w:t>
-      </w:r>
-    </w:p>
-    <w:p>
-      <w:pPr>
-        <w:pStyle w:val="Heading3"/>
-      </w:pPr>
-      <w:r>
-        <w:t>Derechos humanos, teorias y doc - Luis Manuel Marcano Salazar.pdf — p. 29 — similitud 0.2400</w:t>
-      </w:r>
-    </w:p>
-    <w:p>
-      <w:pPr>
-        <w:ind w:left="360"/>
-      </w:pPr>
-      <w:r>
-        <w:t>“Otro insigne representante del ius positivismo es Hans Kelsen, fundador del Círculo de Viena, quien en su obra La teoría del Derecho de entrada plantea que: “La teoría pura del Derecho es una teoría del derecho positivo; es teoría general del derecho, no una exposición o interpretación de un orden jurídico particular” (p. 15).”</w:t>
-      </w:r>
-    </w:p>
-    <w:p>
-      <w:pPr>
-        <w:pStyle w:val="Heading3"/>
-      </w:pPr>
-      <w:r>
-        <w:t>Derechos humanos, teorias y doc - Luis Manuel Marcano Salazar.pdf — p. 21 — similitud 0.1295</w:t>
-      </w:r>
-    </w:p>
-    <w:p>
-      <w:pPr>
-        <w:ind w:left="360"/>
-      </w:pPr>
-      <w:r>
-        <w:t>“Partiendo del humanismo las corrientes paradigmáticas en las cuales se bifurcó el derecho son el ius naturalismo y el ius positivismo, el pensamiento jurídico posterior se enmarcará en una u otra rama teniendo sus matices distintivos cada una, sin embargo ambas fuentes se apalancarán para así lograr el auge que ha tenido el reconocimiento y protección de los derechos humanos. 1.2.”</w:t>
-      </w:r>
-    </w:p>
-    <w:p>
-      <w:pPr>
-        <w:pStyle w:val="Heading3"/>
-      </w:pPr>
-      <w:r>
-        <w:t>Derechos humanos, teorias y doc - Luis Manuel Marcano Salazar.pdf — p. 78 — similitud 0.1082</w:t>
-      </w:r>
-    </w:p>
-    <w:p>
-      <w:pPr>
-        <w:ind w:left="360"/>
-      </w:pPr>
-      <w:r>
-        <w:t>“Derechos humanos. Teorías y doctrinas”</w:t>
-      </w:r>
-    </w:p>
-    <w:p>
-      <w:pPr>
-        <w:pStyle w:val="Heading3"/>
-      </w:pPr>
-      <w:r>
-        <w:t>Derechos humanos, teorias y doc - Luis Manuel Marcano Salazar.pdf — p. 82 — similitud 0.1082</w:t>
-      </w:r>
-    </w:p>
-    <w:p>
-      <w:pPr>
-        <w:ind w:left="360"/>
-      </w:pPr>
-      <w:r>
-        <w:t>“Derechos humanos. Teorías y doctrinas”</w:t>
-      </w:r>
-    </w:p>
-    <w:p>
-      <w:pPr>
-        <w:pStyle w:val="Heading3"/>
-      </w:pPr>
-      <w:r>
-        <w:t>Derechos humanos, teorias y doc - Luis Manuel Marcano Salazar.pdf — p. 114 — similitud 0.1082</w:t>
-      </w:r>
-    </w:p>
-    <w:p>
-      <w:pPr>
-        <w:ind w:left="360"/>
-      </w:pPr>
-      <w:r>
-        <w:t>“Derechos humanos. Teorías y doctrinas”</w:t>
-      </w:r>
-    </w:p>
-    <w:p>
-      <w:pPr>
-        <w:pStyle w:val="Heading3"/>
-      </w:pPr>
-      <w:r>
-        <w:t>Como se hicieron los Derechos H - Ricardo Rabinovich Berkman.pdf — p. 238 — similitud 0.0928</w:t>
-      </w:r>
-    </w:p>
-    <w:p>
-      <w:pPr>
-        <w:ind w:left="360"/>
-      </w:pPr>
-      <w:r>
-        <w:t>“Fundamentalmente, habrían de abordarse las diversas poleis griegas, que para entonces constituían un número altísimo, en una extensión enorme. De modo que Aristóteles, según parece, puso a sus discípulos a trabajar en la colosal tarea de recopilar todas las formas de gobierno de las ciudades griegas, y sus antecedentes. Habrían reunido 158 pero, si así fue, casi todas se habrían perdido para nosotros.”</w:t>
-      </w:r>
-    </w:p>
-    <w:p>
-      <w:pPr>
-        <w:pStyle w:val="Heading3"/>
-      </w:pPr>
-      <w:r>
-        <w:t>Como se hicieron los Derechos H - Ricardo Rabinovich Berkman.pdf — p. 279 — similitud 0.0901</w:t>
-      </w:r>
-    </w:p>
-    <w:p>
-      <w:pPr>
-        <w:ind w:left="360"/>
-      </w:pPr>
-      <w:r>
-        <w:t>“Al mismo tiempo, la lengua coránica, enseñada en el "kuttáb", y compartida por grupos humanos muy diversos, incluso geográficamente alejados, mantuvo sus connotaciones originales a lo largo de los siglos. Lo más notable de este cuadro es que no se trata de una forma idiomática de elite, reservada a un grupo cerrado, dominante, sino que, por el contrario, es la modalidad de enseñanza más popular. De hecho, para la mayoría de los hombres de las comunidades en cuestión, la única modalidad escolarizada..”</w:t>
-      </w:r>
-    </w:p>
-    <w:p>
-      <w:pPr>
-        <w:pStyle w:val="Heading3"/>
-      </w:pPr>
-      <w:r>
-        <w:t>Derechos humanos, teorias y doc - Luis Manuel Marcano Salazar.pdf — p. 116 — similitud 0.0796</w:t>
-      </w:r>
-    </w:p>
-    <w:p>
-      <w:pPr>
-        <w:ind w:left="360"/>
-      </w:pPr>
-      <w:r>
-        <w:t>“Derechos humanos. Teorías y doctrinas la argumentación propuesta por De George, diciendo (…) exigencias de individuos pertenecientes a generaciones futuras pueden hacerse valer ahora a través de personas o instituciones que les representen.13 El autor supra citado, también menciona como participe de la anterior tesis a D. Callahan, según este no “logra entender como se puede negar la exigencia de un derecho humano fundamental que hace valer una persona que vive en la actualidad dando preferencia a la exigencia condicional que puede hacer valer alguien que existirá en un futuro”; no compartiendo tal tesis, inscribiéndose en el utilitarismo.”</w:t>
-      </w:r>
-    </w:p>
-    <w:p>
-      <w:pPr>
-        <w:pStyle w:val="Heading3"/>
-      </w:pPr>
-      <w:r>
-        <w:t>Como se hicieron los Derechos H - Ricardo Rabinovich Berkman.pdf — p. 245 — similitud 0.0781</w:t>
-      </w:r>
-    </w:p>
-    <w:p>
-      <w:pPr>
-        <w:ind w:left="360"/>
-      </w:pPr>
-      <w:r>
-        <w:t>“De esa manera, el problema de las clases dominantes se resolvía. Era posible acceder a la filosofía griega, sin salir de Roma. Como era de esperarse, las lecciones de Panecio se llenaron de alumnos de las más distinguidas familias políticas, como el ya referido Quinto Mudo Scévola, Este público, diferente del de la escuela estoica en Grecia, marcaría la terir dencia definitiva de la corriente en Roma.”</w:t>
-      </w:r>
-    </w:p>
-    <w:p>
-      <w:pPr>
-        <w:pStyle w:val="Heading3"/>
-      </w:pPr>
-      <w:r>
-        <w:t>Como se hicieron los Derechos H - Ricardo Rabinovich Berkman.pdf — p. 166 — similitud 0.0758</w:t>
-      </w:r>
-    </w:p>
-    <w:p>
-      <w:pPr>
-        <w:ind w:left="360"/>
-      </w:pPr>
-      <w:r>
-        <w:t>“El verdadero problema lo plantea otro tipo de casos, Aquellos en los cuales no hay forma de suponer, lógica y científicamente, una posibilidad de autoconstrucción en el futuro. Un niño que carece de parte del encéfalo (como sucede en el cuadro patológico llamado "anencefalia") nunca podrá desarrollar las funciones que se asocian a la región cerebral que les falta, y que son imprescindibles para la existencia.”</w:t>
-      </w:r>
-    </w:p>
-    <w:p>
-      <w:pPr>
-        <w:pStyle w:val="Heading3"/>
-      </w:pPr>
-      <w:r>
-        <w:t>Como se hicieron los Derechos H - Ricardo Rabinovich Berkman.pdf — p. 237 — similitud 0.0740</w:t>
-      </w:r>
-    </w:p>
-    <w:p>
-      <w:pPr>
-        <w:ind w:left="360"/>
-      </w:pPr>
-      <w:r>
-        <w:t>“248 RICARDO D. RABINOViCH-BERKMAN todo lo que oliera a macedónico, y el estagirita resolvió marcharse (según una tradición, para "evitar que Atenas pecase contra la filosofía por segunda vez"). Murió en la isla de Eubea al año siguiente.”</w:t>
-      </w:r>
-    </w:p>
-    <w:p>
-      <w:pPr>
-        <w:pStyle w:val="Heading3"/>
-      </w:pPr>
-      <w:r>
-        <w:t>Los derechos humanos en Mexico - Emilio Alvarez Icaza Longoria.pdf — p. 12 — similitud 0.0715</w:t>
-      </w:r>
-    </w:p>
-    <w:p>
-      <w:pPr>
-        <w:ind w:left="360"/>
-      </w:pPr>
-      <w:r>
-        <w:t>“11 2. Historia de los derechos humanos en el mundo La formulación actual de los derechos humanos es el resultado de una larga lucha que debe rastrearse en la historia política y filosófica de la humanidad. Su definición responde a las distintas batallas que se libraron por el reconocimiento y respeto del valor más grande con el que cuentan todas las personas y que constituye actualmente el fundamento de todos nuestros derechos: la dignidad humana.”</w:t>
-      </w:r>
-    </w:p>
-    <w:p>
-      <w:pPr>
-        <w:pStyle w:val="Heading3"/>
-      </w:pPr>
-      <w:r>
-        <w:t>Los derechos humanos en Mexico - Emilio Alvarez Icaza Longoria.pdf — p. 12 — similitud 0.0703</w:t>
-      </w:r>
-    </w:p>
-    <w:p>
-      <w:pPr>
-        <w:ind w:left="360"/>
-      </w:pPr>
-      <w:r>
-        <w:t>“Historia de los derechos humanos en el mundo La formulación actual de los derechos humanos es el resultado de una larga lucha que debe rastrearse en la historia política y filosófica de la humanidad. Su definición responde a las distintas batallas que se libraron por el reconocimiento y respeto del valor más grande con el que cuentan todas las personas y que constituye actualmente el fundamento de todos nuestros derechos: la dignidad humana.”</w:t>
-      </w:r>
-    </w:p>
-    <w:p>
-      <w:pPr>
-        <w:pStyle w:val="Heading3"/>
-      </w:pPr>
-      <w:r>
-        <w:t>Como se hicieron los Derechos H - Ricardo Rabinovich Berkman.pdf — p. 67 — similitud 0.0700</w:t>
-      </w:r>
-    </w:p>
-    <w:p>
-      <w:pPr>
-        <w:ind w:left="360"/>
-      </w:pPr>
-      <w:r>
-        <w:t>“76 RICARDO D. RABINOV1CH-BERKMAN miles de latinoamericanos y la sumisión de otros millares a toda suerte de ve- jámenes podían ser contingencias perfectamente aceptables en aras de evitar la expansión del marxismo. Todas las dictaduras sudamericanas de este período se proclamaron y mostraron fieles aliadas de los Estados Unidos, y decididas defensoras no sólo de los intereses estratégicos de ese país, sino además de los de las cor- poraciones comerciales privadas vinculadas con él (incluso por la vía de la represión violenta de los reclamos laborales).”</w:t>
-      </w:r>
-    </w:p>
-    <w:p>
-      <w:pPr>
-        <w:pStyle w:val="Heading3"/>
-      </w:pPr>
-      <w:r>
-        <w:t>Derechos humanos, teorias y doc - Luis Manuel Marcano Salazar.pdf — p. 117 — similitud 0.0700</w:t>
-      </w:r>
-    </w:p>
-    <w:p>
-      <w:pPr>
-        <w:ind w:left="360"/>
-      </w:pPr>
-      <w:r>
-        <w:t>“Luis Manuel Marcano Salazar situación; los estragos contra el ambiente ahora no son los mismos de hace cuarenta o cincuenta años atrás, hoy son perceptibles las contingencias naturales cada vez peores; para los que vivieron la tragedia natural de 1999 en el Estado Vargas (Venezuela) se volvió connatural la relación ambiente-vida: Con un mar de fondo se inicia en el estado Vargas la emergencia fue le primer signo de los que sería después una gran tragedia.”</w:t>
-      </w:r>
-    </w:p>
-    <w:p>
-      <w:pPr>
-        <w:pStyle w:val="Heading3"/>
-      </w:pPr>
-      <w:r>
-        <w:t>Derechos humanos, teorias y doc - Luis Manuel Marcano Salazar.pdf — p. 111 — similitud 0.0698</w:t>
-      </w:r>
-    </w:p>
-    <w:p>
-      <w:pPr>
-        <w:ind w:left="360"/>
-      </w:pPr>
-      <w:r>
-        <w:t>“La unanimidad demostrada en los principales instrumentos internacionales de derechos humanos al reconocer y garantizar el derecho la vida, no significa que dejen de presentarse, divergencias las cuales versan en torno a tres peculiaridades relevantes como lo son: a. es la base ontológica de todos los otros derechos, b. su violación es irreversible ya que implica la desaparición de su titular. c. la propia definición de “vida” genera conflictos entre conceptos éticos, morales y religiosos, lo que alimenta debates como los sostenidos sobre la eutanasia, el aborto y el suicidio asistido.4 El sentido primordial de este derecho es el de impedir que el Estado, de manera arbitraria, arrebate la...”</w:t>
-      </w:r>
-    </w:p>
-    <w:p>
-      <w:pPr>
-        <w:pStyle w:val="Heading3"/>
-      </w:pPr>
-      <w:r>
-        <w:t>Derechos humanos, teorias y doc - Luis Manuel Marcano Salazar.pdf — p. 35 — similitud 0.0698</w:t>
-      </w:r>
-    </w:p>
-    <w:p>
-      <w:pPr>
-        <w:ind w:left="360"/>
-      </w:pPr>
-      <w:r>
-        <w:t>“Luis Manuel Marcano Salazar 2.1- Definición de Derechos Humanos Esta denominación The Right of Man, ha sido adoptada modernamente en el contenido que define a los derechos humanos, entendidos estos desde dos corrientes del pensamiento como lo son la iusnaturalista y la iuspositivista. Aunque, para Nikken (1994), esta contraposición no tiene mayor trascendencia.”</w:t>
-      </w:r>
-    </w:p>
-    <w:p>
-      <w:pPr>
-        <w:pStyle w:val="Heading3"/>
-      </w:pPr>
-      <w:r>
-        <w:t>Como se hicieron los Derechos H - Ricardo Rabinovich Berkman.pdf — p. 123 — similitud 0.0696</w:t>
-      </w:r>
-    </w:p>
-    <w:p>
-      <w:pPr>
-        <w:ind w:left="360"/>
-      </w:pPr>
-      <w:r>
-        <w:t>“En tales circunstancias, habrían de formularse principios generales, de aplica* ción universal (al estilo kantiano), públicos, que resolvieran los conflictos al modo de un tribunal de apelación supremo. En cuanto interesa a nuestro abordaje, Rawls representa una manera reno- vada (que ya denota la marca de las atrocidades vividas en coincidencia con . la pérdida de sentido de las bases objetivas para la construcción de los dere- chos esenciales) de reclamar la existencia de una universalidad ética sobre la que erguir la teoría de esas prerrogativas. Sus resultados prácticos no difieren mucho de los de Kant, aunque la argumentación es completamente diferente.”</w:t>
-      </w:r>
-    </w:p>
-    <w:p>
-      <w:pPr>
-        <w:pStyle w:val="Heading3"/>
-      </w:pPr>
-      <w:r>
-        <w:t>Derechos humanos, teorias y doc - Luis Manuel Marcano Salazar.pdf — p. 64 — similitud 0.0680</w:t>
-      </w:r>
-    </w:p>
-    <w:p>
-      <w:pPr>
-        <w:ind w:left="360"/>
-      </w:pPr>
-      <w:r>
-        <w:t>“1. derecho a la vida; 2. derecho a la integridad personal; 3. la prohibición de esclavitud y servidumbre; 4. la prohibición de la discriminación; 5. el derecho a la personalidad jurídica; 6. el derecho a la nacionalidad; los derechos políticos; el principio de legalidad y no retroactividad; 7. la libertad de conciencia y religión; 8. la protección a la familia y los derechos del niño; 9. así como las garantías judiciales indispensables para la protección de tales derechos, entre los cuales deben considerarse incluidos el amparo y el hábeas corpus. (p.45) 2.3.6.5.- Son progresivos El desarrollo de la protección internacional de los derechos humanos, si bien ha sido paulatino, a medida que ha...”</w:t>
-      </w:r>
-    </w:p>
-    <w:p>
-      <w:pPr>
-        <w:pStyle w:val="Heading3"/>
-      </w:pPr>
-      <w:r>
-        <w:t>Derechos humanos, teorias y doc - Luis Manuel Marcano Salazar.pdf — p. 35 — similitud 0.0664</w:t>
-      </w:r>
-    </w:p>
-    <w:p>
-      <w:pPr>
-        <w:ind w:left="360"/>
-      </w:pPr>
-      <w:r>
-        <w:t>“También, en esta materia Faúndez Ledesma (1999), expresa que los derechos humanos pueden definirse como las “Prerrogativas que, conforme al Derecho internacional, tiene todo individuo frente a los órganos del poder para preservar su dignidad como ser humano, y cuya función es excluir la interferencia del Estado en áreas especificas de la vida individual, o asegurar la prestación de determinados servicios por parte del Estado, para satisfacer sus necesidades básicas, y que reflejan las exigencias fundamentales que cada ser humano puede formular a la sociedad de que forma parte” (p.28).”</w:t>
-      </w:r>
-    </w:p>
-    <w:p>
-      <w:pPr>
-        <w:pStyle w:val="Heading3"/>
-      </w:pPr>
-      <w:r>
-        <w:t>Como se hicieron los Derechos H - Ricardo Rabinovich Berkman.pdf — p. 93 — similitud 0.0642</w:t>
-      </w:r>
-    </w:p>
-    <w:p>
-      <w:pPr>
-        <w:ind w:left="360"/>
-      </w:pPr>
-      <w:r>
-        <w:t>“Sin embargo, como la Comisión es anterior al Pacto de San José, y esa facultad no le ha sido retirada, se entiende que mantiene la posibilidad de procesar peticiones individuales relativas a estados de la OEA que aún no sean parte de esa Convención.”</w:t>
-      </w:r>
-    </w:p>
-    <w:p>
-      <w:pPr>
-        <w:pStyle w:val="Heading3"/>
-      </w:pPr>
-      <w:r>
-        <w:t>Como se hicieron los Derechos H - Ricardo Rabinovich Berkman.pdf — p. 130 — similitud 0.0631</w:t>
-      </w:r>
-    </w:p>
-    <w:p>
-      <w:pPr>
-        <w:ind w:left="360"/>
-      </w:pPr>
-      <w:r>
-        <w:t>“Comenta con dureza el pensador musulmán contem poráneo S, A. Aideeb Abu-Saieh: "Este pasaje contiene tres conceptos relacionados que son problemáticos para nuestra concepción del co m - portamiento moral: primero, el concepto de un pueblo elegido, que es un concepto racista;segun- do, el concepto de dar la tierra de Canaán a ios judíos, que es un acto de robo; y tercero, el concep- to de circuncisión, que es una práctica mutiladora" {Denniston e t a/., 2004, p. 136 y siguientes).”</w:t>
-      </w:r>
-    </w:p>
-    <w:p>
-      <w:pPr>
-        <w:pStyle w:val="Heading3"/>
-      </w:pPr>
-      <w:r>
-        <w:t>Como se hicieron los Derechos H - Ricardo Rabinovich Berkman.pdf — p. 166 — similitud 0.0620</w:t>
-      </w:r>
-    </w:p>
-    <w:p>
-      <w:pPr>
-        <w:ind w:left="360"/>
-      </w:pPr>
-      <w:r>
-        <w:t>“Algunas de ellas tienen, sin embargo, en términos aristoté- lico-tomistas, la potencia de hacerlo. Es decir, poseen la posibilidad de auto- construirse en e] futuro. Tal es el caso de los que aún no han nacido (como lo implica, casi poéticamente la clásica expresión nasdturi, "los que tienen la posibilidad de nacer").”</w:t>
-      </w:r>
-    </w:p>
-    <w:p>
-      <w:pPr>
-        <w:pStyle w:val="Heading3"/>
-      </w:pPr>
-      <w:r>
-        <w:t>Como se hicieron los Derechos H - Ricardo Rabinovich Berkman.pdf — p. 242 — similitud 0.0552</w:t>
-      </w:r>
-    </w:p>
-    <w:p>
-      <w:pPr>
-        <w:ind w:left="360"/>
-      </w:pPr>
-      <w:r>
-        <w:t>“Fue entonces cuando arribó a ia urbe del Lacio, procedente de Grecia, el estoicismo. Esta corriente filosófica, desde el principio, atrajo a importantes juristas la- tinos. Entre ellos, el pontífice máximo Quinto Mucio Scévola (muerto en 82”</w:t>
-      </w:r>
-    </w:p>
-    <w:p>
-      <w:pPr>
-        <w:pStyle w:val="Heading3"/>
-      </w:pPr>
-      <w:r>
-        <w:t>Como se hicieron los Derechos H - Ricardo Rabinovich Berkman.pdf — p. 145 — similitud 0.0548</w:t>
-      </w:r>
-    </w:p>
-    <w:p>
-      <w:pPr>
-        <w:ind w:left="360"/>
-      </w:pPr>
-      <w:r>
-        <w:t>“Ya la Declaración Universal de 1948 proclamaba en su preámbulo la "dignidad inherente a todos los miembros de la familia humana". Con sagacidad, destaca Andorno que es frente a situaciones de crueldad atroz donde, por contraste, queda claro qué es la dignidad, y cuán lejos está de ser una mera "hipótesis metafísica".”</w:t>
-      </w:r>
-    </w:p>
-    <w:p>
-      <w:r>
-        <w:rPr>
-          <w:b/>
-        </w:rPr>
-        <w:t xml:space="preserve">Observación automática: </w:t>
-      </w:r>
-      <w:r>
-        <w:t>La ficha presenta coincidencias útiles, pero conviene revisar la pertinencia de cada cita. Se agruparon referencias de múltiples fuentes para enriquecer el concepto. Hay 18 referencia(s) de baja similitud que podrían introducir ruido.</w:t>
+        <w:t>La ficha presenta coincidencias útiles, pero conviene revisar la pertinencia de cada cita. Se agruparon referencias de múltiples fuentes para enriquecer el concepto.</w:t>
       </w:r>
     </w:p>
     <w:sectPr>

</xml_diff>